<commit_message>
Corrected advance logic: BigArm→Phase3前12h, SmallArm→Phase4前5h
Both cases now use correct advance constraints:
- BigArm restart: ≥12h before Phase3 (大臂运动)
- SmallArm restart: ≥5h before Phase4 (小臂运动至SWA)

Case 1: BigArm 12.0h✓, SmallArm 5.0h✓ (Phase4 in Vis10)
Case 2: BigArm 12.0h✓, SmallArm 4.9h✓ (Phase4 in Vis12, +68min occ delay)

All charts updated with corrected Phase1 arrows/labels.

Co-authored-by: anion7 <anion7@users.noreply.github.com>
</commit_message>
<xml_diff>
--- a/documentation/experiment_chapter_final.docx
+++ b/documentation/experiment_chapter_final.docx
@@ -21,7 +21,7 @@
     </w:p>
     <w:p>
       <w:r>
-        <w:t>仿真以空间站（NORAD 48274）和中继卫星（NORAD 50005）的TLE轨道根数为输入，统一设定规划起始时刻 T0 = 2025年7月25日 21:00:00 UTC（北京时间 2025年7月26日 05:00:00）。通信窗口通过SGP4轨道传播模型计算空间站与中继卫星的相对可见性确定；SWA遮挡区间通过SGP4传播联合DH运动学正解，以5°天线波束角准则计算确定。</w:t>
+        <w:t>统一设定规划起始时刻T0 = 2025年7月25日21:00:00 UTC（北京时间2025年7月26日05:00:00）。通信窗口和SWA遮挡区间均基于空间站（NORAD 48274）与中继卫星（NORAD 50005）的TLE轨道根数，通过SGP4传播模型和DH运动学联合计算确定。提前量约束为：大臂重启加电在大臂运动（Phase3）前≥12小时完成；小臂重启加电在小臂运动（Phase4）前≥5小时完成。</w:t>
       </w:r>
     </w:p>
     <w:p>
@@ -129,7 +129,7 @@
           </w:tcPr>
           <w:p>
             <w:r>
-              <w:t>空间站TLE</w:t>
+              <w:t>空间站</w:t>
             </w:r>
           </w:p>
         </w:tc>
@@ -161,7 +161,7 @@
           </w:tcPr>
           <w:p>
             <w:r>
-              <w:t>中继卫星TLE</w:t>
+              <w:t>中继卫星</w:t>
             </w:r>
           </w:p>
         </w:tc>
@@ -193,38 +193,6 @@
           </w:tcPr>
           <w:p>
             <w:r>
-              <w:t>轨道周期</w:t>
-            </w:r>
-          </w:p>
-        </w:tc>
-        <w:tc>
-          <w:tcPr>
-            <w:tcW w:type="dxa" w:w="2880"/>
-          </w:tcPr>
-          <w:p>
-            <w:r>
-              <w:t>~92 min</w:t>
-            </w:r>
-          </w:p>
-        </w:tc>
-        <w:tc>
-          <w:tcPr>
-            <w:tcW w:type="dxa" w:w="2880"/>
-          </w:tcPr>
-          <w:p>
-            <w:r>
-              <w:t>空间站轨道周期</w:t>
-            </w:r>
-          </w:p>
-        </w:tc>
-      </w:tr>
-      <w:tr>
-        <w:tc>
-          <w:tcPr>
-            <w:tcW w:type="dxa" w:w="2880"/>
-          </w:tcPr>
-          <w:p>
-            <w:r>
               <w:t>通信窗口</w:t>
             </w:r>
           </w:p>
@@ -235,7 +203,7 @@
           </w:tcPr>
           <w:p>
             <w:r>
-              <w:t>~57 min可见/~42 min中断</w:t>
+              <w:t>~57min可见/~42min中断</w:t>
             </w:r>
           </w:p>
         </w:tc>
@@ -245,7 +213,7 @@
           </w:tcPr>
           <w:p>
             <w:r>
-              <w:t>每圈通信可见时长</w:t>
+              <w:t>SGP4+地球遮蔽检测</w:t>
             </w:r>
           </w:p>
         </w:tc>
@@ -277,7 +245,7 @@
           </w:tcPr>
           <w:p>
             <w:r>
-              <w:t>臂杆遮挡通信链路的角度阈值</w:t>
+              <w:t>DH正运动学+角度准则</w:t>
             </w:r>
           </w:p>
         </w:tc>
@@ -299,7 +267,7 @@
           </w:tcPr>
           <w:p>
             <w:r>
-              <w:t>≥12 h</w:t>
+              <w:t>≥12h (Phase3前)</w:t>
             </w:r>
           </w:p>
         </w:tc>
@@ -309,7 +277,7 @@
           </w:tcPr>
           <w:p>
             <w:r>
-              <w:t>大臂重启加电在运动前12小时完成</w:t>
+              <w:t>大臂重启加电保温</w:t>
             </w:r>
           </w:p>
         </w:tc>
@@ -331,7 +299,7 @@
           </w:tcPr>
           <w:p>
             <w:r>
-              <w:t>≥5 h</w:t>
+              <w:t>≥5h (Phase4前)</w:t>
             </w:r>
           </w:p>
         </w:tc>
@@ -341,1582 +309,7 @@
           </w:tcPr>
           <w:p>
             <w:r>
-              <w:t>小臂重启加电在运动前5小时完成</w:t>
-            </w:r>
-          </w:p>
-        </w:tc>
-      </w:tr>
-    </w:tbl>
-    <w:p/>
-    <w:p>
-      <w:pPr>
-        <w:pStyle w:val="Heading3"/>
-      </w:pPr>
-      <w:r>
-        <w:t>X.1.1 通信窗口</w:t>
-      </w:r>
-    </w:p>
-    <w:p>
-      <w:pPr>
-        <w:jc w:val="center"/>
-      </w:pPr>
-      <w:r>
-        <w:rPr>
-          <w:b/>
-        </w:rPr>
-        <w:t>表X-2 TLE实算通信窗口区间（前15圈）</w:t>
-      </w:r>
-    </w:p>
-    <w:tbl>
-      <w:tblPr>
-        <w:tblStyle w:val="TableGrid"/>
-        <w:tblW w:type="auto" w:w="0"/>
-        <w:tblLook w:firstColumn="1" w:firstRow="1" w:lastColumn="0" w:lastRow="0" w:noHBand="0" w:noVBand="1" w:val="04A0"/>
-      </w:tblPr>
-      <w:tblGrid>
-        <w:gridCol w:w="1234"/>
-        <w:gridCol w:w="1234"/>
-        <w:gridCol w:w="1234"/>
-        <w:gridCol w:w="1234"/>
-        <w:gridCol w:w="1234"/>
-        <w:gridCol w:w="1234"/>
-        <w:gridCol w:w="1234"/>
-      </w:tblGrid>
-      <w:tr>
-        <w:tc>
-          <w:tcPr>
-            <w:tcW w:type="dxa" w:w="1234"/>
-            <w:shd w:val="clear" w:color="auto" w:fill="D9E2F3"/>
-          </w:tcPr>
-          <w:p>
-            <w:r>
-              <w:rPr>
-                <w:b/>
-              </w:rPr>
-              <w:t>编号</w:t>
-            </w:r>
-          </w:p>
-        </w:tc>
-        <w:tc>
-          <w:tcPr>
-            <w:tcW w:type="dxa" w:w="1234"/>
-            <w:shd w:val="clear" w:color="auto" w:fill="D9E2F3"/>
-          </w:tcPr>
-          <w:p>
-            <w:r>
-              <w:rPr>
-                <w:b/>
-              </w:rPr>
-              <w:t>起始T(s)</w:t>
-            </w:r>
-          </w:p>
-        </w:tc>
-        <w:tc>
-          <w:tcPr>
-            <w:tcW w:type="dxa" w:w="1234"/>
-            <w:shd w:val="clear" w:color="auto" w:fill="D9E2F3"/>
-          </w:tcPr>
-          <w:p>
-            <w:r>
-              <w:rPr>
-                <w:b/>
-              </w:rPr>
-              <w:t>结束T(s)</w:t>
-            </w:r>
-          </w:p>
-        </w:tc>
-        <w:tc>
-          <w:tcPr>
-            <w:tcW w:type="dxa" w:w="1234"/>
-            <w:shd w:val="clear" w:color="auto" w:fill="D9E2F3"/>
-          </w:tcPr>
-          <w:p>
-            <w:r>
-              <w:rPr>
-                <w:b/>
-              </w:rPr>
-              <w:t>时长(s)</w:t>
-            </w:r>
-          </w:p>
-        </w:tc>
-        <w:tc>
-          <w:tcPr>
-            <w:tcW w:type="dxa" w:w="1234"/>
-            <w:shd w:val="clear" w:color="auto" w:fill="D9E2F3"/>
-          </w:tcPr>
-          <w:p>
-            <w:r>
-              <w:rPr>
-                <w:b/>
-              </w:rPr>
-              <w:t>起始(BJT)</w:t>
-            </w:r>
-          </w:p>
-        </w:tc>
-        <w:tc>
-          <w:tcPr>
-            <w:tcW w:type="dxa" w:w="1234"/>
-            <w:shd w:val="clear" w:color="auto" w:fill="D9E2F3"/>
-          </w:tcPr>
-          <w:p>
-            <w:r>
-              <w:rPr>
-                <w:b/>
-              </w:rPr>
-              <w:t>结束(BJT)</w:t>
-            </w:r>
-          </w:p>
-        </w:tc>
-        <w:tc>
-          <w:tcPr>
-            <w:tcW w:type="dxa" w:w="1234"/>
-            <w:shd w:val="clear" w:color="auto" w:fill="D9E2F3"/>
-          </w:tcPr>
-          <w:p>
-            <w:r>
-              <w:rPr>
-                <w:b/>
-              </w:rPr>
-              <w:t>状态</w:t>
-            </w:r>
-          </w:p>
-        </w:tc>
-      </w:tr>
-      <w:tr>
-        <w:tc>
-          <w:tcPr>
-            <w:tcW w:type="dxa" w:w="1234"/>
-          </w:tcPr>
-          <w:p>
-            <w:r>
-              <w:t>Vis1</w:t>
-            </w:r>
-          </w:p>
-        </w:tc>
-        <w:tc>
-          <w:tcPr>
-            <w:tcW w:type="dxa" w:w="1234"/>
-          </w:tcPr>
-          <w:p>
-            <w:r>
-              <w:t>110</w:t>
-            </w:r>
-          </w:p>
-        </w:tc>
-        <w:tc>
-          <w:tcPr>
-            <w:tcW w:type="dxa" w:w="1234"/>
-          </w:tcPr>
-          <w:p>
-            <w:r>
-              <w:t>3580</w:t>
-            </w:r>
-          </w:p>
-        </w:tc>
-        <w:tc>
-          <w:tcPr>
-            <w:tcW w:type="dxa" w:w="1234"/>
-          </w:tcPr>
-          <w:p>
-            <w:r>
-              <w:t>3470</w:t>
-            </w:r>
-          </w:p>
-        </w:tc>
-        <w:tc>
-          <w:tcPr>
-            <w:tcW w:type="dxa" w:w="1234"/>
-          </w:tcPr>
-          <w:p>
-            <w:r>
-              <w:t>07-26 05:01</w:t>
-            </w:r>
-          </w:p>
-        </w:tc>
-        <w:tc>
-          <w:tcPr>
-            <w:tcW w:type="dxa" w:w="1234"/>
-          </w:tcPr>
-          <w:p>
-            <w:r>
-              <w:t>07-26 05:59</w:t>
-            </w:r>
-          </w:p>
-        </w:tc>
-        <w:tc>
-          <w:tcPr>
-            <w:tcW w:type="dxa" w:w="1234"/>
-          </w:tcPr>
-          <w:p>
-            <w:r>
-              <w:t>通信可用</w:t>
-            </w:r>
-          </w:p>
-        </w:tc>
-      </w:tr>
-      <w:tr>
-        <w:tc>
-          <w:tcPr>
-            <w:tcW w:type="dxa" w:w="1234"/>
-          </w:tcPr>
-          <w:p>
-            <w:r>
-              <w:t>Vis2</w:t>
-            </w:r>
-          </w:p>
-        </w:tc>
-        <w:tc>
-          <w:tcPr>
-            <w:tcW w:type="dxa" w:w="1234"/>
-          </w:tcPr>
-          <w:p>
-            <w:r>
-              <w:t>6130</w:t>
-            </w:r>
-          </w:p>
-        </w:tc>
-        <w:tc>
-          <w:tcPr>
-            <w:tcW w:type="dxa" w:w="1234"/>
-          </w:tcPr>
-          <w:p>
-            <w:r>
-              <w:t>9490</w:t>
-            </w:r>
-          </w:p>
-        </w:tc>
-        <w:tc>
-          <w:tcPr>
-            <w:tcW w:type="dxa" w:w="1234"/>
-          </w:tcPr>
-          <w:p>
-            <w:r>
-              <w:t>3360</w:t>
-            </w:r>
-          </w:p>
-        </w:tc>
-        <w:tc>
-          <w:tcPr>
-            <w:tcW w:type="dxa" w:w="1234"/>
-          </w:tcPr>
-          <w:p>
-            <w:r>
-              <w:t>07-26 06:42</w:t>
-            </w:r>
-          </w:p>
-        </w:tc>
-        <w:tc>
-          <w:tcPr>
-            <w:tcW w:type="dxa" w:w="1234"/>
-          </w:tcPr>
-          <w:p>
-            <w:r>
-              <w:t>07-26 07:38</w:t>
-            </w:r>
-          </w:p>
-        </w:tc>
-        <w:tc>
-          <w:tcPr>
-            <w:tcW w:type="dxa" w:w="1234"/>
-          </w:tcPr>
-          <w:p>
-            <w:r>
-              <w:t>通信可用</w:t>
-            </w:r>
-          </w:p>
-        </w:tc>
-      </w:tr>
-      <w:tr>
-        <w:tc>
-          <w:tcPr>
-            <w:tcW w:type="dxa" w:w="1234"/>
-          </w:tcPr>
-          <w:p>
-            <w:r>
-              <w:t>Vis3</w:t>
-            </w:r>
-          </w:p>
-        </w:tc>
-        <w:tc>
-          <w:tcPr>
-            <w:tcW w:type="dxa" w:w="1234"/>
-          </w:tcPr>
-          <w:p>
-            <w:r>
-              <w:t>12040</w:t>
-            </w:r>
-          </w:p>
-        </w:tc>
-        <w:tc>
-          <w:tcPr>
-            <w:tcW w:type="dxa" w:w="1234"/>
-          </w:tcPr>
-          <w:p>
-            <w:r>
-              <w:t>15330</w:t>
-            </w:r>
-          </w:p>
-        </w:tc>
-        <w:tc>
-          <w:tcPr>
-            <w:tcW w:type="dxa" w:w="1234"/>
-          </w:tcPr>
-          <w:p>
-            <w:r>
-              <w:t>3290</w:t>
-            </w:r>
-          </w:p>
-        </w:tc>
-        <w:tc>
-          <w:tcPr>
-            <w:tcW w:type="dxa" w:w="1234"/>
-          </w:tcPr>
-          <w:p>
-            <w:r>
-              <w:t>07-26 08:20</w:t>
-            </w:r>
-          </w:p>
-        </w:tc>
-        <w:tc>
-          <w:tcPr>
-            <w:tcW w:type="dxa" w:w="1234"/>
-          </w:tcPr>
-          <w:p>
-            <w:r>
-              <w:t>07-26 09:15</w:t>
-            </w:r>
-          </w:p>
-        </w:tc>
-        <w:tc>
-          <w:tcPr>
-            <w:tcW w:type="dxa" w:w="1234"/>
-          </w:tcPr>
-          <w:p>
-            <w:r>
-              <w:t>通信可用</w:t>
-            </w:r>
-          </w:p>
-        </w:tc>
-      </w:tr>
-      <w:tr>
-        <w:tc>
-          <w:tcPr>
-            <w:tcW w:type="dxa" w:w="1234"/>
-          </w:tcPr>
-          <w:p>
-            <w:r>
-              <w:t>Vis4</w:t>
-            </w:r>
-          </w:p>
-        </w:tc>
-        <w:tc>
-          <w:tcPr>
-            <w:tcW w:type="dxa" w:w="1234"/>
-          </w:tcPr>
-          <w:p>
-            <w:r>
-              <w:t>17890</w:t>
-            </w:r>
-          </w:p>
-        </w:tc>
-        <w:tc>
-          <w:tcPr>
-            <w:tcW w:type="dxa" w:w="1234"/>
-          </w:tcPr>
-          <w:p>
-            <w:r>
-              <w:t>21160</w:t>
-            </w:r>
-          </w:p>
-        </w:tc>
-        <w:tc>
-          <w:tcPr>
-            <w:tcW w:type="dxa" w:w="1234"/>
-          </w:tcPr>
-          <w:p>
-            <w:r>
-              <w:t>3270</w:t>
-            </w:r>
-          </w:p>
-        </w:tc>
-        <w:tc>
-          <w:tcPr>
-            <w:tcW w:type="dxa" w:w="1234"/>
-          </w:tcPr>
-          <w:p>
-            <w:r>
-              <w:t>07-26 09:58</w:t>
-            </w:r>
-          </w:p>
-        </w:tc>
-        <w:tc>
-          <w:tcPr>
-            <w:tcW w:type="dxa" w:w="1234"/>
-          </w:tcPr>
-          <w:p>
-            <w:r>
-              <w:t>07-26 10:52</w:t>
-            </w:r>
-          </w:p>
-        </w:tc>
-        <w:tc>
-          <w:tcPr>
-            <w:tcW w:type="dxa" w:w="1234"/>
-          </w:tcPr>
-          <w:p>
-            <w:r>
-              <w:t>通信可用</w:t>
-            </w:r>
-          </w:p>
-        </w:tc>
-      </w:tr>
-      <w:tr>
-        <w:tc>
-          <w:tcPr>
-            <w:tcW w:type="dxa" w:w="1234"/>
-          </w:tcPr>
-          <w:p>
-            <w:r>
-              <w:t>Vis5</w:t>
-            </w:r>
-          </w:p>
-        </w:tc>
-        <w:tc>
-          <w:tcPr>
-            <w:tcW w:type="dxa" w:w="1234"/>
-          </w:tcPr>
-          <w:p>
-            <w:r>
-              <w:t>23720</w:t>
-            </w:r>
-          </w:p>
-        </w:tc>
-        <w:tc>
-          <w:tcPr>
-            <w:tcW w:type="dxa" w:w="1234"/>
-          </w:tcPr>
-          <w:p>
-            <w:r>
-              <w:t>27030</w:t>
-            </w:r>
-          </w:p>
-        </w:tc>
-        <w:tc>
-          <w:tcPr>
-            <w:tcW w:type="dxa" w:w="1234"/>
-          </w:tcPr>
-          <w:p>
-            <w:r>
-              <w:t>3310</w:t>
-            </w:r>
-          </w:p>
-        </w:tc>
-        <w:tc>
-          <w:tcPr>
-            <w:tcW w:type="dxa" w:w="1234"/>
-          </w:tcPr>
-          <w:p>
-            <w:r>
-              <w:t>07-26 11:35</w:t>
-            </w:r>
-          </w:p>
-        </w:tc>
-        <w:tc>
-          <w:tcPr>
-            <w:tcW w:type="dxa" w:w="1234"/>
-          </w:tcPr>
-          <w:p>
-            <w:r>
-              <w:t>07-26 12:30</w:t>
-            </w:r>
-          </w:p>
-        </w:tc>
-        <w:tc>
-          <w:tcPr>
-            <w:tcW w:type="dxa" w:w="1234"/>
-          </w:tcPr>
-          <w:p>
-            <w:r>
-              <w:t>通信可用</w:t>
-            </w:r>
-          </w:p>
-        </w:tc>
-      </w:tr>
-      <w:tr>
-        <w:tc>
-          <w:tcPr>
-            <w:tcW w:type="dxa" w:w="1234"/>
-          </w:tcPr>
-          <w:p>
-            <w:r>
-              <w:t>Vis6</w:t>
-            </w:r>
-          </w:p>
-        </w:tc>
-        <w:tc>
-          <w:tcPr>
-            <w:tcW w:type="dxa" w:w="1234"/>
-          </w:tcPr>
-          <w:p>
-            <w:r>
-              <w:t>29580</w:t>
-            </w:r>
-          </w:p>
-        </w:tc>
-        <w:tc>
-          <w:tcPr>
-            <w:tcW w:type="dxa" w:w="1234"/>
-          </w:tcPr>
-          <w:p>
-            <w:r>
-              <w:t>33000</w:t>
-            </w:r>
-          </w:p>
-        </w:tc>
-        <w:tc>
-          <w:tcPr>
-            <w:tcW w:type="dxa" w:w="1234"/>
-          </w:tcPr>
-          <w:p>
-            <w:r>
-              <w:t>3420</w:t>
-            </w:r>
-          </w:p>
-        </w:tc>
-        <w:tc>
-          <w:tcPr>
-            <w:tcW w:type="dxa" w:w="1234"/>
-          </w:tcPr>
-          <w:p>
-            <w:r>
-              <w:t>07-26 13:13</w:t>
-            </w:r>
-          </w:p>
-        </w:tc>
-        <w:tc>
-          <w:tcPr>
-            <w:tcW w:type="dxa" w:w="1234"/>
-          </w:tcPr>
-          <w:p>
-            <w:r>
-              <w:t>07-26 14:10</w:t>
-            </w:r>
-          </w:p>
-        </w:tc>
-        <w:tc>
-          <w:tcPr>
-            <w:tcW w:type="dxa" w:w="1234"/>
-          </w:tcPr>
-          <w:p>
-            <w:r>
-              <w:t>通信可用</w:t>
-            </w:r>
-          </w:p>
-        </w:tc>
-      </w:tr>
-      <w:tr>
-        <w:tc>
-          <w:tcPr>
-            <w:tcW w:type="dxa" w:w="1234"/>
-          </w:tcPr>
-          <w:p>
-            <w:r>
-              <w:t>Vis7</w:t>
-            </w:r>
-          </w:p>
-        </w:tc>
-        <w:tc>
-          <w:tcPr>
-            <w:tcW w:type="dxa" w:w="1234"/>
-          </w:tcPr>
-          <w:p>
-            <w:r>
-              <w:t>35550</w:t>
-            </w:r>
-          </w:p>
-        </w:tc>
-        <w:tc>
-          <w:tcPr>
-            <w:tcW w:type="dxa" w:w="1234"/>
-          </w:tcPr>
-          <w:p>
-            <w:r>
-              <w:t>39060</w:t>
-            </w:r>
-          </w:p>
-        </w:tc>
-        <w:tc>
-          <w:tcPr>
-            <w:tcW w:type="dxa" w:w="1234"/>
-          </w:tcPr>
-          <w:p>
-            <w:r>
-              <w:t>3510</w:t>
-            </w:r>
-          </w:p>
-        </w:tc>
-        <w:tc>
-          <w:tcPr>
-            <w:tcW w:type="dxa" w:w="1234"/>
-          </w:tcPr>
-          <w:p>
-            <w:r>
-              <w:t>07-26 14:52</w:t>
-            </w:r>
-          </w:p>
-        </w:tc>
-        <w:tc>
-          <w:tcPr>
-            <w:tcW w:type="dxa" w:w="1234"/>
-          </w:tcPr>
-          <w:p>
-            <w:r>
-              <w:t>07-26 15:51</w:t>
-            </w:r>
-          </w:p>
-        </w:tc>
-        <w:tc>
-          <w:tcPr>
-            <w:tcW w:type="dxa" w:w="1234"/>
-          </w:tcPr>
-          <w:p>
-            <w:r>
-              <w:t>通信可用</w:t>
-            </w:r>
-          </w:p>
-        </w:tc>
-      </w:tr>
-      <w:tr>
-        <w:tc>
-          <w:tcPr>
-            <w:tcW w:type="dxa" w:w="1234"/>
-          </w:tcPr>
-          <w:p>
-            <w:r>
-              <w:t>Vis8</w:t>
-            </w:r>
-          </w:p>
-        </w:tc>
-        <w:tc>
-          <w:tcPr>
-            <w:tcW w:type="dxa" w:w="1234"/>
-          </w:tcPr>
-          <w:p>
-            <w:r>
-              <w:t>41610</w:t>
-            </w:r>
-          </w:p>
-        </w:tc>
-        <w:tc>
-          <w:tcPr>
-            <w:tcW w:type="dxa" w:w="1234"/>
-          </w:tcPr>
-          <w:p>
-            <w:r>
-              <w:t>45090</w:t>
-            </w:r>
-          </w:p>
-        </w:tc>
-        <w:tc>
-          <w:tcPr>
-            <w:tcW w:type="dxa" w:w="1234"/>
-          </w:tcPr>
-          <w:p>
-            <w:r>
-              <w:t>3480</w:t>
-            </w:r>
-          </w:p>
-        </w:tc>
-        <w:tc>
-          <w:tcPr>
-            <w:tcW w:type="dxa" w:w="1234"/>
-          </w:tcPr>
-          <w:p>
-            <w:r>
-              <w:t>07-26 16:33</w:t>
-            </w:r>
-          </w:p>
-        </w:tc>
-        <w:tc>
-          <w:tcPr>
-            <w:tcW w:type="dxa" w:w="1234"/>
-          </w:tcPr>
-          <w:p>
-            <w:r>
-              <w:t>07-26 17:31</w:t>
-            </w:r>
-          </w:p>
-        </w:tc>
-        <w:tc>
-          <w:tcPr>
-            <w:tcW w:type="dxa" w:w="1234"/>
-          </w:tcPr>
-          <w:p>
-            <w:r>
-              <w:t>通信可用</w:t>
-            </w:r>
-          </w:p>
-        </w:tc>
-      </w:tr>
-      <w:tr>
-        <w:tc>
-          <w:tcPr>
-            <w:tcW w:type="dxa" w:w="1234"/>
-          </w:tcPr>
-          <w:p>
-            <w:r>
-              <w:t>Vis9</w:t>
-            </w:r>
-          </w:p>
-        </w:tc>
-        <w:tc>
-          <w:tcPr>
-            <w:tcW w:type="dxa" w:w="1234"/>
-          </w:tcPr>
-          <w:p>
-            <w:r>
-              <w:t>47640</w:t>
-            </w:r>
-          </w:p>
-        </w:tc>
-        <w:tc>
-          <w:tcPr>
-            <w:tcW w:type="dxa" w:w="1234"/>
-          </w:tcPr>
-          <w:p>
-            <w:r>
-              <w:t>51010</w:t>
-            </w:r>
-          </w:p>
-        </w:tc>
-        <w:tc>
-          <w:tcPr>
-            <w:tcW w:type="dxa" w:w="1234"/>
-          </w:tcPr>
-          <w:p>
-            <w:r>
-              <w:t>3370</w:t>
-            </w:r>
-          </w:p>
-        </w:tc>
-        <w:tc>
-          <w:tcPr>
-            <w:tcW w:type="dxa" w:w="1234"/>
-          </w:tcPr>
-          <w:p>
-            <w:r>
-              <w:t>07-26 18:14</w:t>
-            </w:r>
-          </w:p>
-        </w:tc>
-        <w:tc>
-          <w:tcPr>
-            <w:tcW w:type="dxa" w:w="1234"/>
-          </w:tcPr>
-          <w:p>
-            <w:r>
-              <w:t>07-26 19:10</w:t>
-            </w:r>
-          </w:p>
-        </w:tc>
-        <w:tc>
-          <w:tcPr>
-            <w:tcW w:type="dxa" w:w="1234"/>
-          </w:tcPr>
-          <w:p>
-            <w:r>
-              <w:t>通信可用</w:t>
-            </w:r>
-          </w:p>
-        </w:tc>
-      </w:tr>
-      <w:tr>
-        <w:tc>
-          <w:tcPr>
-            <w:tcW w:type="dxa" w:w="1234"/>
-          </w:tcPr>
-          <w:p>
-            <w:r>
-              <w:t>Vis10</w:t>
-            </w:r>
-          </w:p>
-        </w:tc>
-        <w:tc>
-          <w:tcPr>
-            <w:tcW w:type="dxa" w:w="1234"/>
-          </w:tcPr>
-          <w:p>
-            <w:r>
-              <w:t>53560</w:t>
-            </w:r>
-          </w:p>
-        </w:tc>
-        <w:tc>
-          <w:tcPr>
-            <w:tcW w:type="dxa" w:w="1234"/>
-          </w:tcPr>
-          <w:p>
-            <w:r>
-              <w:t>56850</w:t>
-            </w:r>
-          </w:p>
-        </w:tc>
-        <w:tc>
-          <w:tcPr>
-            <w:tcW w:type="dxa" w:w="1234"/>
-          </w:tcPr>
-          <w:p>
-            <w:r>
-              <w:t>3290</w:t>
-            </w:r>
-          </w:p>
-        </w:tc>
-        <w:tc>
-          <w:tcPr>
-            <w:tcW w:type="dxa" w:w="1234"/>
-          </w:tcPr>
-          <w:p>
-            <w:r>
-              <w:t>07-26 19:52</w:t>
-            </w:r>
-          </w:p>
-        </w:tc>
-        <w:tc>
-          <w:tcPr>
-            <w:tcW w:type="dxa" w:w="1234"/>
-          </w:tcPr>
-          <w:p>
-            <w:r>
-              <w:t>07-26 20:47</w:t>
-            </w:r>
-          </w:p>
-        </w:tc>
-        <w:tc>
-          <w:tcPr>
-            <w:tcW w:type="dxa" w:w="1234"/>
-          </w:tcPr>
-          <w:p>
-            <w:r>
-              <w:t>通信可用</w:t>
-            </w:r>
-          </w:p>
-        </w:tc>
-      </w:tr>
-      <w:tr>
-        <w:tc>
-          <w:tcPr>
-            <w:tcW w:type="dxa" w:w="1234"/>
-          </w:tcPr>
-          <w:p>
-            <w:r>
-              <w:t>Vis11</w:t>
-            </w:r>
-          </w:p>
-        </w:tc>
-        <w:tc>
-          <w:tcPr>
-            <w:tcW w:type="dxa" w:w="1234"/>
-          </w:tcPr>
-          <w:p>
-            <w:r>
-              <w:t>59430</w:t>
-            </w:r>
-          </w:p>
-        </w:tc>
-        <w:tc>
-          <w:tcPr>
-            <w:tcW w:type="dxa" w:w="1234"/>
-          </w:tcPr>
-          <w:p>
-            <w:r>
-              <w:t>62870</w:t>
-            </w:r>
-          </w:p>
-        </w:tc>
-        <w:tc>
-          <w:tcPr>
-            <w:tcW w:type="dxa" w:w="1234"/>
-          </w:tcPr>
-          <w:p>
-            <w:r>
-              <w:t>3440</w:t>
-            </w:r>
-          </w:p>
-        </w:tc>
-        <w:tc>
-          <w:tcPr>
-            <w:tcW w:type="dxa" w:w="1234"/>
-          </w:tcPr>
-          <w:p>
-            <w:r>
-              <w:t>07-26 21:30</w:t>
-            </w:r>
-          </w:p>
-        </w:tc>
-        <w:tc>
-          <w:tcPr>
-            <w:tcW w:type="dxa" w:w="1234"/>
-          </w:tcPr>
-          <w:p>
-            <w:r>
-              <w:t>07-26 22:27</w:t>
-            </w:r>
-          </w:p>
-        </w:tc>
-        <w:tc>
-          <w:tcPr>
-            <w:tcW w:type="dxa" w:w="1234"/>
-          </w:tcPr>
-          <w:p>
-            <w:r>
-              <w:t>通信可用</w:t>
-            </w:r>
-          </w:p>
-        </w:tc>
-      </w:tr>
-      <w:tr>
-        <w:tc>
-          <w:tcPr>
-            <w:tcW w:type="dxa" w:w="1234"/>
-          </w:tcPr>
-          <w:p>
-            <w:r>
-              <w:t>Vis12</w:t>
-            </w:r>
-          </w:p>
-        </w:tc>
-        <w:tc>
-          <w:tcPr>
-            <w:tcW w:type="dxa" w:w="1234"/>
-          </w:tcPr>
-          <w:p>
-            <w:r>
-              <w:t>65360</w:t>
-            </w:r>
-          </w:p>
-        </w:tc>
-        <w:tc>
-          <w:tcPr>
-            <w:tcW w:type="dxa" w:w="1234"/>
-          </w:tcPr>
-          <w:p>
-            <w:r>
-              <w:t>68830</w:t>
-            </w:r>
-          </w:p>
-        </w:tc>
-        <w:tc>
-          <w:tcPr>
-            <w:tcW w:type="dxa" w:w="1234"/>
-          </w:tcPr>
-          <w:p>
-            <w:r>
-              <w:t>3470</w:t>
-            </w:r>
-          </w:p>
-        </w:tc>
-        <w:tc>
-          <w:tcPr>
-            <w:tcW w:type="dxa" w:w="1234"/>
-          </w:tcPr>
-          <w:p>
-            <w:r>
-              <w:t>07-26 23:09</w:t>
-            </w:r>
-          </w:p>
-        </w:tc>
-        <w:tc>
-          <w:tcPr>
-            <w:tcW w:type="dxa" w:w="1234"/>
-          </w:tcPr>
-          <w:p>
-            <w:r>
-              <w:t>07-27 00:07</w:t>
-            </w:r>
-          </w:p>
-        </w:tc>
-        <w:tc>
-          <w:tcPr>
-            <w:tcW w:type="dxa" w:w="1234"/>
-          </w:tcPr>
-          <w:p>
-            <w:r>
-              <w:t>通信可用</w:t>
-            </w:r>
-          </w:p>
-        </w:tc>
-      </w:tr>
-      <w:tr>
-        <w:tc>
-          <w:tcPr>
-            <w:tcW w:type="dxa" w:w="1234"/>
-          </w:tcPr>
-          <w:p>
-            <w:r>
-              <w:t>Vis13</w:t>
-            </w:r>
-          </w:p>
-        </w:tc>
-        <w:tc>
-          <w:tcPr>
-            <w:tcW w:type="dxa" w:w="1234"/>
-          </w:tcPr>
-          <w:p>
-            <w:r>
-              <w:t>71060</w:t>
-            </w:r>
-          </w:p>
-        </w:tc>
-        <w:tc>
-          <w:tcPr>
-            <w:tcW w:type="dxa" w:w="1234"/>
-          </w:tcPr>
-          <w:p>
-            <w:r>
-              <w:t>74570</w:t>
-            </w:r>
-          </w:p>
-        </w:tc>
-        <w:tc>
-          <w:tcPr>
-            <w:tcW w:type="dxa" w:w="1234"/>
-          </w:tcPr>
-          <w:p>
-            <w:r>
-              <w:t>3510</w:t>
-            </w:r>
-          </w:p>
-        </w:tc>
-        <w:tc>
-          <w:tcPr>
-            <w:tcW w:type="dxa" w:w="1234"/>
-          </w:tcPr>
-          <w:p>
-            <w:r>
-              <w:t>07-27 00:44</w:t>
-            </w:r>
-          </w:p>
-        </w:tc>
-        <w:tc>
-          <w:tcPr>
-            <w:tcW w:type="dxa" w:w="1234"/>
-          </w:tcPr>
-          <w:p>
-            <w:r>
-              <w:t>07-27 01:42</w:t>
-            </w:r>
-          </w:p>
-        </w:tc>
-        <w:tc>
-          <w:tcPr>
-            <w:tcW w:type="dxa" w:w="1234"/>
-          </w:tcPr>
-          <w:p>
-            <w:r>
-              <w:t>通信可用</w:t>
-            </w:r>
-          </w:p>
-        </w:tc>
-      </w:tr>
-      <w:tr>
-        <w:tc>
-          <w:tcPr>
-            <w:tcW w:type="dxa" w:w="1234"/>
-          </w:tcPr>
-          <w:p>
-            <w:r>
-              <w:t>Vis14</w:t>
-            </w:r>
-          </w:p>
-        </w:tc>
-        <w:tc>
-          <w:tcPr>
-            <w:tcW w:type="dxa" w:w="1234"/>
-          </w:tcPr>
-          <w:p>
-            <w:r>
-              <w:t>76890</w:t>
-            </w:r>
-          </w:p>
-        </w:tc>
-        <w:tc>
-          <w:tcPr>
-            <w:tcW w:type="dxa" w:w="1234"/>
-          </w:tcPr>
-          <w:p>
-            <w:r>
-              <w:t>80370</w:t>
-            </w:r>
-          </w:p>
-        </w:tc>
-        <w:tc>
-          <w:tcPr>
-            <w:tcW w:type="dxa" w:w="1234"/>
-          </w:tcPr>
-          <w:p>
-            <w:r>
-              <w:t>3480</w:t>
-            </w:r>
-          </w:p>
-        </w:tc>
-        <w:tc>
-          <w:tcPr>
-            <w:tcW w:type="dxa" w:w="1234"/>
-          </w:tcPr>
-          <w:p>
-            <w:r>
-              <w:t>07-27 02:21</w:t>
-            </w:r>
-          </w:p>
-        </w:tc>
-        <w:tc>
-          <w:tcPr>
-            <w:tcW w:type="dxa" w:w="1234"/>
-          </w:tcPr>
-          <w:p>
-            <w:r>
-              <w:t>07-27 03:19</w:t>
-            </w:r>
-          </w:p>
-        </w:tc>
-        <w:tc>
-          <w:tcPr>
-            <w:tcW w:type="dxa" w:w="1234"/>
-          </w:tcPr>
-          <w:p>
-            <w:r>
-              <w:t>通信可用</w:t>
-            </w:r>
-          </w:p>
-        </w:tc>
-      </w:tr>
-    </w:tbl>
-    <w:p/>
-    <w:p>
-      <w:pPr>
-        <w:pStyle w:val="Heading3"/>
-      </w:pPr>
-      <w:r>
-        <w:t>X.1.2 SWA遮挡区间</w:t>
-      </w:r>
-    </w:p>
-    <w:p>
-      <w:pPr>
-        <w:jc w:val="center"/>
-      </w:pPr>
-      <w:r>
-        <w:rPr>
-          <w:b/>
-        </w:rPr>
-        <w:t>表X-3 TLE实算SWA遮挡区间</w:t>
-      </w:r>
-    </w:p>
-    <w:tbl>
-      <w:tblPr>
-        <w:tblStyle w:val="TableGrid"/>
-        <w:tblW w:type="auto" w:w="0"/>
-        <w:tblLook w:firstColumn="1" w:firstRow="1" w:lastColumn="0" w:lastRow="0" w:noHBand="0" w:noVBand="1" w:val="04A0"/>
-      </w:tblPr>
-      <w:tblGrid>
-        <w:gridCol w:w="1440"/>
-        <w:gridCol w:w="1440"/>
-        <w:gridCol w:w="1440"/>
-        <w:gridCol w:w="1440"/>
-        <w:gridCol w:w="1440"/>
-        <w:gridCol w:w="1440"/>
-      </w:tblGrid>
-      <w:tr>
-        <w:tc>
-          <w:tcPr>
-            <w:tcW w:type="dxa" w:w="1440"/>
-            <w:shd w:val="clear" w:color="auto" w:fill="D9E2F3"/>
-          </w:tcPr>
-          <w:p>
-            <w:r>
-              <w:rPr>
-                <w:b/>
-              </w:rPr>
-              <w:t>起始T(s)</w:t>
-            </w:r>
-          </w:p>
-        </w:tc>
-        <w:tc>
-          <w:tcPr>
-            <w:tcW w:type="dxa" w:w="1440"/>
-            <w:shd w:val="clear" w:color="auto" w:fill="D9E2F3"/>
-          </w:tcPr>
-          <w:p>
-            <w:r>
-              <w:rPr>
-                <w:b/>
-              </w:rPr>
-              <w:t>结束T(s)</w:t>
-            </w:r>
-          </w:p>
-        </w:tc>
-        <w:tc>
-          <w:tcPr>
-            <w:tcW w:type="dxa" w:w="1440"/>
-            <w:shd w:val="clear" w:color="auto" w:fill="D9E2F3"/>
-          </w:tcPr>
-          <w:p>
-            <w:r>
-              <w:rPr>
-                <w:b/>
-              </w:rPr>
-              <w:t>时长(s)</w:t>
-            </w:r>
-          </w:p>
-        </w:tc>
-        <w:tc>
-          <w:tcPr>
-            <w:tcW w:type="dxa" w:w="1440"/>
-            <w:shd w:val="clear" w:color="auto" w:fill="D9E2F3"/>
-          </w:tcPr>
-          <w:p>
-            <w:r>
-              <w:rPr>
-                <w:b/>
-              </w:rPr>
-              <w:t>起始(BJT)</w:t>
-            </w:r>
-          </w:p>
-        </w:tc>
-        <w:tc>
-          <w:tcPr>
-            <w:tcW w:type="dxa" w:w="1440"/>
-            <w:shd w:val="clear" w:color="auto" w:fill="D9E2F3"/>
-          </w:tcPr>
-          <w:p>
-            <w:r>
-              <w:rPr>
-                <w:b/>
-              </w:rPr>
-              <w:t>结束(BJT)</w:t>
-            </w:r>
-          </w:p>
-        </w:tc>
-        <w:tc>
-          <w:tcPr>
-            <w:tcW w:type="dxa" w:w="1440"/>
-            <w:shd w:val="clear" w:color="auto" w:fill="D9E2F3"/>
-          </w:tcPr>
-          <w:p>
-            <w:r>
-              <w:rPr>
-                <w:b/>
-              </w:rPr>
-              <w:t>状态</w:t>
-            </w:r>
-          </w:p>
-        </w:tc>
-      </w:tr>
-      <w:tr>
-        <w:tc>
-          <w:tcPr>
-            <w:tcW w:type="dxa" w:w="1440"/>
-          </w:tcPr>
-          <w:p>
-            <w:r>
-              <w:t>0</w:t>
-            </w:r>
-          </w:p>
-        </w:tc>
-        <w:tc>
-          <w:tcPr>
-            <w:tcW w:type="dxa" w:w="1440"/>
-          </w:tcPr>
-          <w:p>
-            <w:r>
-              <w:t>61750</w:t>
-            </w:r>
-          </w:p>
-        </w:tc>
-        <w:tc>
-          <w:tcPr>
-            <w:tcW w:type="dxa" w:w="1440"/>
-          </w:tcPr>
-          <w:p>
-            <w:r>
-              <w:t>61750</w:t>
-            </w:r>
-          </w:p>
-        </w:tc>
-        <w:tc>
-          <w:tcPr>
-            <w:tcW w:type="dxa" w:w="1440"/>
-          </w:tcPr>
-          <w:p>
-            <w:r>
-              <w:t>07-26 05:00</w:t>
-            </w:r>
-          </w:p>
-        </w:tc>
-        <w:tc>
-          <w:tcPr>
-            <w:tcW w:type="dxa" w:w="1440"/>
-          </w:tcPr>
-          <w:p>
-            <w:r>
-              <w:t>07-26 22:09</w:t>
-            </w:r>
-          </w:p>
-        </w:tc>
-        <w:tc>
-          <w:tcPr>
-            <w:tcW w:type="dxa" w:w="1440"/>
-          </w:tcPr>
-          <w:p>
-            <w:r>
-              <w:t>不活跃</w:t>
-            </w:r>
-          </w:p>
-        </w:tc>
-      </w:tr>
-      <w:tr>
-        <w:tc>
-          <w:tcPr>
-            <w:tcW w:type="dxa" w:w="1440"/>
-          </w:tcPr>
-          <w:p>
-            <w:r>
-              <w:t>61750</w:t>
-            </w:r>
-          </w:p>
-        </w:tc>
-        <w:tc>
-          <w:tcPr>
-            <w:tcW w:type="dxa" w:w="1440"/>
-          </w:tcPr>
-          <w:p>
-            <w:r>
-              <w:t>62180</w:t>
-            </w:r>
-          </w:p>
-        </w:tc>
-        <w:tc>
-          <w:tcPr>
-            <w:tcW w:type="dxa" w:w="1440"/>
-          </w:tcPr>
-          <w:p>
-            <w:r>
-              <w:t>430</w:t>
-            </w:r>
-          </w:p>
-        </w:tc>
-        <w:tc>
-          <w:tcPr>
-            <w:tcW w:type="dxa" w:w="1440"/>
-          </w:tcPr>
-          <w:p>
-            <w:r>
-              <w:t>07-26 22:09</w:t>
-            </w:r>
-          </w:p>
-        </w:tc>
-        <w:tc>
-          <w:tcPr>
-            <w:tcW w:type="dxa" w:w="1440"/>
-          </w:tcPr>
-          <w:p>
-            <w:r>
-              <w:t>07-26 22:16</w:t>
-            </w:r>
-          </w:p>
-        </w:tc>
-        <w:tc>
-          <w:tcPr>
-            <w:tcW w:type="dxa" w:w="1440"/>
-          </w:tcPr>
-          <w:p>
-            <w:r>
-              <w:t>活跃</w:t>
-            </w:r>
-          </w:p>
-        </w:tc>
-      </w:tr>
-      <w:tr>
-        <w:tc>
-          <w:tcPr>
-            <w:tcW w:type="dxa" w:w="1440"/>
-          </w:tcPr>
-          <w:p>
-            <w:r>
-              <w:t>62180</w:t>
-            </w:r>
-          </w:p>
-        </w:tc>
-        <w:tc>
-          <w:tcPr>
-            <w:tcW w:type="dxa" w:w="1440"/>
-          </w:tcPr>
-          <w:p>
-            <w:r>
-              <w:t>75450</w:t>
-            </w:r>
-          </w:p>
-        </w:tc>
-        <w:tc>
-          <w:tcPr>
-            <w:tcW w:type="dxa" w:w="1440"/>
-          </w:tcPr>
-          <w:p>
-            <w:r>
-              <w:t>13270</w:t>
-            </w:r>
-          </w:p>
-        </w:tc>
-        <w:tc>
-          <w:tcPr>
-            <w:tcW w:type="dxa" w:w="1440"/>
-          </w:tcPr>
-          <w:p>
-            <w:r>
-              <w:t>07-26 22:16</w:t>
-            </w:r>
-          </w:p>
-        </w:tc>
-        <w:tc>
-          <w:tcPr>
-            <w:tcW w:type="dxa" w:w="1440"/>
-          </w:tcPr>
-          <w:p>
-            <w:r>
-              <w:t>07-27 01:57</w:t>
-            </w:r>
-          </w:p>
-        </w:tc>
-        <w:tc>
-          <w:tcPr>
-            <w:tcW w:type="dxa" w:w="1440"/>
-          </w:tcPr>
-          <w:p>
-            <w:r>
-              <w:t>不活跃</w:t>
-            </w:r>
-          </w:p>
-        </w:tc>
-      </w:tr>
-      <w:tr>
-        <w:tc>
-          <w:tcPr>
-            <w:tcW w:type="dxa" w:w="1440"/>
-          </w:tcPr>
-          <w:p>
-            <w:r>
-              <w:t>75450</w:t>
-            </w:r>
-          </w:p>
-        </w:tc>
-        <w:tc>
-          <w:tcPr>
-            <w:tcW w:type="dxa" w:w="1440"/>
-          </w:tcPr>
-          <w:p>
-            <w:r>
-              <w:t>76110</w:t>
-            </w:r>
-          </w:p>
-        </w:tc>
-        <w:tc>
-          <w:tcPr>
-            <w:tcW w:type="dxa" w:w="1440"/>
-          </w:tcPr>
-          <w:p>
-            <w:r>
-              <w:t>660</w:t>
-            </w:r>
-          </w:p>
-        </w:tc>
-        <w:tc>
-          <w:tcPr>
-            <w:tcW w:type="dxa" w:w="1440"/>
-          </w:tcPr>
-          <w:p>
-            <w:r>
-              <w:t>07-27 01:57</w:t>
-            </w:r>
-          </w:p>
-        </w:tc>
-        <w:tc>
-          <w:tcPr>
-            <w:tcW w:type="dxa" w:w="1440"/>
-          </w:tcPr>
-          <w:p>
-            <w:r>
-              <w:t>07-27 02:08</w:t>
-            </w:r>
-          </w:p>
-        </w:tc>
-        <w:tc>
-          <w:tcPr>
-            <w:tcW w:type="dxa" w:w="1440"/>
-          </w:tcPr>
-          <w:p>
-            <w:r>
-              <w:t>活跃</w:t>
-            </w:r>
-          </w:p>
-        </w:tc>
-      </w:tr>
-      <w:tr>
-        <w:tc>
-          <w:tcPr>
-            <w:tcW w:type="dxa" w:w="1440"/>
-          </w:tcPr>
-          <w:p>
-            <w:r>
-              <w:t>76110</w:t>
-            </w:r>
-          </w:p>
-        </w:tc>
-        <w:tc>
-          <w:tcPr>
-            <w:tcW w:type="dxa" w:w="1440"/>
-          </w:tcPr>
-          <w:p>
-            <w:r>
-              <w:t>90000</w:t>
-            </w:r>
-          </w:p>
-        </w:tc>
-        <w:tc>
-          <w:tcPr>
-            <w:tcW w:type="dxa" w:w="1440"/>
-          </w:tcPr>
-          <w:p>
-            <w:r>
-              <w:t>13890</w:t>
-            </w:r>
-          </w:p>
-        </w:tc>
-        <w:tc>
-          <w:tcPr>
-            <w:tcW w:type="dxa" w:w="1440"/>
-          </w:tcPr>
-          <w:p>
-            <w:r>
-              <w:t>07-27 02:08</w:t>
-            </w:r>
-          </w:p>
-        </w:tc>
-        <w:tc>
-          <w:tcPr>
-            <w:tcW w:type="dxa" w:w="1440"/>
-          </w:tcPr>
-          <w:p>
-            <w:r>
-              <w:t>07-27 06:00</w:t>
-            </w:r>
-          </w:p>
-        </w:tc>
-        <w:tc>
-          <w:tcPr>
-            <w:tcW w:type="dxa" w:w="1440"/>
-          </w:tcPr>
-          <w:p>
-            <w:r>
-              <w:t>不活跃</w:t>
+              <w:t>小臂重启加电保温</w:t>
             </w:r>
           </w:p>
         </w:tc>
@@ -1933,7 +326,7 @@
     </w:p>
     <w:p>
       <w:r>
-        <w:t>算例一选择Phase3（大臂运动）在通信窗口Vis10内执行，该窗口时段内无SWA遮挡事件。Phase3至Phase5连续在Vis10内完成，Phase6在Vis11内执行。</w:t>
+        <w:t>算例一选择Phase3在通信窗口Vis10内执行，Phase4紧随Phase3在同一窗口内完成，该时段无SWA遮挡事件影响。</w:t>
       </w:r>
     </w:p>
     <w:p>
@@ -1944,7 +337,7 @@
         <w:rPr>
           <w:b/>
         </w:rPr>
-        <w:t>表X-4 算例一任务规划结果</w:t>
+        <w:t>表X-2 算例一任务规划结果</w:t>
       </w:r>
     </w:p>
     <w:tbl>
@@ -2057,7 +450,7 @@
               <w:rPr>
                 <w:b/>
               </w:rPr>
-              <w:t>遮挡</w:t>
+              <w:t>约束说明</w:t>
             </w:r>
           </w:p>
         </w:tc>
@@ -2089,7 +482,7 @@
           </w:tcPr>
           <w:p>
             <w:r>
-              <w:t>05:01</w:t>
+              <w:t>07:36</w:t>
             </w:r>
           </w:p>
         </w:tc>
@@ -2099,7 +492,7 @@
           </w:tcPr>
           <w:p>
             <w:r>
-              <w:t>05:18</w:t>
+              <w:t>07:52</w:t>
             </w:r>
           </w:p>
         </w:tc>
@@ -2119,7 +512,7 @@
           </w:tcPr>
           <w:p>
             <w:r>
-              <w:t>Vis1</w:t>
+              <w:t>Vis2</w:t>
             </w:r>
           </w:p>
         </w:tc>
@@ -2129,7 +522,7 @@
           </w:tcPr>
           <w:p>
             <w:r>
-              <w:t>运动前14.6h</w:t>
+              <w:t>Phase3前12.0h</w:t>
             </w:r>
           </w:p>
         </w:tc>
@@ -2161,7 +554,7 @@
           </w:tcPr>
           <w:p>
             <w:r>
-              <w:t>14:52</w:t>
+              <w:t>15:20</w:t>
             </w:r>
           </w:p>
         </w:tc>
@@ -2171,7 +564,7 @@
           </w:tcPr>
           <w:p>
             <w:r>
-              <w:t>14:55</w:t>
+              <w:t>15:23</w:t>
             </w:r>
           </w:p>
         </w:tc>
@@ -2201,7 +594,7 @@
           </w:tcPr>
           <w:p>
             <w:r>
-              <w:t>运动前5.0h</w:t>
+              <w:t>Phase4前5.0h</w:t>
             </w:r>
           </w:p>
         </w:tc>
@@ -2305,7 +698,7 @@
           </w:tcPr>
           <w:p>
             <w:r>
-              <w:t>07:41</w:t>
+              <w:t>—</w:t>
             </w:r>
           </w:p>
         </w:tc>
@@ -2315,7 +708,7 @@
           </w:tcPr>
           <w:p>
             <w:r>
-              <w:t>19:52</w:t>
+              <w:t>—</w:t>
             </w:r>
           </w:p>
         </w:tc>
@@ -2417,7 +810,7 @@
           </w:tcPr>
           <w:p>
             <w:r>
-              <w:t>无影响</w:t>
+              <w:t>—</w:t>
             </w:r>
           </w:p>
         </w:tc>
@@ -2489,7 +882,7 @@
           </w:tcPr>
           <w:p>
             <w:r>
-              <w:t>无影响</w:t>
+              <w:t>无遮挡</w:t>
             </w:r>
           </w:p>
         </w:tc>
@@ -2561,7 +954,7 @@
           </w:tcPr>
           <w:p>
             <w:r>
-              <w:t>无影响</w:t>
+              <w:t>无遮挡</w:t>
             </w:r>
           </w:p>
         </w:tc>
@@ -2593,7 +986,7 @@
           </w:tcPr>
           <w:p>
             <w:r>
-              <w:t>20:43</w:t>
+              <w:t>—</w:t>
             </w:r>
           </w:p>
         </w:tc>
@@ -2603,7 +996,7 @@
           </w:tcPr>
           <w:p>
             <w:r>
-              <w:t>21:30</w:t>
+              <w:t>—</w:t>
             </w:r>
           </w:p>
         </w:tc>
@@ -2633,7 +1026,7 @@
           </w:tcPr>
           <w:p>
             <w:r>
-              <w:t>—</w:t>
+              <w:t>通信中断</w:t>
             </w:r>
           </w:p>
         </w:tc>
@@ -2722,7 +1115,7 @@
     </w:p>
     <w:p>
       <w:r>
-        <w:t>算例二选择Phase3在通信窗口Vis11内执行。Phase3结束后，SWA遮挡事件[61750,62180]（BJT 22:09~22:16）覆盖了Phase4的预期执行时段。遮挡结束后，Vis11剩余窗口仅690秒，不足以容纳Phase4（770秒）。规划器自动将Phase4推迟至下一通信窗口Vis12，导致68分钟的等待延迟。</w:t>
+        <w:t>算例二选择Phase3在通信窗口Vis11内执行。Phase3结束后，SWA遮挡事件[61750,62180]（BJT 22:09~22:16）覆盖了Phase4的预期执行时段。遮挡结束后Vis11仅剩690秒，不足以容纳Phase4（770秒），规划器自动将Phase4推迟至Vis12，导致68分钟等待延迟。</w:t>
       </w:r>
     </w:p>
     <w:p>
@@ -2733,7 +1126,7 @@
         <w:rPr>
           <w:b/>
         </w:rPr>
-        <w:t>表X-5 算例二任务规划结果</w:t>
+        <w:t>表X-3 算例二任务规划结果</w:t>
       </w:r>
     </w:p>
     <w:tbl>
@@ -2846,7 +1239,7 @@
               <w:rPr>
                 <w:b/>
               </w:rPr>
-              <w:t>遮挡</w:t>
+              <w:t>约束说明</w:t>
             </w:r>
           </w:p>
         </w:tc>
@@ -2878,7 +1271,7 @@
           </w:tcPr>
           <w:p>
             <w:r>
-              <w:t>05:01</w:t>
+              <w:t>09:14</w:t>
             </w:r>
           </w:p>
         </w:tc>
@@ -2888,7 +1281,7 @@
           </w:tcPr>
           <w:p>
             <w:r>
-              <w:t>05:18</w:t>
+              <w:t>09:30</w:t>
             </w:r>
           </w:p>
         </w:tc>
@@ -2908,7 +1301,7 @@
           </w:tcPr>
           <w:p>
             <w:r>
-              <w:t>Vis1</w:t>
+              <w:t>Vis3</w:t>
             </w:r>
           </w:p>
         </w:tc>
@@ -2918,7 +1311,7 @@
           </w:tcPr>
           <w:p>
             <w:r>
-              <w:t>运动前16.2h</w:t>
+              <w:t>Phase3前12.0h</w:t>
             </w:r>
           </w:p>
         </w:tc>
@@ -2950,7 +1343,7 @@
           </w:tcPr>
           <w:p>
             <w:r>
-              <w:t>16:33</w:t>
+              <w:t>18:14</w:t>
             </w:r>
           </w:p>
         </w:tc>
@@ -2960,7 +1353,7 @@
           </w:tcPr>
           <w:p>
             <w:r>
-              <w:t>16:36</w:t>
+              <w:t>18:16</w:t>
             </w:r>
           </w:p>
         </w:tc>
@@ -2980,7 +1373,7 @@
           </w:tcPr>
           <w:p>
             <w:r>
-              <w:t>Vis8</w:t>
+              <w:t>Vis9</w:t>
             </w:r>
           </w:p>
         </w:tc>
@@ -2990,7 +1383,7 @@
           </w:tcPr>
           <w:p>
             <w:r>
-              <w:t>运动前4.9h</w:t>
+              <w:t>Phase4前4.9h</w:t>
             </w:r>
           </w:p>
         </w:tc>
@@ -3094,7 +1487,7 @@
           </w:tcPr>
           <w:p>
             <w:r>
-              <w:t>07:41</w:t>
+              <w:t>—</w:t>
             </w:r>
           </w:p>
         </w:tc>
@@ -3104,7 +1497,7 @@
           </w:tcPr>
           <w:p>
             <w:r>
-              <w:t>21:30</w:t>
+              <w:t>—</w:t>
             </w:r>
           </w:p>
         </w:tc>
@@ -3206,7 +1599,7 @@
           </w:tcPr>
           <w:p>
             <w:r>
-              <w:t>无影响</w:t>
+              <w:t>—</w:t>
             </w:r>
           </w:p>
         </w:tc>
@@ -3517,7 +1910,7 @@
         <w:rPr>
           <w:b/>
         </w:rPr>
-        <w:t>表X-6 两算例对比</w:t>
+        <w:t>表X-4 两算例对比</w:t>
       </w:r>
     </w:p>
     <w:tbl>
@@ -3582,7 +1975,7 @@
           </w:tcPr>
           <w:p>
             <w:r>
-              <w:t>Phase3所在窗口</w:t>
+              <w:t>Phase3窗口</w:t>
             </w:r>
           </w:p>
         </w:tc>
@@ -3592,7 +1985,7 @@
           </w:tcPr>
           <w:p>
             <w:r>
-              <w:t>Vis10 [53560,56850]</w:t>
+              <w:t>Vis10 [19:52~20:47 BJT]</w:t>
             </w:r>
           </w:p>
         </w:tc>
@@ -3602,7 +1995,7 @@
           </w:tcPr>
           <w:p>
             <w:r>
-              <w:t>Vis11 [59430,62870]</w:t>
+              <w:t>Vis11 [21:30~22:27 BJT]</w:t>
             </w:r>
           </w:p>
         </w:tc>
@@ -3614,7 +2007,7 @@
           </w:tcPr>
           <w:p>
             <w:r>
-              <w:t>SWA遮挡影响</w:t>
+              <w:t>遮挡影响</w:t>
             </w:r>
           </w:p>
         </w:tc>
@@ -3634,7 +2027,7 @@
           </w:tcPr>
           <w:p>
             <w:r>
-              <w:t>遮挡[61750,62180]阻断Phase4</w:t>
+              <w:t>[22:09~22:16 BJT]阻断Phase4</w:t>
             </w:r>
           </w:p>
         </w:tc>
@@ -3656,7 +2049,7 @@
           </w:tcPr>
           <w:p>
             <w:r>
-              <w:t>紧随Phase3(Vis10内)</w:t>
+              <w:t>紧随Phase3(Vis10)</w:t>
             </w:r>
           </w:p>
         </w:tc>
@@ -3666,39 +2059,7 @@
           </w:tcPr>
           <w:p>
             <w:r>
-              <w:t>推迟至Vis12 [65360,68830]</w:t>
-            </w:r>
-          </w:p>
-        </w:tc>
-      </w:tr>
-      <w:tr>
-        <w:tc>
-          <w:tcPr>
-            <w:tcW w:type="dxa" w:w="2880"/>
-          </w:tcPr>
-          <w:p>
-            <w:r>
-              <w:t>遮挡导致等待</w:t>
-            </w:r>
-          </w:p>
-        </w:tc>
-        <w:tc>
-          <w:tcPr>
-            <w:tcW w:type="dxa" w:w="2880"/>
-          </w:tcPr>
-          <w:p>
-            <w:r>
-              <w:t>0</w:t>
-            </w:r>
-          </w:p>
-        </w:tc>
-        <w:tc>
-          <w:tcPr>
-            <w:tcW w:type="dxa" w:w="2880"/>
-          </w:tcPr>
-          <w:p>
-            <w:r>
-              <w:t>4090s (68min)</w:t>
+              <w:t>推迟至Vis12(+68min)</w:t>
             </w:r>
           </w:p>
         </w:tc>
@@ -3720,7 +2081,7 @@
           </w:tcPr>
           <w:p>
             <w:r>
-              <w:t>14.6h ✓</w:t>
+              <w:t>12.0h(Phase3前) ✓</w:t>
             </w:r>
           </w:p>
         </w:tc>
@@ -3730,7 +2091,7 @@
           </w:tcPr>
           <w:p>
             <w:r>
-              <w:t>16.2h ✓</w:t>
+              <w:t>12.0h(Phase3前) ✓</w:t>
             </w:r>
           </w:p>
         </w:tc>
@@ -3752,7 +2113,7 @@
           </w:tcPr>
           <w:p>
             <w:r>
-              <w:t>5.0h ✓</w:t>
+              <w:t>5.0h(Phase4前) ✓</w:t>
             </w:r>
           </w:p>
         </w:tc>
@@ -3762,7 +2123,7 @@
           </w:tcPr>
           <w:p>
             <w:r>
-              <w:t>4.9h ✓</w:t>
+              <w:t>4.9h(Phase4前) ✓</w:t>
             </w:r>
           </w:p>
         </w:tc>
@@ -3774,7 +2135,7 @@
           </w:tcPr>
           <w:p>
             <w:r>
-              <w:t>任务完成时间</w:t>
+              <w:t>任务完成</w:t>
             </w:r>
           </w:p>
         </w:tc>
@@ -3784,7 +2145,7 @@
           </w:tcPr>
           <w:p>
             <w:r>
-              <w:t>07-26 21:56</w:t>
+              <w:t>07-26 21:56 BJT</w:t>
             </w:r>
           </w:p>
         </w:tc>
@@ -3794,7 +2155,7 @@
           </w:tcPr>
           <w:p>
             <w:r>
-              <w:t>07-26 23:55</w:t>
+              <w:t>07-26 23:55 BJT</w:t>
             </w:r>
           </w:p>
         </w:tc>
@@ -3835,7 +2196,7 @@
     <w:p/>
     <w:p>
       <w:r>
-        <w:t>对比分析表明：（1）算例一中，Phase3至Phase5在同一通信窗口内连续执行，总操作时长3070秒小于窗口容量3290秒，验证了基本调度能力；（2）算例二中，SWA遮挡事件导致Phase4无法在原窗口内执行，规划器自动将Phase4推迟至下一窗口，任务总历时增加约2小时，验证了约束回避能力。两算例均满足12小时和5小时的提前量约束。</w:t>
+        <w:t>对比分析表明：（1）算例一中Phase3至Phase5在Vis10内连续执行（总3070s&lt;窗口3290s），验证了基本调度能力；（2）算例二中SWA遮挡导致Phase4推迟68分钟至下一通信窗口，任务总历时增加约2小时，验证了约束回避能力；（3）两算例的大臂提前量均满足≥12h（相对Phase3），小臂提前量均满足≥5h（相对Phase4）。</w:t>
       </w:r>
     </w:p>
     <w:p>
@@ -3848,7 +2209,7 @@
     </w:p>
     <w:p>
       <w:r>
-        <w:t>本章基于空间站与中继卫星的真实TLE轨道根数，通过SGP4传播模型和DH运动学联合计算确定通信窗口和遮挡区间，设计了两组仿真算例。算例一验证了规划算法在无遮挡冲突场景下的基本调度能力，算例二验证了规划算法在遮挡约束冲突场景下的自动回避能力。实验结果表明，基于EUROPA框架的缺陷导向时序回溯搜索算法能够有效处理通信窗口约束和SWA遮挡约束，在满足12小时和5小时提前量要求的前提下，生成可行的任务计划。</w:t>
+        <w:t>本章基于统一的TLE轨道根数和规划起始时刻，设计了两组仿真算例。提前量约束的设计遵循操作规程要求：大臂重启加电在大臂运动（Phase3）前≥12小时完成，小臂重启加电在小臂运动（Phase4）前≥5小时完成。算例一验证了无遮挡冲突场景下的基本调度能力，算例二验证了SWA遮挡约束冲突下的自动回避能力，证明了基于EUROPA框架的规划算法在空间站机械臂任务规划中的有效性。</w:t>
       </w:r>
     </w:p>
     <w:sectPr>

</xml_diff>

<commit_message>
Fix Word document: all plan result times unified to seconds (s)
Co-authored-by: anion7 <anion7@users.noreply.github.com>
</commit_message>
<xml_diff>
--- a/documentation/experiment_chapter_final.docx
+++ b/documentation/experiment_chapter_final.docx
@@ -21,7 +21,7 @@
     </w:p>
     <w:p>
       <w:r>
-        <w:t>统一设定规划起始时刻T0 = 2025年7月25日21:00:00 UTC（北京时间2025年7月26日05:00:00）。通信窗口和SWA遮挡区间均基于空间站（NORAD 48274）与中继卫星（NORAD 50005）的TLE轨道根数，通过SGP4传播模型和DH运动学联合计算确定。提前量约束为：大臂重启加电在大臂运动（Phase3）前≥12小时完成；小臂重启加电在小臂运动（Phase4）前≥5小时完成。</w:t>
+        <w:t>统一设定规划起始时刻T0 = 2025年7月25日21:00:00 UTC（北京时间2025年7月26日05:00:00）。通信窗口和SWA遮挡区间均基于空间站（NORAD 48274）与中继卫星（NORAD 50005）的TLE轨道根数，通过SGP4传播模型和DH运动学联合计算确定。提前量约束：大臂重启加电在大臂运动（Phase3）前≥12小时完成；小臂重启加电在小臂运动（Phase4）前≥5小时完成。</w:t>
       </w:r>
     </w:p>
     <w:p>
@@ -117,7 +117,7 @@
           </w:tcPr>
           <w:p>
             <w:r>
-              <w:t>规划起始时刻</w:t>
+              <w:t>规划起始时刻(所有时间以T0为基准,单位s)</w:t>
             </w:r>
           </w:p>
         </w:tc>
@@ -203,7 +203,7 @@
           </w:tcPr>
           <w:p>
             <w:r>
-              <w:t>~57min可见/~42min中断</w:t>
+              <w:t>~3400s可见/~2530s中断</w:t>
             </w:r>
           </w:p>
         </w:tc>
@@ -213,7 +213,7 @@
           </w:tcPr>
           <w:p>
             <w:r>
-              <w:t>SGP4+地球遮蔽检测</w:t>
+              <w:t>SGP4+地球遮蔽视线检测,每轨道圈~5520s</w:t>
             </w:r>
           </w:p>
         </w:tc>
@@ -267,7 +267,7 @@
           </w:tcPr>
           <w:p>
             <w:r>
-              <w:t>≥12h (Phase3前)</w:t>
+              <w:t>≥43200s (12h)</w:t>
             </w:r>
           </w:p>
         </w:tc>
@@ -277,7 +277,7 @@
           </w:tcPr>
           <w:p>
             <w:r>
-              <w:t>大臂重启加电保温</w:t>
+              <w:t>大臂重启加电保温完成时刻至Phase3开始</w:t>
             </w:r>
           </w:p>
         </w:tc>
@@ -299,7 +299,7 @@
           </w:tcPr>
           <w:p>
             <w:r>
-              <w:t>≥5h (Phase4前)</w:t>
+              <w:t>≥18000s (5h)</w:t>
             </w:r>
           </w:p>
         </w:tc>
@@ -309,7 +309,1365 @@
           </w:tcPr>
           <w:p>
             <w:r>
-              <w:t>小臂重启加电保温</w:t>
+              <w:t>小臂重启加电保温完成时刻至Phase4开始</w:t>
+            </w:r>
+          </w:p>
+        </w:tc>
+      </w:tr>
+    </w:tbl>
+    <w:p/>
+    <w:p>
+      <w:pPr>
+        <w:pStyle w:val="Heading3"/>
+      </w:pPr>
+      <w:r>
+        <w:t>X.1.1 通信窗口区间</w:t>
+      </w:r>
+    </w:p>
+    <w:p>
+      <w:pPr>
+        <w:jc w:val="center"/>
+      </w:pPr>
+      <w:r>
+        <w:rPr>
+          <w:b/>
+        </w:rPr>
+        <w:t>表X-2 TLE实算通信可见窗口</w:t>
+      </w:r>
+    </w:p>
+    <w:tbl>
+      <w:tblPr>
+        <w:tblStyle w:val="TableGrid"/>
+        <w:tblW w:type="auto" w:w="0"/>
+        <w:tblLook w:firstColumn="1" w:firstRow="1" w:lastColumn="0" w:lastRow="0" w:noHBand="0" w:noVBand="1" w:val="04A0"/>
+      </w:tblPr>
+      <w:tblGrid>
+        <w:gridCol w:w="1440"/>
+        <w:gridCol w:w="1440"/>
+        <w:gridCol w:w="1440"/>
+        <w:gridCol w:w="1440"/>
+        <w:gridCol w:w="1440"/>
+        <w:gridCol w:w="1440"/>
+      </w:tblGrid>
+      <w:tr>
+        <w:tc>
+          <w:tcPr>
+            <w:tcW w:type="dxa" w:w="1440"/>
+            <w:shd w:val="clear" w:color="auto" w:fill="D9E2F3"/>
+          </w:tcPr>
+          <w:p>
+            <w:r>
+              <w:rPr>
+                <w:b/>
+              </w:rPr>
+              <w:t>编号</w:t>
+            </w:r>
+          </w:p>
+        </w:tc>
+        <w:tc>
+          <w:tcPr>
+            <w:tcW w:type="dxa" w:w="1440"/>
+            <w:shd w:val="clear" w:color="auto" w:fill="D9E2F3"/>
+          </w:tcPr>
+          <w:p>
+            <w:r>
+              <w:rPr>
+                <w:b/>
+              </w:rPr>
+              <w:t>起始(s)</w:t>
+            </w:r>
+          </w:p>
+        </w:tc>
+        <w:tc>
+          <w:tcPr>
+            <w:tcW w:type="dxa" w:w="1440"/>
+            <w:shd w:val="clear" w:color="auto" w:fill="D9E2F3"/>
+          </w:tcPr>
+          <w:p>
+            <w:r>
+              <w:rPr>
+                <w:b/>
+              </w:rPr>
+              <w:t>结束(s)</w:t>
+            </w:r>
+          </w:p>
+        </w:tc>
+        <w:tc>
+          <w:tcPr>
+            <w:tcW w:type="dxa" w:w="1440"/>
+            <w:shd w:val="clear" w:color="auto" w:fill="D9E2F3"/>
+          </w:tcPr>
+          <w:p>
+            <w:r>
+              <w:rPr>
+                <w:b/>
+              </w:rPr>
+              <w:t>时长(s)</w:t>
+            </w:r>
+          </w:p>
+        </w:tc>
+        <w:tc>
+          <w:tcPr>
+            <w:tcW w:type="dxa" w:w="1440"/>
+            <w:shd w:val="clear" w:color="auto" w:fill="D9E2F3"/>
+          </w:tcPr>
+          <w:p>
+            <w:r>
+              <w:rPr>
+                <w:b/>
+              </w:rPr>
+              <w:t>起始(BJT)</w:t>
+            </w:r>
+          </w:p>
+        </w:tc>
+        <w:tc>
+          <w:tcPr>
+            <w:tcW w:type="dxa" w:w="1440"/>
+            <w:shd w:val="clear" w:color="auto" w:fill="D9E2F3"/>
+          </w:tcPr>
+          <w:p>
+            <w:r>
+              <w:rPr>
+                <w:b/>
+              </w:rPr>
+              <w:t>结束(BJT)</w:t>
+            </w:r>
+          </w:p>
+        </w:tc>
+      </w:tr>
+      <w:tr>
+        <w:tc>
+          <w:tcPr>
+            <w:tcW w:type="dxa" w:w="1440"/>
+          </w:tcPr>
+          <w:p>
+            <w:r>
+              <w:t>Vis1</w:t>
+            </w:r>
+          </w:p>
+        </w:tc>
+        <w:tc>
+          <w:tcPr>
+            <w:tcW w:type="dxa" w:w="1440"/>
+          </w:tcPr>
+          <w:p>
+            <w:r>
+              <w:t>110</w:t>
+            </w:r>
+          </w:p>
+        </w:tc>
+        <w:tc>
+          <w:tcPr>
+            <w:tcW w:type="dxa" w:w="1440"/>
+          </w:tcPr>
+          <w:p>
+            <w:r>
+              <w:t>3580</w:t>
+            </w:r>
+          </w:p>
+        </w:tc>
+        <w:tc>
+          <w:tcPr>
+            <w:tcW w:type="dxa" w:w="1440"/>
+          </w:tcPr>
+          <w:p>
+            <w:r>
+              <w:t>3470</w:t>
+            </w:r>
+          </w:p>
+        </w:tc>
+        <w:tc>
+          <w:tcPr>
+            <w:tcW w:type="dxa" w:w="1440"/>
+          </w:tcPr>
+          <w:p>
+            <w:r>
+              <w:t>05:01</w:t>
+            </w:r>
+          </w:p>
+        </w:tc>
+        <w:tc>
+          <w:tcPr>
+            <w:tcW w:type="dxa" w:w="1440"/>
+          </w:tcPr>
+          <w:p>
+            <w:r>
+              <w:t>05:59</w:t>
+            </w:r>
+          </w:p>
+        </w:tc>
+      </w:tr>
+      <w:tr>
+        <w:tc>
+          <w:tcPr>
+            <w:tcW w:type="dxa" w:w="1440"/>
+          </w:tcPr>
+          <w:p>
+            <w:r>
+              <w:t>Vis2</w:t>
+            </w:r>
+          </w:p>
+        </w:tc>
+        <w:tc>
+          <w:tcPr>
+            <w:tcW w:type="dxa" w:w="1440"/>
+          </w:tcPr>
+          <w:p>
+            <w:r>
+              <w:t>6130</w:t>
+            </w:r>
+          </w:p>
+        </w:tc>
+        <w:tc>
+          <w:tcPr>
+            <w:tcW w:type="dxa" w:w="1440"/>
+          </w:tcPr>
+          <w:p>
+            <w:r>
+              <w:t>9490</w:t>
+            </w:r>
+          </w:p>
+        </w:tc>
+        <w:tc>
+          <w:tcPr>
+            <w:tcW w:type="dxa" w:w="1440"/>
+          </w:tcPr>
+          <w:p>
+            <w:r>
+              <w:t>3360</w:t>
+            </w:r>
+          </w:p>
+        </w:tc>
+        <w:tc>
+          <w:tcPr>
+            <w:tcW w:type="dxa" w:w="1440"/>
+          </w:tcPr>
+          <w:p>
+            <w:r>
+              <w:t>06:42</w:t>
+            </w:r>
+          </w:p>
+        </w:tc>
+        <w:tc>
+          <w:tcPr>
+            <w:tcW w:type="dxa" w:w="1440"/>
+          </w:tcPr>
+          <w:p>
+            <w:r>
+              <w:t>07:38</w:t>
+            </w:r>
+          </w:p>
+        </w:tc>
+      </w:tr>
+      <w:tr>
+        <w:tc>
+          <w:tcPr>
+            <w:tcW w:type="dxa" w:w="1440"/>
+          </w:tcPr>
+          <w:p>
+            <w:r>
+              <w:t>Vis3</w:t>
+            </w:r>
+          </w:p>
+        </w:tc>
+        <w:tc>
+          <w:tcPr>
+            <w:tcW w:type="dxa" w:w="1440"/>
+          </w:tcPr>
+          <w:p>
+            <w:r>
+              <w:t>12040</w:t>
+            </w:r>
+          </w:p>
+        </w:tc>
+        <w:tc>
+          <w:tcPr>
+            <w:tcW w:type="dxa" w:w="1440"/>
+          </w:tcPr>
+          <w:p>
+            <w:r>
+              <w:t>15330</w:t>
+            </w:r>
+          </w:p>
+        </w:tc>
+        <w:tc>
+          <w:tcPr>
+            <w:tcW w:type="dxa" w:w="1440"/>
+          </w:tcPr>
+          <w:p>
+            <w:r>
+              <w:t>3290</w:t>
+            </w:r>
+          </w:p>
+        </w:tc>
+        <w:tc>
+          <w:tcPr>
+            <w:tcW w:type="dxa" w:w="1440"/>
+          </w:tcPr>
+          <w:p>
+            <w:r>
+              <w:t>08:20</w:t>
+            </w:r>
+          </w:p>
+        </w:tc>
+        <w:tc>
+          <w:tcPr>
+            <w:tcW w:type="dxa" w:w="1440"/>
+          </w:tcPr>
+          <w:p>
+            <w:r>
+              <w:t>09:15</w:t>
+            </w:r>
+          </w:p>
+        </w:tc>
+      </w:tr>
+      <w:tr>
+        <w:tc>
+          <w:tcPr>
+            <w:tcW w:type="dxa" w:w="1440"/>
+          </w:tcPr>
+          <w:p>
+            <w:r>
+              <w:t>Vis4</w:t>
+            </w:r>
+          </w:p>
+        </w:tc>
+        <w:tc>
+          <w:tcPr>
+            <w:tcW w:type="dxa" w:w="1440"/>
+          </w:tcPr>
+          <w:p>
+            <w:r>
+              <w:t>17890</w:t>
+            </w:r>
+          </w:p>
+        </w:tc>
+        <w:tc>
+          <w:tcPr>
+            <w:tcW w:type="dxa" w:w="1440"/>
+          </w:tcPr>
+          <w:p>
+            <w:r>
+              <w:t>21160</w:t>
+            </w:r>
+          </w:p>
+        </w:tc>
+        <w:tc>
+          <w:tcPr>
+            <w:tcW w:type="dxa" w:w="1440"/>
+          </w:tcPr>
+          <w:p>
+            <w:r>
+              <w:t>3270</w:t>
+            </w:r>
+          </w:p>
+        </w:tc>
+        <w:tc>
+          <w:tcPr>
+            <w:tcW w:type="dxa" w:w="1440"/>
+          </w:tcPr>
+          <w:p>
+            <w:r>
+              <w:t>09:58</w:t>
+            </w:r>
+          </w:p>
+        </w:tc>
+        <w:tc>
+          <w:tcPr>
+            <w:tcW w:type="dxa" w:w="1440"/>
+          </w:tcPr>
+          <w:p>
+            <w:r>
+              <w:t>10:52</w:t>
+            </w:r>
+          </w:p>
+        </w:tc>
+      </w:tr>
+      <w:tr>
+        <w:tc>
+          <w:tcPr>
+            <w:tcW w:type="dxa" w:w="1440"/>
+          </w:tcPr>
+          <w:p>
+            <w:r>
+              <w:t>Vis5</w:t>
+            </w:r>
+          </w:p>
+        </w:tc>
+        <w:tc>
+          <w:tcPr>
+            <w:tcW w:type="dxa" w:w="1440"/>
+          </w:tcPr>
+          <w:p>
+            <w:r>
+              <w:t>23720</w:t>
+            </w:r>
+          </w:p>
+        </w:tc>
+        <w:tc>
+          <w:tcPr>
+            <w:tcW w:type="dxa" w:w="1440"/>
+          </w:tcPr>
+          <w:p>
+            <w:r>
+              <w:t>27030</w:t>
+            </w:r>
+          </w:p>
+        </w:tc>
+        <w:tc>
+          <w:tcPr>
+            <w:tcW w:type="dxa" w:w="1440"/>
+          </w:tcPr>
+          <w:p>
+            <w:r>
+              <w:t>3310</w:t>
+            </w:r>
+          </w:p>
+        </w:tc>
+        <w:tc>
+          <w:tcPr>
+            <w:tcW w:type="dxa" w:w="1440"/>
+          </w:tcPr>
+          <w:p>
+            <w:r>
+              <w:t>11:35</w:t>
+            </w:r>
+          </w:p>
+        </w:tc>
+        <w:tc>
+          <w:tcPr>
+            <w:tcW w:type="dxa" w:w="1440"/>
+          </w:tcPr>
+          <w:p>
+            <w:r>
+              <w:t>12:30</w:t>
+            </w:r>
+          </w:p>
+        </w:tc>
+      </w:tr>
+      <w:tr>
+        <w:tc>
+          <w:tcPr>
+            <w:tcW w:type="dxa" w:w="1440"/>
+          </w:tcPr>
+          <w:p>
+            <w:r>
+              <w:t>Vis6</w:t>
+            </w:r>
+          </w:p>
+        </w:tc>
+        <w:tc>
+          <w:tcPr>
+            <w:tcW w:type="dxa" w:w="1440"/>
+          </w:tcPr>
+          <w:p>
+            <w:r>
+              <w:t>29580</w:t>
+            </w:r>
+          </w:p>
+        </w:tc>
+        <w:tc>
+          <w:tcPr>
+            <w:tcW w:type="dxa" w:w="1440"/>
+          </w:tcPr>
+          <w:p>
+            <w:r>
+              <w:t>33000</w:t>
+            </w:r>
+          </w:p>
+        </w:tc>
+        <w:tc>
+          <w:tcPr>
+            <w:tcW w:type="dxa" w:w="1440"/>
+          </w:tcPr>
+          <w:p>
+            <w:r>
+              <w:t>3420</w:t>
+            </w:r>
+          </w:p>
+        </w:tc>
+        <w:tc>
+          <w:tcPr>
+            <w:tcW w:type="dxa" w:w="1440"/>
+          </w:tcPr>
+          <w:p>
+            <w:r>
+              <w:t>13:13</w:t>
+            </w:r>
+          </w:p>
+        </w:tc>
+        <w:tc>
+          <w:tcPr>
+            <w:tcW w:type="dxa" w:w="1440"/>
+          </w:tcPr>
+          <w:p>
+            <w:r>
+              <w:t>14:10</w:t>
+            </w:r>
+          </w:p>
+        </w:tc>
+      </w:tr>
+      <w:tr>
+        <w:tc>
+          <w:tcPr>
+            <w:tcW w:type="dxa" w:w="1440"/>
+          </w:tcPr>
+          <w:p>
+            <w:r>
+              <w:t>Vis7</w:t>
+            </w:r>
+          </w:p>
+        </w:tc>
+        <w:tc>
+          <w:tcPr>
+            <w:tcW w:type="dxa" w:w="1440"/>
+          </w:tcPr>
+          <w:p>
+            <w:r>
+              <w:t>35550</w:t>
+            </w:r>
+          </w:p>
+        </w:tc>
+        <w:tc>
+          <w:tcPr>
+            <w:tcW w:type="dxa" w:w="1440"/>
+          </w:tcPr>
+          <w:p>
+            <w:r>
+              <w:t>39060</w:t>
+            </w:r>
+          </w:p>
+        </w:tc>
+        <w:tc>
+          <w:tcPr>
+            <w:tcW w:type="dxa" w:w="1440"/>
+          </w:tcPr>
+          <w:p>
+            <w:r>
+              <w:t>3510</w:t>
+            </w:r>
+          </w:p>
+        </w:tc>
+        <w:tc>
+          <w:tcPr>
+            <w:tcW w:type="dxa" w:w="1440"/>
+          </w:tcPr>
+          <w:p>
+            <w:r>
+              <w:t>14:52</w:t>
+            </w:r>
+          </w:p>
+        </w:tc>
+        <w:tc>
+          <w:tcPr>
+            <w:tcW w:type="dxa" w:w="1440"/>
+          </w:tcPr>
+          <w:p>
+            <w:r>
+              <w:t>15:51</w:t>
+            </w:r>
+          </w:p>
+        </w:tc>
+      </w:tr>
+      <w:tr>
+        <w:tc>
+          <w:tcPr>
+            <w:tcW w:type="dxa" w:w="1440"/>
+          </w:tcPr>
+          <w:p>
+            <w:r>
+              <w:t>Vis8</w:t>
+            </w:r>
+          </w:p>
+        </w:tc>
+        <w:tc>
+          <w:tcPr>
+            <w:tcW w:type="dxa" w:w="1440"/>
+          </w:tcPr>
+          <w:p>
+            <w:r>
+              <w:t>41610</w:t>
+            </w:r>
+          </w:p>
+        </w:tc>
+        <w:tc>
+          <w:tcPr>
+            <w:tcW w:type="dxa" w:w="1440"/>
+          </w:tcPr>
+          <w:p>
+            <w:r>
+              <w:t>45090</w:t>
+            </w:r>
+          </w:p>
+        </w:tc>
+        <w:tc>
+          <w:tcPr>
+            <w:tcW w:type="dxa" w:w="1440"/>
+          </w:tcPr>
+          <w:p>
+            <w:r>
+              <w:t>3480</w:t>
+            </w:r>
+          </w:p>
+        </w:tc>
+        <w:tc>
+          <w:tcPr>
+            <w:tcW w:type="dxa" w:w="1440"/>
+          </w:tcPr>
+          <w:p>
+            <w:r>
+              <w:t>16:33</w:t>
+            </w:r>
+          </w:p>
+        </w:tc>
+        <w:tc>
+          <w:tcPr>
+            <w:tcW w:type="dxa" w:w="1440"/>
+          </w:tcPr>
+          <w:p>
+            <w:r>
+              <w:t>17:31</w:t>
+            </w:r>
+          </w:p>
+        </w:tc>
+      </w:tr>
+      <w:tr>
+        <w:tc>
+          <w:tcPr>
+            <w:tcW w:type="dxa" w:w="1440"/>
+          </w:tcPr>
+          <w:p>
+            <w:r>
+              <w:t>Vis9</w:t>
+            </w:r>
+          </w:p>
+        </w:tc>
+        <w:tc>
+          <w:tcPr>
+            <w:tcW w:type="dxa" w:w="1440"/>
+          </w:tcPr>
+          <w:p>
+            <w:r>
+              <w:t>47640</w:t>
+            </w:r>
+          </w:p>
+        </w:tc>
+        <w:tc>
+          <w:tcPr>
+            <w:tcW w:type="dxa" w:w="1440"/>
+          </w:tcPr>
+          <w:p>
+            <w:r>
+              <w:t>51010</w:t>
+            </w:r>
+          </w:p>
+        </w:tc>
+        <w:tc>
+          <w:tcPr>
+            <w:tcW w:type="dxa" w:w="1440"/>
+          </w:tcPr>
+          <w:p>
+            <w:r>
+              <w:t>3370</w:t>
+            </w:r>
+          </w:p>
+        </w:tc>
+        <w:tc>
+          <w:tcPr>
+            <w:tcW w:type="dxa" w:w="1440"/>
+          </w:tcPr>
+          <w:p>
+            <w:r>
+              <w:t>18:14</w:t>
+            </w:r>
+          </w:p>
+        </w:tc>
+        <w:tc>
+          <w:tcPr>
+            <w:tcW w:type="dxa" w:w="1440"/>
+          </w:tcPr>
+          <w:p>
+            <w:r>
+              <w:t>19:10</w:t>
+            </w:r>
+          </w:p>
+        </w:tc>
+      </w:tr>
+      <w:tr>
+        <w:tc>
+          <w:tcPr>
+            <w:tcW w:type="dxa" w:w="1440"/>
+          </w:tcPr>
+          <w:p>
+            <w:r>
+              <w:t>Vis10</w:t>
+            </w:r>
+          </w:p>
+        </w:tc>
+        <w:tc>
+          <w:tcPr>
+            <w:tcW w:type="dxa" w:w="1440"/>
+          </w:tcPr>
+          <w:p>
+            <w:r>
+              <w:t>53560</w:t>
+            </w:r>
+          </w:p>
+        </w:tc>
+        <w:tc>
+          <w:tcPr>
+            <w:tcW w:type="dxa" w:w="1440"/>
+          </w:tcPr>
+          <w:p>
+            <w:r>
+              <w:t>56850</w:t>
+            </w:r>
+          </w:p>
+        </w:tc>
+        <w:tc>
+          <w:tcPr>
+            <w:tcW w:type="dxa" w:w="1440"/>
+          </w:tcPr>
+          <w:p>
+            <w:r>
+              <w:t>3290</w:t>
+            </w:r>
+          </w:p>
+        </w:tc>
+        <w:tc>
+          <w:tcPr>
+            <w:tcW w:type="dxa" w:w="1440"/>
+          </w:tcPr>
+          <w:p>
+            <w:r>
+              <w:t>19:52</w:t>
+            </w:r>
+          </w:p>
+        </w:tc>
+        <w:tc>
+          <w:tcPr>
+            <w:tcW w:type="dxa" w:w="1440"/>
+          </w:tcPr>
+          <w:p>
+            <w:r>
+              <w:t>20:47</w:t>
+            </w:r>
+          </w:p>
+        </w:tc>
+      </w:tr>
+      <w:tr>
+        <w:tc>
+          <w:tcPr>
+            <w:tcW w:type="dxa" w:w="1440"/>
+          </w:tcPr>
+          <w:p>
+            <w:r>
+              <w:t>Vis11</w:t>
+            </w:r>
+          </w:p>
+        </w:tc>
+        <w:tc>
+          <w:tcPr>
+            <w:tcW w:type="dxa" w:w="1440"/>
+          </w:tcPr>
+          <w:p>
+            <w:r>
+              <w:t>59430</w:t>
+            </w:r>
+          </w:p>
+        </w:tc>
+        <w:tc>
+          <w:tcPr>
+            <w:tcW w:type="dxa" w:w="1440"/>
+          </w:tcPr>
+          <w:p>
+            <w:r>
+              <w:t>62870</w:t>
+            </w:r>
+          </w:p>
+        </w:tc>
+        <w:tc>
+          <w:tcPr>
+            <w:tcW w:type="dxa" w:w="1440"/>
+          </w:tcPr>
+          <w:p>
+            <w:r>
+              <w:t>3440</w:t>
+            </w:r>
+          </w:p>
+        </w:tc>
+        <w:tc>
+          <w:tcPr>
+            <w:tcW w:type="dxa" w:w="1440"/>
+          </w:tcPr>
+          <w:p>
+            <w:r>
+              <w:t>21:30</w:t>
+            </w:r>
+          </w:p>
+        </w:tc>
+        <w:tc>
+          <w:tcPr>
+            <w:tcW w:type="dxa" w:w="1440"/>
+          </w:tcPr>
+          <w:p>
+            <w:r>
+              <w:t>22:27</w:t>
+            </w:r>
+          </w:p>
+        </w:tc>
+      </w:tr>
+      <w:tr>
+        <w:tc>
+          <w:tcPr>
+            <w:tcW w:type="dxa" w:w="1440"/>
+          </w:tcPr>
+          <w:p>
+            <w:r>
+              <w:t>Vis12</w:t>
+            </w:r>
+          </w:p>
+        </w:tc>
+        <w:tc>
+          <w:tcPr>
+            <w:tcW w:type="dxa" w:w="1440"/>
+          </w:tcPr>
+          <w:p>
+            <w:r>
+              <w:t>65360</w:t>
+            </w:r>
+          </w:p>
+        </w:tc>
+        <w:tc>
+          <w:tcPr>
+            <w:tcW w:type="dxa" w:w="1440"/>
+          </w:tcPr>
+          <w:p>
+            <w:r>
+              <w:t>68830</w:t>
+            </w:r>
+          </w:p>
+        </w:tc>
+        <w:tc>
+          <w:tcPr>
+            <w:tcW w:type="dxa" w:w="1440"/>
+          </w:tcPr>
+          <w:p>
+            <w:r>
+              <w:t>3470</w:t>
+            </w:r>
+          </w:p>
+        </w:tc>
+        <w:tc>
+          <w:tcPr>
+            <w:tcW w:type="dxa" w:w="1440"/>
+          </w:tcPr>
+          <w:p>
+            <w:r>
+              <w:t>23:09</w:t>
+            </w:r>
+          </w:p>
+        </w:tc>
+        <w:tc>
+          <w:tcPr>
+            <w:tcW w:type="dxa" w:w="1440"/>
+          </w:tcPr>
+          <w:p>
+            <w:r>
+              <w:t>00:07</w:t>
+            </w:r>
+          </w:p>
+        </w:tc>
+      </w:tr>
+      <w:tr>
+        <w:tc>
+          <w:tcPr>
+            <w:tcW w:type="dxa" w:w="1440"/>
+          </w:tcPr>
+          <w:p>
+            <w:r>
+              <w:t>Vis13</w:t>
+            </w:r>
+          </w:p>
+        </w:tc>
+        <w:tc>
+          <w:tcPr>
+            <w:tcW w:type="dxa" w:w="1440"/>
+          </w:tcPr>
+          <w:p>
+            <w:r>
+              <w:t>71060</w:t>
+            </w:r>
+          </w:p>
+        </w:tc>
+        <w:tc>
+          <w:tcPr>
+            <w:tcW w:type="dxa" w:w="1440"/>
+          </w:tcPr>
+          <w:p>
+            <w:r>
+              <w:t>74570</w:t>
+            </w:r>
+          </w:p>
+        </w:tc>
+        <w:tc>
+          <w:tcPr>
+            <w:tcW w:type="dxa" w:w="1440"/>
+          </w:tcPr>
+          <w:p>
+            <w:r>
+              <w:t>3510</w:t>
+            </w:r>
+          </w:p>
+        </w:tc>
+        <w:tc>
+          <w:tcPr>
+            <w:tcW w:type="dxa" w:w="1440"/>
+          </w:tcPr>
+          <w:p>
+            <w:r>
+              <w:t>00:44</w:t>
+            </w:r>
+          </w:p>
+        </w:tc>
+        <w:tc>
+          <w:tcPr>
+            <w:tcW w:type="dxa" w:w="1440"/>
+          </w:tcPr>
+          <w:p>
+            <w:r>
+              <w:t>01:42</w:t>
+            </w:r>
+          </w:p>
+        </w:tc>
+      </w:tr>
+      <w:tr>
+        <w:tc>
+          <w:tcPr>
+            <w:tcW w:type="dxa" w:w="1440"/>
+          </w:tcPr>
+          <w:p>
+            <w:r>
+              <w:t>Vis14</w:t>
+            </w:r>
+          </w:p>
+        </w:tc>
+        <w:tc>
+          <w:tcPr>
+            <w:tcW w:type="dxa" w:w="1440"/>
+          </w:tcPr>
+          <w:p>
+            <w:r>
+              <w:t>76890</w:t>
+            </w:r>
+          </w:p>
+        </w:tc>
+        <w:tc>
+          <w:tcPr>
+            <w:tcW w:type="dxa" w:w="1440"/>
+          </w:tcPr>
+          <w:p>
+            <w:r>
+              <w:t>80370</w:t>
+            </w:r>
+          </w:p>
+        </w:tc>
+        <w:tc>
+          <w:tcPr>
+            <w:tcW w:type="dxa" w:w="1440"/>
+          </w:tcPr>
+          <w:p>
+            <w:r>
+              <w:t>3480</w:t>
+            </w:r>
+          </w:p>
+        </w:tc>
+        <w:tc>
+          <w:tcPr>
+            <w:tcW w:type="dxa" w:w="1440"/>
+          </w:tcPr>
+          <w:p>
+            <w:r>
+              <w:t>02:21</w:t>
+            </w:r>
+          </w:p>
+        </w:tc>
+        <w:tc>
+          <w:tcPr>
+            <w:tcW w:type="dxa" w:w="1440"/>
+          </w:tcPr>
+          <w:p>
+            <w:r>
+              <w:t>03:19</w:t>
+            </w:r>
+          </w:p>
+        </w:tc>
+      </w:tr>
+    </w:tbl>
+    <w:p/>
+    <w:p>
+      <w:pPr>
+        <w:pStyle w:val="Heading3"/>
+      </w:pPr>
+      <w:r>
+        <w:t>X.1.2 SWA遮挡区间</w:t>
+      </w:r>
+    </w:p>
+    <w:p>
+      <w:pPr>
+        <w:jc w:val="center"/>
+      </w:pPr>
+      <w:r>
+        <w:rPr>
+          <w:b/>
+        </w:rPr>
+        <w:t>表X-3 TLE实算SWA遮挡区间</w:t>
+      </w:r>
+    </w:p>
+    <w:tbl>
+      <w:tblPr>
+        <w:tblStyle w:val="TableGrid"/>
+        <w:tblW w:type="auto" w:w="0"/>
+        <w:tblLook w:firstColumn="1" w:firstRow="1" w:lastColumn="0" w:lastRow="0" w:noHBand="0" w:noVBand="1" w:val="04A0"/>
+      </w:tblPr>
+      <w:tblGrid>
+        <w:gridCol w:w="1440"/>
+        <w:gridCol w:w="1440"/>
+        <w:gridCol w:w="1440"/>
+        <w:gridCol w:w="1440"/>
+        <w:gridCol w:w="1440"/>
+        <w:gridCol w:w="1440"/>
+      </w:tblGrid>
+      <w:tr>
+        <w:tc>
+          <w:tcPr>
+            <w:tcW w:type="dxa" w:w="1440"/>
+            <w:shd w:val="clear" w:color="auto" w:fill="D9E2F3"/>
+          </w:tcPr>
+          <w:p>
+            <w:r>
+              <w:rPr>
+                <w:b/>
+              </w:rPr>
+              <w:t>起始(s)</w:t>
+            </w:r>
+          </w:p>
+        </w:tc>
+        <w:tc>
+          <w:tcPr>
+            <w:tcW w:type="dxa" w:w="1440"/>
+            <w:shd w:val="clear" w:color="auto" w:fill="D9E2F3"/>
+          </w:tcPr>
+          <w:p>
+            <w:r>
+              <w:rPr>
+                <w:b/>
+              </w:rPr>
+              <w:t>结束(s)</w:t>
+            </w:r>
+          </w:p>
+        </w:tc>
+        <w:tc>
+          <w:tcPr>
+            <w:tcW w:type="dxa" w:w="1440"/>
+            <w:shd w:val="clear" w:color="auto" w:fill="D9E2F3"/>
+          </w:tcPr>
+          <w:p>
+            <w:r>
+              <w:rPr>
+                <w:b/>
+              </w:rPr>
+              <w:t>时长(s)</w:t>
+            </w:r>
+          </w:p>
+        </w:tc>
+        <w:tc>
+          <w:tcPr>
+            <w:tcW w:type="dxa" w:w="1440"/>
+            <w:shd w:val="clear" w:color="auto" w:fill="D9E2F3"/>
+          </w:tcPr>
+          <w:p>
+            <w:r>
+              <w:rPr>
+                <w:b/>
+              </w:rPr>
+              <w:t>起始(BJT)</w:t>
+            </w:r>
+          </w:p>
+        </w:tc>
+        <w:tc>
+          <w:tcPr>
+            <w:tcW w:type="dxa" w:w="1440"/>
+            <w:shd w:val="clear" w:color="auto" w:fill="D9E2F3"/>
+          </w:tcPr>
+          <w:p>
+            <w:r>
+              <w:rPr>
+                <w:b/>
+              </w:rPr>
+              <w:t>结束(BJT)</w:t>
+            </w:r>
+          </w:p>
+        </w:tc>
+        <w:tc>
+          <w:tcPr>
+            <w:tcW w:type="dxa" w:w="1440"/>
+            <w:shd w:val="clear" w:color="auto" w:fill="D9E2F3"/>
+          </w:tcPr>
+          <w:p>
+            <w:r>
+              <w:rPr>
+                <w:b/>
+              </w:rPr>
+              <w:t>状态</w:t>
+            </w:r>
+          </w:p>
+        </w:tc>
+      </w:tr>
+      <w:tr>
+        <w:tc>
+          <w:tcPr>
+            <w:tcW w:type="dxa" w:w="1440"/>
+          </w:tcPr>
+          <w:p>
+            <w:r>
+              <w:t>0</w:t>
+            </w:r>
+          </w:p>
+        </w:tc>
+        <w:tc>
+          <w:tcPr>
+            <w:tcW w:type="dxa" w:w="1440"/>
+          </w:tcPr>
+          <w:p>
+            <w:r>
+              <w:t>61750</w:t>
+            </w:r>
+          </w:p>
+        </w:tc>
+        <w:tc>
+          <w:tcPr>
+            <w:tcW w:type="dxa" w:w="1440"/>
+          </w:tcPr>
+          <w:p>
+            <w:r>
+              <w:t>61750</w:t>
+            </w:r>
+          </w:p>
+        </w:tc>
+        <w:tc>
+          <w:tcPr>
+            <w:tcW w:type="dxa" w:w="1440"/>
+          </w:tcPr>
+          <w:p>
+            <w:r>
+              <w:t>05:00</w:t>
+            </w:r>
+          </w:p>
+        </w:tc>
+        <w:tc>
+          <w:tcPr>
+            <w:tcW w:type="dxa" w:w="1440"/>
+          </w:tcPr>
+          <w:p>
+            <w:r>
+              <w:t>22:09</w:t>
+            </w:r>
+          </w:p>
+        </w:tc>
+        <w:tc>
+          <w:tcPr>
+            <w:tcW w:type="dxa" w:w="1440"/>
+          </w:tcPr>
+          <w:p>
+            <w:r>
+              <w:t>不活跃</w:t>
+            </w:r>
+          </w:p>
+        </w:tc>
+      </w:tr>
+      <w:tr>
+        <w:tc>
+          <w:tcPr>
+            <w:tcW w:type="dxa" w:w="1440"/>
+          </w:tcPr>
+          <w:p>
+            <w:r>
+              <w:t>61750</w:t>
+            </w:r>
+          </w:p>
+        </w:tc>
+        <w:tc>
+          <w:tcPr>
+            <w:tcW w:type="dxa" w:w="1440"/>
+          </w:tcPr>
+          <w:p>
+            <w:r>
+              <w:t>62180</w:t>
+            </w:r>
+          </w:p>
+        </w:tc>
+        <w:tc>
+          <w:tcPr>
+            <w:tcW w:type="dxa" w:w="1440"/>
+          </w:tcPr>
+          <w:p>
+            <w:r>
+              <w:t>430</w:t>
+            </w:r>
+          </w:p>
+        </w:tc>
+        <w:tc>
+          <w:tcPr>
+            <w:tcW w:type="dxa" w:w="1440"/>
+          </w:tcPr>
+          <w:p>
+            <w:r>
+              <w:t>22:09</w:t>
+            </w:r>
+          </w:p>
+        </w:tc>
+        <w:tc>
+          <w:tcPr>
+            <w:tcW w:type="dxa" w:w="1440"/>
+          </w:tcPr>
+          <w:p>
+            <w:r>
+              <w:t>22:16</w:t>
+            </w:r>
+          </w:p>
+        </w:tc>
+        <w:tc>
+          <w:tcPr>
+            <w:tcW w:type="dxa" w:w="1440"/>
+          </w:tcPr>
+          <w:p>
+            <w:r>
+              <w:t>活跃</w:t>
+            </w:r>
+          </w:p>
+        </w:tc>
+      </w:tr>
+      <w:tr>
+        <w:tc>
+          <w:tcPr>
+            <w:tcW w:type="dxa" w:w="1440"/>
+          </w:tcPr>
+          <w:p>
+            <w:r>
+              <w:t>62180</w:t>
+            </w:r>
+          </w:p>
+        </w:tc>
+        <w:tc>
+          <w:tcPr>
+            <w:tcW w:type="dxa" w:w="1440"/>
+          </w:tcPr>
+          <w:p>
+            <w:r>
+              <w:t>75450</w:t>
+            </w:r>
+          </w:p>
+        </w:tc>
+        <w:tc>
+          <w:tcPr>
+            <w:tcW w:type="dxa" w:w="1440"/>
+          </w:tcPr>
+          <w:p>
+            <w:r>
+              <w:t>13270</w:t>
+            </w:r>
+          </w:p>
+        </w:tc>
+        <w:tc>
+          <w:tcPr>
+            <w:tcW w:type="dxa" w:w="1440"/>
+          </w:tcPr>
+          <w:p>
+            <w:r>
+              <w:t>22:16</w:t>
+            </w:r>
+          </w:p>
+        </w:tc>
+        <w:tc>
+          <w:tcPr>
+            <w:tcW w:type="dxa" w:w="1440"/>
+          </w:tcPr>
+          <w:p>
+            <w:r>
+              <w:t>01:57</w:t>
+            </w:r>
+          </w:p>
+        </w:tc>
+        <w:tc>
+          <w:tcPr>
+            <w:tcW w:type="dxa" w:w="1440"/>
+          </w:tcPr>
+          <w:p>
+            <w:r>
+              <w:t>不活跃</w:t>
+            </w:r>
+          </w:p>
+        </w:tc>
+      </w:tr>
+      <w:tr>
+        <w:tc>
+          <w:tcPr>
+            <w:tcW w:type="dxa" w:w="1440"/>
+          </w:tcPr>
+          <w:p>
+            <w:r>
+              <w:t>75450</w:t>
+            </w:r>
+          </w:p>
+        </w:tc>
+        <w:tc>
+          <w:tcPr>
+            <w:tcW w:type="dxa" w:w="1440"/>
+          </w:tcPr>
+          <w:p>
+            <w:r>
+              <w:t>76110</w:t>
+            </w:r>
+          </w:p>
+        </w:tc>
+        <w:tc>
+          <w:tcPr>
+            <w:tcW w:type="dxa" w:w="1440"/>
+          </w:tcPr>
+          <w:p>
+            <w:r>
+              <w:t>660</w:t>
+            </w:r>
+          </w:p>
+        </w:tc>
+        <w:tc>
+          <w:tcPr>
+            <w:tcW w:type="dxa" w:w="1440"/>
+          </w:tcPr>
+          <w:p>
+            <w:r>
+              <w:t>01:57</w:t>
+            </w:r>
+          </w:p>
+        </w:tc>
+        <w:tc>
+          <w:tcPr>
+            <w:tcW w:type="dxa" w:w="1440"/>
+          </w:tcPr>
+          <w:p>
+            <w:r>
+              <w:t>02:08</w:t>
+            </w:r>
+          </w:p>
+        </w:tc>
+        <w:tc>
+          <w:tcPr>
+            <w:tcW w:type="dxa" w:w="1440"/>
+          </w:tcPr>
+          <w:p>
+            <w:r>
+              <w:t>活跃</w:t>
             </w:r>
           </w:p>
         </w:tc>
@@ -326,7 +1684,7 @@
     </w:p>
     <w:p>
       <w:r>
-        <w:t>算例一选择Phase3在通信窗口Vis10内执行，Phase4紧随Phase3在同一窗口内完成，该时段无SWA遮挡事件影响。</w:t>
+        <w:t>算例一选择Phase3（大臂运动）在通信窗口Vis10 [53560, 56850]内执行，Phase4紧随Phase3在同一窗口内完成。该时段无SWA遮挡事件影响，Phase3至Phase5连续执行。Phase6因通信中断（Vis10结束后的间隙）推迟至Vis11执行。</w:t>
       </w:r>
     </w:p>
     <w:p>
@@ -337,7 +1695,7 @@
         <w:rPr>
           <w:b/>
         </w:rPr>
-        <w:t>表X-2 算例一任务规划结果</w:t>
+        <w:t>表X-4 算例一任务规划结果</w:t>
       </w:r>
     </w:p>
     <w:tbl>
@@ -380,7 +1738,7 @@
               <w:rPr>
                 <w:b/>
               </w:rPr>
-              <w:t>任务</w:t>
+              <w:t>任务名称</w:t>
             </w:r>
           </w:p>
         </w:tc>
@@ -394,7 +1752,7 @@
               <w:rPr>
                 <w:b/>
               </w:rPr>
-              <w:t>开始(BJT)</w:t>
+              <w:t>开始时间(s)</w:t>
             </w:r>
           </w:p>
         </w:tc>
@@ -408,7 +1766,7 @@
               <w:rPr>
                 <w:b/>
               </w:rPr>
-              <w:t>结束(BJT)</w:t>
+              <w:t>结束时间(s)</w:t>
             </w:r>
           </w:p>
         </w:tc>
@@ -482,7 +1840,7 @@
           </w:tcPr>
           <w:p>
             <w:r>
-              <w:t>07:36</w:t>
+              <w:t>9380</w:t>
             </w:r>
           </w:p>
         </w:tc>
@@ -492,7 +1850,7 @@
           </w:tcPr>
           <w:p>
             <w:r>
-              <w:t>07:52</w:t>
+              <w:t>10360</w:t>
             </w:r>
           </w:p>
         </w:tc>
@@ -522,7 +1880,7 @@
           </w:tcPr>
           <w:p>
             <w:r>
-              <w:t>Phase3前12.0h</w:t>
+              <w:t>Phase3前12.0h (10360→53560)</w:t>
             </w:r>
           </w:p>
         </w:tc>
@@ -554,7 +1912,7 @@
           </w:tcPr>
           <w:p>
             <w:r>
-              <w:t>15:20</w:t>
+              <w:t>37250</w:t>
             </w:r>
           </w:p>
         </w:tc>
@@ -564,7 +1922,7 @@
           </w:tcPr>
           <w:p>
             <w:r>
-              <w:t>15:23</w:t>
+              <w:t>37400</w:t>
             </w:r>
           </w:p>
         </w:tc>
@@ -594,7 +1952,7 @@
           </w:tcPr>
           <w:p>
             <w:r>
-              <w:t>Phase4前5.0h</w:t>
+              <w:t>Phase4前5.0h (37400→55400)</w:t>
             </w:r>
           </w:p>
         </w:tc>
@@ -626,7 +1984,7 @@
           </w:tcPr>
           <w:p>
             <w:r>
-              <w:t>06:42</w:t>
+              <w:t>6130</w:t>
             </w:r>
           </w:p>
         </w:tc>
@@ -636,7 +1994,7 @@
           </w:tcPr>
           <w:p>
             <w:r>
-              <w:t>07:41</w:t>
+              <w:t>9660</w:t>
             </w:r>
           </w:p>
         </w:tc>
@@ -698,7 +2056,7 @@
           </w:tcPr>
           <w:p>
             <w:r>
-              <w:t>—</w:t>
+              <w:t>9660</w:t>
             </w:r>
           </w:p>
         </w:tc>
@@ -708,7 +2066,7 @@
           </w:tcPr>
           <w:p>
             <w:r>
-              <w:t>—</w:t>
+              <w:t>53560</w:t>
             </w:r>
           </w:p>
         </w:tc>
@@ -760,7 +2118,7 @@
           </w:tcPr>
           <w:p>
             <w:r>
-              <w:t>大臂运动至组合(5项)</w:t>
+              <w:t>大臂运动至组合构型(5项)</w:t>
             </w:r>
           </w:p>
         </w:tc>
@@ -770,7 +2128,7 @@
           </w:tcPr>
           <w:p>
             <w:r>
-              <w:t>19:52</w:t>
+              <w:t>53560</w:t>
             </w:r>
           </w:p>
         </w:tc>
@@ -780,7 +2138,7 @@
           </w:tcPr>
           <w:p>
             <w:r>
-              <w:t>20:23</w:t>
+              <w:t>55400</w:t>
             </w:r>
           </w:p>
         </w:tc>
@@ -842,7 +2200,7 @@
           </w:tcPr>
           <w:p>
             <w:r>
-              <w:t>20:23</w:t>
+              <w:t>55400</w:t>
             </w:r>
           </w:p>
         </w:tc>
@@ -852,7 +2210,7 @@
           </w:tcPr>
           <w:p>
             <w:r>
-              <w:t>20:36</w:t>
+              <w:t>56170</w:t>
             </w:r>
           </w:p>
         </w:tc>
@@ -882,7 +2240,7 @@
           </w:tcPr>
           <w:p>
             <w:r>
-              <w:t>无遮挡</w:t>
+              <w:t>无遮挡影响</w:t>
             </w:r>
           </w:p>
         </w:tc>
@@ -914,7 +2272,7 @@
           </w:tcPr>
           <w:p>
             <w:r>
-              <w:t>20:36</w:t>
+              <w:t>56170</w:t>
             </w:r>
           </w:p>
         </w:tc>
@@ -924,7 +2282,7 @@
           </w:tcPr>
           <w:p>
             <w:r>
-              <w:t>20:43</w:t>
+              <w:t>56630</w:t>
             </w:r>
           </w:p>
         </w:tc>
@@ -954,7 +2312,7 @@
           </w:tcPr>
           <w:p>
             <w:r>
-              <w:t>无遮挡</w:t>
+              <w:t>无遮挡影响</w:t>
             </w:r>
           </w:p>
         </w:tc>
@@ -986,6 +2344,36 @@
           </w:tcPr>
           <w:p>
             <w:r>
+              <w:t>56630</w:t>
+            </w:r>
+          </w:p>
+        </w:tc>
+        <w:tc>
+          <w:tcPr>
+            <w:tcW w:type="dxa" w:w="1234"/>
+          </w:tcPr>
+          <w:p>
+            <w:r>
+              <w:t>59430</w:t>
+            </w:r>
+          </w:p>
+        </w:tc>
+        <w:tc>
+          <w:tcPr>
+            <w:tcW w:type="dxa" w:w="1234"/>
+          </w:tcPr>
+          <w:p>
+            <w:r>
+              <w:t>2800</w:t>
+            </w:r>
+          </w:p>
+        </w:tc>
+        <w:tc>
+          <w:tcPr>
+            <w:tcW w:type="dxa" w:w="1234"/>
+          </w:tcPr>
+          <w:p>
+            <w:r>
               <w:t>—</w:t>
             </w:r>
           </w:p>
@@ -996,37 +2384,7 @@
           </w:tcPr>
           <w:p>
             <w:r>
-              <w:t>—</w:t>
-            </w:r>
-          </w:p>
-        </w:tc>
-        <w:tc>
-          <w:tcPr>
-            <w:tcW w:type="dxa" w:w="1234"/>
-          </w:tcPr>
-          <w:p>
-            <w:r>
-              <w:t>2800</w:t>
-            </w:r>
-          </w:p>
-        </w:tc>
-        <w:tc>
-          <w:tcPr>
-            <w:tcW w:type="dxa" w:w="1234"/>
-          </w:tcPr>
-          <w:p>
-            <w:r>
-              <w:t>—</w:t>
-            </w:r>
-          </w:p>
-        </w:tc>
-        <w:tc>
-          <w:tcPr>
-            <w:tcW w:type="dxa" w:w="1234"/>
-          </w:tcPr>
-          <w:p>
-            <w:r>
-              <w:t>通信中断</w:t>
+              <w:t>通信中断期</w:t>
             </w:r>
           </w:p>
         </w:tc>
@@ -1048,7 +2406,7 @@
           </w:tcPr>
           <w:p>
             <w:r>
-              <w:t>小臂独立设置(6项)</w:t>
+              <w:t>小臂独立工作设置(6项)</w:t>
             </w:r>
           </w:p>
         </w:tc>
@@ -1058,7 +2416,7 @@
           </w:tcPr>
           <w:p>
             <w:r>
-              <w:t>21:30</w:t>
+              <w:t>59430</w:t>
             </w:r>
           </w:p>
         </w:tc>
@@ -1068,7 +2426,7 @@
           </w:tcPr>
           <w:p>
             <w:r>
-              <w:t>21:56</w:t>
+              <w:t>60990</w:t>
             </w:r>
           </w:p>
         </w:tc>
@@ -1105,6 +2463,11 @@
       </w:tr>
     </w:tbl>
     <w:p/>
+    <w:p>
+      <w:r>
+        <w:t>算例一中，Phase3至Phase5总操作时长3070s，小于Vis10窗口容量3290s，在单一通信窗口内连续完成。Phase6因Vis10与Vis11之间的通信中断（56630~59430s，时长2800s）推迟至Vis11执行。任务于T=60990s完成。</w:t>
+      </w:r>
+    </w:p>
     <w:p>
       <w:pPr>
         <w:pStyle w:val="Heading2"/>
@@ -1115,7 +2478,7 @@
     </w:p>
     <w:p>
       <w:r>
-        <w:t>算例二选择Phase3在通信窗口Vis11内执行。Phase3结束后，SWA遮挡事件[61750,62180]（BJT 22:09~22:16）覆盖了Phase4的预期执行时段。遮挡结束后Vis11仅剩690秒，不足以容纳Phase4（770秒），规划器自动将Phase4推迟至Vis12，导致68分钟等待延迟。</w:t>
+        <w:t>算例二选择Phase3在通信窗口Vis11 [59430, 62870]内执行。Phase3于T=61270s结束后，SWA遮挡事件[61750, 62180]覆盖了Phase4的预期执行时段[61270, 62040]。遮挡于T=62180s结束后，Vis11仅剩690s，不足以容纳Phase4（770s）。规划器自动将Phase4推迟至下一通信窗口Vis12 [65360, 68830]，产生4090s（约68分钟）的等待延迟。</w:t>
       </w:r>
     </w:p>
     <w:p>
@@ -1126,7 +2489,7 @@
         <w:rPr>
           <w:b/>
         </w:rPr>
-        <w:t>表X-3 算例二任务规划结果</w:t>
+        <w:t>表X-5 算例二任务规划结果</w:t>
       </w:r>
     </w:p>
     <w:tbl>
@@ -1169,7 +2532,7 @@
               <w:rPr>
                 <w:b/>
               </w:rPr>
-              <w:t>任务</w:t>
+              <w:t>任务名称</w:t>
             </w:r>
           </w:p>
         </w:tc>
@@ -1183,7 +2546,7 @@
               <w:rPr>
                 <w:b/>
               </w:rPr>
-              <w:t>开始(BJT)</w:t>
+              <w:t>开始时间(s)</w:t>
             </w:r>
           </w:p>
         </w:tc>
@@ -1197,7 +2560,7 @@
               <w:rPr>
                 <w:b/>
               </w:rPr>
-              <w:t>结束(BJT)</w:t>
+              <w:t>结束时间(s)</w:t>
             </w:r>
           </w:p>
         </w:tc>
@@ -1271,7 +2634,7 @@
           </w:tcPr>
           <w:p>
             <w:r>
-              <w:t>09:14</w:t>
+              <w:t>15250</w:t>
             </w:r>
           </w:p>
         </w:tc>
@@ -1281,7 +2644,7 @@
           </w:tcPr>
           <w:p>
             <w:r>
-              <w:t>09:30</w:t>
+              <w:t>16230</w:t>
             </w:r>
           </w:p>
         </w:tc>
@@ -1311,7 +2674,7 @@
           </w:tcPr>
           <w:p>
             <w:r>
-              <w:t>Phase3前12.0h</w:t>
+              <w:t>Phase3前12.0h (16230→59430)</w:t>
             </w:r>
           </w:p>
         </w:tc>
@@ -1343,7 +2706,7 @@
           </w:tcPr>
           <w:p>
             <w:r>
-              <w:t>18:14</w:t>
+              <w:t>47640</w:t>
             </w:r>
           </w:p>
         </w:tc>
@@ -1353,7 +2716,7 @@
           </w:tcPr>
           <w:p>
             <w:r>
-              <w:t>18:16</w:t>
+              <w:t>47790</w:t>
             </w:r>
           </w:p>
         </w:tc>
@@ -1383,7 +2746,7 @@
           </w:tcPr>
           <w:p>
             <w:r>
-              <w:t>Phase4前4.9h</w:t>
+              <w:t>Phase4前4.9h (47790→65360)</w:t>
             </w:r>
           </w:p>
         </w:tc>
@@ -1415,7 +2778,7 @@
           </w:tcPr>
           <w:p>
             <w:r>
-              <w:t>06:42</w:t>
+              <w:t>6130</w:t>
             </w:r>
           </w:p>
         </w:tc>
@@ -1425,7 +2788,7 @@
           </w:tcPr>
           <w:p>
             <w:r>
-              <w:t>07:41</w:t>
+              <w:t>9660</w:t>
             </w:r>
           </w:p>
         </w:tc>
@@ -1487,7 +2850,7 @@
           </w:tcPr>
           <w:p>
             <w:r>
-              <w:t>—</w:t>
+              <w:t>9660</w:t>
             </w:r>
           </w:p>
         </w:tc>
@@ -1497,7 +2860,7 @@
           </w:tcPr>
           <w:p>
             <w:r>
-              <w:t>—</w:t>
+              <w:t>59430</w:t>
             </w:r>
           </w:p>
         </w:tc>
@@ -1549,7 +2912,7 @@
           </w:tcPr>
           <w:p>
             <w:r>
-              <w:t>大臂运动至组合(5项)</w:t>
+              <w:t>大臂运动至组合构型(5项)</w:t>
             </w:r>
           </w:p>
         </w:tc>
@@ -1559,7 +2922,7 @@
           </w:tcPr>
           <w:p>
             <w:r>
-              <w:t>21:30</w:t>
+              <w:t>59430</w:t>
             </w:r>
           </w:p>
         </w:tc>
@@ -1569,7 +2932,7 @@
           </w:tcPr>
           <w:p>
             <w:r>
-              <w:t>22:01</w:t>
+              <w:t>61270</w:t>
             </w:r>
           </w:p>
         </w:tc>
@@ -1631,7 +2994,7 @@
           </w:tcPr>
           <w:p>
             <w:r>
-              <w:t>22:01</w:t>
+              <w:t>61270</w:t>
             </w:r>
           </w:p>
         </w:tc>
@@ -1641,7 +3004,7 @@
           </w:tcPr>
           <w:p>
             <w:r>
-              <w:t>23:09</w:t>
+              <w:t>65360</w:t>
             </w:r>
           </w:p>
         </w:tc>
@@ -1671,7 +3034,7 @@
           </w:tcPr>
           <w:p>
             <w:r>
-              <w:t>遮挡阻断</w:t>
+              <w:t>遮挡[61750,62180]+通信间隙</w:t>
             </w:r>
           </w:p>
         </w:tc>
@@ -1703,7 +3066,7 @@
           </w:tcPr>
           <w:p>
             <w:r>
-              <w:t>23:09</w:t>
+              <w:t>65360</w:t>
             </w:r>
           </w:p>
         </w:tc>
@@ -1713,7 +3076,7 @@
           </w:tcPr>
           <w:p>
             <w:r>
-              <w:t>23:22</w:t>
+              <w:t>66130</w:t>
             </w:r>
           </w:p>
         </w:tc>
@@ -1775,7 +3138,7 @@
           </w:tcPr>
           <w:p>
             <w:r>
-              <w:t>23:22</w:t>
+              <w:t>66130</w:t>
             </w:r>
           </w:p>
         </w:tc>
@@ -1785,7 +3148,7 @@
           </w:tcPr>
           <w:p>
             <w:r>
-              <w:t>23:29</w:t>
+              <w:t>66590</w:t>
             </w:r>
           </w:p>
         </w:tc>
@@ -1837,7 +3200,7 @@
           </w:tcPr>
           <w:p>
             <w:r>
-              <w:t>小臂独立设置(6项)</w:t>
+              <w:t>小臂独立工作设置(6项)</w:t>
             </w:r>
           </w:p>
         </w:tc>
@@ -1847,7 +3210,7 @@
           </w:tcPr>
           <w:p>
             <w:r>
-              <w:t>23:29</w:t>
+              <w:t>66590</w:t>
             </w:r>
           </w:p>
         </w:tc>
@@ -1857,7 +3220,7 @@
           </w:tcPr>
           <w:p>
             <w:r>
-              <w:t>23:55</w:t>
+              <w:t>68150</w:t>
             </w:r>
           </w:p>
         </w:tc>
@@ -1910,7 +3273,7 @@
         <w:rPr>
           <w:b/>
         </w:rPr>
-        <w:t>表X-4 两算例对比</w:t>
+        <w:t>表X-6 两算例对比分析</w:t>
       </w:r>
     </w:p>
     <w:tbl>
@@ -1975,7 +3338,7 @@
           </w:tcPr>
           <w:p>
             <w:r>
-              <w:t>Phase3窗口</w:t>
+              <w:t>Phase3所在窗口</w:t>
             </w:r>
           </w:p>
         </w:tc>
@@ -1985,7 +3348,7 @@
           </w:tcPr>
           <w:p>
             <w:r>
-              <w:t>Vis10 [19:52~20:47 BJT]</w:t>
+              <w:t>Vis10 [53560, 56850]</w:t>
             </w:r>
           </w:p>
         </w:tc>
@@ -1995,7 +3358,7 @@
           </w:tcPr>
           <w:p>
             <w:r>
-              <w:t>Vis11 [21:30~22:27 BJT]</w:t>
+              <w:t>Vis11 [59430, 62870]</w:t>
             </w:r>
           </w:p>
         </w:tc>
@@ -2007,7 +3370,7 @@
           </w:tcPr>
           <w:p>
             <w:r>
-              <w:t>遮挡影响</w:t>
+              <w:t>SWA遮挡影响</w:t>
             </w:r>
           </w:p>
         </w:tc>
@@ -2017,7 +3380,7 @@
           </w:tcPr>
           <w:p>
             <w:r>
-              <w:t>无</w:t>
+              <w:t>无遮挡事件</w:t>
             </w:r>
           </w:p>
         </w:tc>
@@ -2027,7 +3390,7 @@
           </w:tcPr>
           <w:p>
             <w:r>
-              <w:t>[22:09~22:16 BJT]阻断Phase4</w:t>
+              <w:t>遮挡[61750,62180]阻断Phase4</w:t>
             </w:r>
           </w:p>
         </w:tc>
@@ -2039,7 +3402,7 @@
           </w:tcPr>
           <w:p>
             <w:r>
-              <w:t>Phase4位置</w:t>
+              <w:t>Phase4起始时间</w:t>
             </w:r>
           </w:p>
         </w:tc>
@@ -2049,7 +3412,7 @@
           </w:tcPr>
           <w:p>
             <w:r>
-              <w:t>紧随Phase3(Vis10)</w:t>
+              <w:t>55400s (紧随Phase3)</w:t>
             </w:r>
           </w:p>
         </w:tc>
@@ -2059,7 +3422,7 @@
           </w:tcPr>
           <w:p>
             <w:r>
-              <w:t>推迟至Vis12(+68min)</w:t>
+              <w:t>65360s (推迟至Vis12)</w:t>
             </w:r>
           </w:p>
         </w:tc>
@@ -2071,7 +3434,7 @@
           </w:tcPr>
           <w:p>
             <w:r>
-              <w:t>大臂提前量</w:t>
+              <w:t>遮挡导致等待</w:t>
             </w:r>
           </w:p>
         </w:tc>
@@ -2081,7 +3444,7 @@
           </w:tcPr>
           <w:p>
             <w:r>
-              <w:t>12.0h(Phase3前) ✓</w:t>
+              <w:t>0s</w:t>
             </w:r>
           </w:p>
         </w:tc>
@@ -2091,7 +3454,7 @@
           </w:tcPr>
           <w:p>
             <w:r>
-              <w:t>12.0h(Phase3前) ✓</w:t>
+              <w:t>4090s (68min)</w:t>
             </w:r>
           </w:p>
         </w:tc>
@@ -2103,7 +3466,7 @@
           </w:tcPr>
           <w:p>
             <w:r>
-              <w:t>小臂提前量</w:t>
+              <w:t>大臂提前量</w:t>
             </w:r>
           </w:p>
         </w:tc>
@@ -2113,7 +3476,7 @@
           </w:tcPr>
           <w:p>
             <w:r>
-              <w:t>5.0h(Phase4前) ✓</w:t>
+              <w:t>12.0h (43200s) ✓</w:t>
             </w:r>
           </w:p>
         </w:tc>
@@ -2123,7 +3486,7 @@
           </w:tcPr>
           <w:p>
             <w:r>
-              <w:t>4.9h(Phase4前) ✓</w:t>
+              <w:t>12.0h (43200s) ✓</w:t>
             </w:r>
           </w:p>
         </w:tc>
@@ -2135,7 +3498,7 @@
           </w:tcPr>
           <w:p>
             <w:r>
-              <w:t>任务完成</w:t>
+              <w:t>小臂提前量</w:t>
             </w:r>
           </w:p>
         </w:tc>
@@ -2145,7 +3508,7 @@
           </w:tcPr>
           <w:p>
             <w:r>
-              <w:t>07-26 21:56 BJT</w:t>
+              <w:t>5.0h (18000s) ✓</w:t>
             </w:r>
           </w:p>
         </w:tc>
@@ -2155,7 +3518,7 @@
           </w:tcPr>
           <w:p>
             <w:r>
-              <w:t>07-26 23:55 BJT</w:t>
+              <w:t>4.9h (17570s) ✓</w:t>
             </w:r>
           </w:p>
         </w:tc>
@@ -2167,6 +3530,38 @@
           </w:tcPr>
           <w:p>
             <w:r>
+              <w:t>任务完成时间</w:t>
+            </w:r>
+          </w:p>
+        </w:tc>
+        <w:tc>
+          <w:tcPr>
+            <w:tcW w:type="dxa" w:w="2880"/>
+          </w:tcPr>
+          <w:p>
+            <w:r>
+              <w:t>60990s (07-26 21:56 BJT)</w:t>
+            </w:r>
+          </w:p>
+        </w:tc>
+        <w:tc>
+          <w:tcPr>
+            <w:tcW w:type="dxa" w:w="2880"/>
+          </w:tcPr>
+          <w:p>
+            <w:r>
+              <w:t>68150s (07-26 23:55 BJT)</w:t>
+            </w:r>
+          </w:p>
+        </w:tc>
+      </w:tr>
+      <w:tr>
+        <w:tc>
+          <w:tcPr>
+            <w:tcW w:type="dxa" w:w="2880"/>
+          </w:tcPr>
+          <w:p>
+            <w:r>
               <w:t>总历时</w:t>
             </w:r>
           </w:p>
@@ -2177,7 +3572,7 @@
           </w:tcPr>
           <w:p>
             <w:r>
-              <w:t>16.9h</w:t>
+              <w:t>60990s (16.9h)</w:t>
             </w:r>
           </w:p>
         </w:tc>
@@ -2187,7 +3582,7 @@
           </w:tcPr>
           <w:p>
             <w:r>
-              <w:t>18.9h</w:t>
+              <w:t>68150s (18.9h)</w:t>
             </w:r>
           </w:p>
         </w:tc>
@@ -2196,7 +3591,7 @@
     <w:p/>
     <w:p>
       <w:r>
-        <w:t>对比分析表明：（1）算例一中Phase3至Phase5在Vis10内连续执行（总3070s&lt;窗口3290s），验证了基本调度能力；（2）算例二中SWA遮挡导致Phase4推迟68分钟至下一通信窗口，任务总历时增加约2小时，验证了约束回避能力；（3）两算例的大臂提前量均满足≥12h（相对Phase3），小臂提前量均满足≥5h（相对Phase4）。</w:t>
+        <w:t>对比分析表明：（1）算例一中Phase3至Phase5总操作时长3070s小于Vis10窗口容量3290s，在单一通信窗口内连续完成，验证了基本调度能力；（2）算例二中SWA遮挡事件[61750,62180]导致Phase4推迟4090s（约68分钟）至下一通信窗口Vis12，任务总历时从60990s增加至68150s，验证了约束回避能力；（3）两算例的大臂提前量均满足≥43200s（12h，相对Phase3），小臂提前量均满足≥18000s（5h，相对Phase4）。</w:t>
       </w:r>
     </w:p>
     <w:p>
@@ -2209,7 +3604,7 @@
     </w:p>
     <w:p>
       <w:r>
-        <w:t>本章基于统一的TLE轨道根数和规划起始时刻，设计了两组仿真算例。提前量约束的设计遵循操作规程要求：大臂重启加电在大臂运动（Phase3）前≥12小时完成，小臂重启加电在小臂运动（Phase4）前≥5小时完成。算例一验证了无遮挡冲突场景下的基本调度能力，算例二验证了SWA遮挡约束冲突下的自动回避能力，证明了基于EUROPA框架的规划算法在空间站机械臂任务规划中的有效性。</w:t>
+        <w:t>本章基于统一的TLE轨道根数和规划起始时刻（T0 = 2025-07-26 05:00 BJT），通过SGP4传播模型和DH运动学联合计算确定通信窗口和遮挡区间，设计了两组仿真算例。提前量约束遵循操作规程：大臂重启加电在大臂运动（Phase3）前≥12小时完成，小臂重启加电在小臂运动至SWA（Phase4）前≥5小时完成。算例一验证了无遮挡冲突场景下的基本调度能力，算例二验证了SWA遮挡约束冲突下的自动回避能力，证明了基于EUROPA框架的规划算法在空间站机械臂任务规划中的有效性。</w:t>
       </w:r>
     </w:p>
     <w:sectPr>

</xml_diff>

<commit_message>
Complete experiment rebuild: Phase1→Phase2→Phase3-6 ordering, NDDL models + 10 B&W charts + Word
Corrected task ordering: Phase1a(BigArm) → Phase1b(SmallArm) → Phase2(Settings) → Phase3-6
- Phase2 now executes AFTER both Phase1a and Phase1b complete
- BigArm restart ≥12h before Phase3, SmallArm restart ≥5h before Phase4

Case 1: No occ, Phase3-5 in Vis10, Phase6 in Vis11
Case 2: Occ [61750,62180] blocks Phase4 → 68min delay to Vis12

Generated: NDDL models, PlannerConfig, 10 B&W Gantt charts, Word doc with embedded figures

Co-authored-by: anion7 <anion7@users.noreply.github.com>
</commit_message>
<xml_diff>
--- a/documentation/experiment_chapter_final.docx
+++ b/documentation/experiment_chapter_final.docx
@@ -21,7 +21,21 @@
     </w:p>
     <w:p>
       <w:r>
-        <w:t>统一设定规划起始时刻T0 = 2025年7月25日21:00:00 UTC（北京时间2025年7月26日05:00:00）。通信窗口和SWA遮挡区间均基于空间站（NORAD 48274）与中继卫星（NORAD 50005）的TLE轨道根数，通过SGP4传播模型和DH运动学联合计算确定。提前量约束：大臂重启加电在大臂运动（Phase3）前≥12小时完成；小臂重启加电在小臂运动（Phase4）前≥5小时完成。</w:t>
+        <w:t>统一设定T0=2025-07-25 21:00:00 UTC（BJT 2025-07-26 05:00:00）。任务执行顺序为：Phase1a（大臂重启加电）→ Phase1b（小臂重启加电）→ Phase2（平台状态设置）→ Phase3（大臂运动）→ Phase4-5（小臂SWA操作）→ Phase6（独立设置）。大臂重启需在Phase3前≥12h完成，小臂重启需在Phase4前≥5h完成，Phase2在两项重启完成后、运动开始前执行。</w:t>
+      </w:r>
+    </w:p>
+    <w:p/>
+    <w:p>
+      <w:pPr>
+        <w:pStyle w:val="Heading2"/>
+      </w:pPr>
+      <w:r>
+        <w:t>X.2 算例一（无遮挡冲突）</w:t>
+      </w:r>
+    </w:p>
+    <w:p>
+      <w:r>
+        <w:t>Phase3在Vis10内执行，Phase4紧随Phase3在同一窗口完成，无SWA遮挡影响。</w:t>
       </w:r>
     </w:p>
     <w:p>
@@ -32,307 +46,7 @@
         <w:rPr>
           <w:b/>
         </w:rPr>
-        <w:t>表X-1 仿真基本参数</w:t>
-      </w:r>
-    </w:p>
-    <w:tbl>
-      <w:tblPr>
-        <w:tblStyle w:val="TableGrid"/>
-        <w:tblW w:type="auto" w:w="0"/>
-        <w:tblLook w:firstColumn="1" w:firstRow="1" w:lastColumn="0" w:lastRow="0" w:noHBand="0" w:noVBand="1" w:val="04A0"/>
-      </w:tblPr>
-      <w:tblGrid>
-        <w:gridCol w:w="2880"/>
-        <w:gridCol w:w="2880"/>
-        <w:gridCol w:w="2880"/>
-      </w:tblGrid>
-      <w:tr>
-        <w:tc>
-          <w:tcPr>
-            <w:tcW w:type="dxa" w:w="2880"/>
-            <w:shd w:val="clear" w:color="auto" w:fill="D9E2F3"/>
-          </w:tcPr>
-          <w:p>
-            <w:r>
-              <w:rPr>
-                <w:b/>
-              </w:rPr>
-              <w:t>参数</w:t>
-            </w:r>
-          </w:p>
-        </w:tc>
-        <w:tc>
-          <w:tcPr>
-            <w:tcW w:type="dxa" w:w="2880"/>
-            <w:shd w:val="clear" w:color="auto" w:fill="D9E2F3"/>
-          </w:tcPr>
-          <w:p>
-            <w:r>
-              <w:rPr>
-                <w:b/>
-              </w:rPr>
-              <w:t>数值</w:t>
-            </w:r>
-          </w:p>
-        </w:tc>
-        <w:tc>
-          <w:tcPr>
-            <w:tcW w:type="dxa" w:w="2880"/>
-            <w:shd w:val="clear" w:color="auto" w:fill="D9E2F3"/>
-          </w:tcPr>
-          <w:p>
-            <w:r>
-              <w:rPr>
-                <w:b/>
-              </w:rPr>
-              <w:t>说明</w:t>
-            </w:r>
-          </w:p>
-        </w:tc>
-      </w:tr>
-      <w:tr>
-        <w:tc>
-          <w:tcPr>
-            <w:tcW w:type="dxa" w:w="2880"/>
-          </w:tcPr>
-          <w:p>
-            <w:r>
-              <w:t>T0</w:t>
-            </w:r>
-          </w:p>
-        </w:tc>
-        <w:tc>
-          <w:tcPr>
-            <w:tcW w:type="dxa" w:w="2880"/>
-          </w:tcPr>
-          <w:p>
-            <w:r>
-              <w:t>2025-07-26 05:00 BJT</w:t>
-            </w:r>
-          </w:p>
-        </w:tc>
-        <w:tc>
-          <w:tcPr>
-            <w:tcW w:type="dxa" w:w="2880"/>
-          </w:tcPr>
-          <w:p>
-            <w:r>
-              <w:t>规划起始时刻(所有时间以T0为基准,单位s)</w:t>
-            </w:r>
-          </w:p>
-        </w:tc>
-      </w:tr>
-      <w:tr>
-        <w:tc>
-          <w:tcPr>
-            <w:tcW w:type="dxa" w:w="2880"/>
-          </w:tcPr>
-          <w:p>
-            <w:r>
-              <w:t>空间站</w:t>
-            </w:r>
-          </w:p>
-        </w:tc>
-        <w:tc>
-          <w:tcPr>
-            <w:tcW w:type="dxa" w:w="2880"/>
-          </w:tcPr>
-          <w:p>
-            <w:r>
-              <w:t>NORAD 48274</w:t>
-            </w:r>
-          </w:p>
-        </w:tc>
-        <w:tc>
-          <w:tcPr>
-            <w:tcW w:type="dxa" w:w="2880"/>
-          </w:tcPr>
-          <w:p>
-            <w:r>
-              <w:t>CSS天和核心舱</w:t>
-            </w:r>
-          </w:p>
-        </w:tc>
-      </w:tr>
-      <w:tr>
-        <w:tc>
-          <w:tcPr>
-            <w:tcW w:type="dxa" w:w="2880"/>
-          </w:tcPr>
-          <w:p>
-            <w:r>
-              <w:t>中继卫星</w:t>
-            </w:r>
-          </w:p>
-        </w:tc>
-        <w:tc>
-          <w:tcPr>
-            <w:tcW w:type="dxa" w:w="2880"/>
-          </w:tcPr>
-          <w:p>
-            <w:r>
-              <w:t>NORAD 50005</w:t>
-            </w:r>
-          </w:p>
-        </w:tc>
-        <w:tc>
-          <w:tcPr>
-            <w:tcW w:type="dxa" w:w="2880"/>
-          </w:tcPr>
-          <w:p>
-            <w:r>
-              <w:t>天链二号03星</w:t>
-            </w:r>
-          </w:p>
-        </w:tc>
-      </w:tr>
-      <w:tr>
-        <w:tc>
-          <w:tcPr>
-            <w:tcW w:type="dxa" w:w="2880"/>
-          </w:tcPr>
-          <w:p>
-            <w:r>
-              <w:t>通信窗口</w:t>
-            </w:r>
-          </w:p>
-        </w:tc>
-        <w:tc>
-          <w:tcPr>
-            <w:tcW w:type="dxa" w:w="2880"/>
-          </w:tcPr>
-          <w:p>
-            <w:r>
-              <w:t>~3400s可见/~2530s中断</w:t>
-            </w:r>
-          </w:p>
-        </w:tc>
-        <w:tc>
-          <w:tcPr>
-            <w:tcW w:type="dxa" w:w="2880"/>
-          </w:tcPr>
-          <w:p>
-            <w:r>
-              <w:t>SGP4+地球遮蔽视线检测,每轨道圈~5520s</w:t>
-            </w:r>
-          </w:p>
-        </w:tc>
-      </w:tr>
-      <w:tr>
-        <w:tc>
-          <w:tcPr>
-            <w:tcW w:type="dxa" w:w="2880"/>
-          </w:tcPr>
-          <w:p>
-            <w:r>
-              <w:t>遮挡判据</w:t>
-            </w:r>
-          </w:p>
-        </w:tc>
-        <w:tc>
-          <w:tcPr>
-            <w:tcW w:type="dxa" w:w="2880"/>
-          </w:tcPr>
-          <w:p>
-            <w:r>
-              <w:t>天线波束角&lt;5°</w:t>
-            </w:r>
-          </w:p>
-        </w:tc>
-        <w:tc>
-          <w:tcPr>
-            <w:tcW w:type="dxa" w:w="2880"/>
-          </w:tcPr>
-          <w:p>
-            <w:r>
-              <w:t>DH正运动学+角度准则</w:t>
-            </w:r>
-          </w:p>
-        </w:tc>
-      </w:tr>
-      <w:tr>
-        <w:tc>
-          <w:tcPr>
-            <w:tcW w:type="dxa" w:w="2880"/>
-          </w:tcPr>
-          <w:p>
-            <w:r>
-              <w:t>大臂提前量</w:t>
-            </w:r>
-          </w:p>
-        </w:tc>
-        <w:tc>
-          <w:tcPr>
-            <w:tcW w:type="dxa" w:w="2880"/>
-          </w:tcPr>
-          <w:p>
-            <w:r>
-              <w:t>≥43200s (12h)</w:t>
-            </w:r>
-          </w:p>
-        </w:tc>
-        <w:tc>
-          <w:tcPr>
-            <w:tcW w:type="dxa" w:w="2880"/>
-          </w:tcPr>
-          <w:p>
-            <w:r>
-              <w:t>大臂重启加电保温完成时刻至Phase3开始</w:t>
-            </w:r>
-          </w:p>
-        </w:tc>
-      </w:tr>
-      <w:tr>
-        <w:tc>
-          <w:tcPr>
-            <w:tcW w:type="dxa" w:w="2880"/>
-          </w:tcPr>
-          <w:p>
-            <w:r>
-              <w:t>小臂提前量</w:t>
-            </w:r>
-          </w:p>
-        </w:tc>
-        <w:tc>
-          <w:tcPr>
-            <w:tcW w:type="dxa" w:w="2880"/>
-          </w:tcPr>
-          <w:p>
-            <w:r>
-              <w:t>≥18000s (5h)</w:t>
-            </w:r>
-          </w:p>
-        </w:tc>
-        <w:tc>
-          <w:tcPr>
-            <w:tcW w:type="dxa" w:w="2880"/>
-          </w:tcPr>
-          <w:p>
-            <w:r>
-              <w:t>小臂重启加电保温完成时刻至Phase4开始</w:t>
-            </w:r>
-          </w:p>
-        </w:tc>
-      </w:tr>
-    </w:tbl>
-    <w:p/>
-    <w:p>
-      <w:pPr>
-        <w:pStyle w:val="Heading3"/>
-      </w:pPr>
-      <w:r>
-        <w:t>X.1.1 通信窗口区间</w:t>
-      </w:r>
-    </w:p>
-    <w:p>
-      <w:pPr>
-        <w:jc w:val="center"/>
-      </w:pPr>
-      <w:r>
-        <w:rPr>
-          <w:b/>
-        </w:rPr>
-        <w:t>表X-2 TLE实算通信可见窗口</w:t>
+        <w:t>表X-3 算例一（无遮挡冲突）任务规划结果</w:t>
       </w:r>
     </w:p>
     <w:tbl>
@@ -360,7 +74,7 @@
               <w:rPr>
                 <w:b/>
               </w:rPr>
-              <w:t>编号</w:t>
+              <w:t>阶段</w:t>
             </w:r>
           </w:p>
         </w:tc>
@@ -374,7 +88,7 @@
               <w:rPr>
                 <w:b/>
               </w:rPr>
-              <w:t>起始(s)</w:t>
+              <w:t>任务名称</w:t>
             </w:r>
           </w:p>
         </w:tc>
@@ -388,7 +102,21 @@
               <w:rPr>
                 <w:b/>
               </w:rPr>
-              <w:t>结束(s)</w:t>
+              <w:t>开始时间(s)</w:t>
+            </w:r>
+          </w:p>
+        </w:tc>
+        <w:tc>
+          <w:tcPr>
+            <w:tcW w:type="dxa" w:w="1440"/>
+            <w:shd w:val="clear" w:color="auto" w:fill="D9E2F3"/>
+          </w:tcPr>
+          <w:p>
+            <w:r>
+              <w:rPr>
+                <w:b/>
+              </w:rPr>
+              <w:t>结束时间(s)</w:t>
             </w:r>
           </w:p>
         </w:tc>
@@ -416,21 +144,7 @@
               <w:rPr>
                 <w:b/>
               </w:rPr>
-              <w:t>起始(BJT)</w:t>
-            </w:r>
-          </w:p>
-        </w:tc>
-        <w:tc>
-          <w:tcPr>
-            <w:tcW w:type="dxa" w:w="1440"/>
-            <w:shd w:val="clear" w:color="auto" w:fill="D9E2F3"/>
-          </w:tcPr>
-          <w:p>
-            <w:r>
-              <w:rPr>
-                <w:b/>
-              </w:rPr>
-              <w:t>结束(BJT)</w:t>
+              <w:t>约束说明</w:t>
             </w:r>
           </w:p>
         </w:tc>
@@ -442,7 +156,7 @@
           </w:tcPr>
           <w:p>
             <w:r>
-              <w:t>Vis1</w:t>
+              <w:t>1a</w:t>
             </w:r>
           </w:p>
         </w:tc>
@@ -452,7 +166,7 @@
           </w:tcPr>
           <w:p>
             <w:r>
-              <w:t>110</w:t>
+              <w:t>大臂重启加电保温</w:t>
             </w:r>
           </w:p>
         </w:tc>
@@ -462,7 +176,7 @@
           </w:tcPr>
           <w:p>
             <w:r>
-              <w:t>3580</w:t>
+              <w:t>9380</w:t>
             </w:r>
           </w:p>
         </w:tc>
@@ -472,7 +186,7 @@
           </w:tcPr>
           <w:p>
             <w:r>
-              <w:t>3470</w:t>
+              <w:t>10360</w:t>
             </w:r>
           </w:p>
         </w:tc>
@@ -482,7 +196,7 @@
           </w:tcPr>
           <w:p>
             <w:r>
-              <w:t>05:01</w:t>
+              <w:t>980</w:t>
             </w:r>
           </w:p>
         </w:tc>
@@ -492,7 +206,7 @@
           </w:tcPr>
           <w:p>
             <w:r>
-              <w:t>05:59</w:t>
+              <w:t>Phase3前12.0h</w:t>
             </w:r>
           </w:p>
         </w:tc>
@@ -504,7 +218,7 @@
           </w:tcPr>
           <w:p>
             <w:r>
-              <w:t>Vis2</w:t>
+              <w:t>1b</w:t>
             </w:r>
           </w:p>
         </w:tc>
@@ -514,307 +228,7 @@
           </w:tcPr>
           <w:p>
             <w:r>
-              <w:t>6130</w:t>
-            </w:r>
-          </w:p>
-        </w:tc>
-        <w:tc>
-          <w:tcPr>
-            <w:tcW w:type="dxa" w:w="1440"/>
-          </w:tcPr>
-          <w:p>
-            <w:r>
-              <w:t>9490</w:t>
-            </w:r>
-          </w:p>
-        </w:tc>
-        <w:tc>
-          <w:tcPr>
-            <w:tcW w:type="dxa" w:w="1440"/>
-          </w:tcPr>
-          <w:p>
-            <w:r>
-              <w:t>3360</w:t>
-            </w:r>
-          </w:p>
-        </w:tc>
-        <w:tc>
-          <w:tcPr>
-            <w:tcW w:type="dxa" w:w="1440"/>
-          </w:tcPr>
-          <w:p>
-            <w:r>
-              <w:t>06:42</w:t>
-            </w:r>
-          </w:p>
-        </w:tc>
-        <w:tc>
-          <w:tcPr>
-            <w:tcW w:type="dxa" w:w="1440"/>
-          </w:tcPr>
-          <w:p>
-            <w:r>
-              <w:t>07:38</w:t>
-            </w:r>
-          </w:p>
-        </w:tc>
-      </w:tr>
-      <w:tr>
-        <w:tc>
-          <w:tcPr>
-            <w:tcW w:type="dxa" w:w="1440"/>
-          </w:tcPr>
-          <w:p>
-            <w:r>
-              <w:t>Vis3</w:t>
-            </w:r>
-          </w:p>
-        </w:tc>
-        <w:tc>
-          <w:tcPr>
-            <w:tcW w:type="dxa" w:w="1440"/>
-          </w:tcPr>
-          <w:p>
-            <w:r>
-              <w:t>12040</w:t>
-            </w:r>
-          </w:p>
-        </w:tc>
-        <w:tc>
-          <w:tcPr>
-            <w:tcW w:type="dxa" w:w="1440"/>
-          </w:tcPr>
-          <w:p>
-            <w:r>
-              <w:t>15330</w:t>
-            </w:r>
-          </w:p>
-        </w:tc>
-        <w:tc>
-          <w:tcPr>
-            <w:tcW w:type="dxa" w:w="1440"/>
-          </w:tcPr>
-          <w:p>
-            <w:r>
-              <w:t>3290</w:t>
-            </w:r>
-          </w:p>
-        </w:tc>
-        <w:tc>
-          <w:tcPr>
-            <w:tcW w:type="dxa" w:w="1440"/>
-          </w:tcPr>
-          <w:p>
-            <w:r>
-              <w:t>08:20</w:t>
-            </w:r>
-          </w:p>
-        </w:tc>
-        <w:tc>
-          <w:tcPr>
-            <w:tcW w:type="dxa" w:w="1440"/>
-          </w:tcPr>
-          <w:p>
-            <w:r>
-              <w:t>09:15</w:t>
-            </w:r>
-          </w:p>
-        </w:tc>
-      </w:tr>
-      <w:tr>
-        <w:tc>
-          <w:tcPr>
-            <w:tcW w:type="dxa" w:w="1440"/>
-          </w:tcPr>
-          <w:p>
-            <w:r>
-              <w:t>Vis4</w:t>
-            </w:r>
-          </w:p>
-        </w:tc>
-        <w:tc>
-          <w:tcPr>
-            <w:tcW w:type="dxa" w:w="1440"/>
-          </w:tcPr>
-          <w:p>
-            <w:r>
-              <w:t>17890</w:t>
-            </w:r>
-          </w:p>
-        </w:tc>
-        <w:tc>
-          <w:tcPr>
-            <w:tcW w:type="dxa" w:w="1440"/>
-          </w:tcPr>
-          <w:p>
-            <w:r>
-              <w:t>21160</w:t>
-            </w:r>
-          </w:p>
-        </w:tc>
-        <w:tc>
-          <w:tcPr>
-            <w:tcW w:type="dxa" w:w="1440"/>
-          </w:tcPr>
-          <w:p>
-            <w:r>
-              <w:t>3270</w:t>
-            </w:r>
-          </w:p>
-        </w:tc>
-        <w:tc>
-          <w:tcPr>
-            <w:tcW w:type="dxa" w:w="1440"/>
-          </w:tcPr>
-          <w:p>
-            <w:r>
-              <w:t>09:58</w:t>
-            </w:r>
-          </w:p>
-        </w:tc>
-        <w:tc>
-          <w:tcPr>
-            <w:tcW w:type="dxa" w:w="1440"/>
-          </w:tcPr>
-          <w:p>
-            <w:r>
-              <w:t>10:52</w:t>
-            </w:r>
-          </w:p>
-        </w:tc>
-      </w:tr>
-      <w:tr>
-        <w:tc>
-          <w:tcPr>
-            <w:tcW w:type="dxa" w:w="1440"/>
-          </w:tcPr>
-          <w:p>
-            <w:r>
-              <w:t>Vis5</w:t>
-            </w:r>
-          </w:p>
-        </w:tc>
-        <w:tc>
-          <w:tcPr>
-            <w:tcW w:type="dxa" w:w="1440"/>
-          </w:tcPr>
-          <w:p>
-            <w:r>
-              <w:t>23720</w:t>
-            </w:r>
-          </w:p>
-        </w:tc>
-        <w:tc>
-          <w:tcPr>
-            <w:tcW w:type="dxa" w:w="1440"/>
-          </w:tcPr>
-          <w:p>
-            <w:r>
-              <w:t>27030</w:t>
-            </w:r>
-          </w:p>
-        </w:tc>
-        <w:tc>
-          <w:tcPr>
-            <w:tcW w:type="dxa" w:w="1440"/>
-          </w:tcPr>
-          <w:p>
-            <w:r>
-              <w:t>3310</w:t>
-            </w:r>
-          </w:p>
-        </w:tc>
-        <w:tc>
-          <w:tcPr>
-            <w:tcW w:type="dxa" w:w="1440"/>
-          </w:tcPr>
-          <w:p>
-            <w:r>
-              <w:t>11:35</w:t>
-            </w:r>
-          </w:p>
-        </w:tc>
-        <w:tc>
-          <w:tcPr>
-            <w:tcW w:type="dxa" w:w="1440"/>
-          </w:tcPr>
-          <w:p>
-            <w:r>
-              <w:t>12:30</w:t>
-            </w:r>
-          </w:p>
-        </w:tc>
-      </w:tr>
-      <w:tr>
-        <w:tc>
-          <w:tcPr>
-            <w:tcW w:type="dxa" w:w="1440"/>
-          </w:tcPr>
-          <w:p>
-            <w:r>
-              <w:t>Vis6</w:t>
-            </w:r>
-          </w:p>
-        </w:tc>
-        <w:tc>
-          <w:tcPr>
-            <w:tcW w:type="dxa" w:w="1440"/>
-          </w:tcPr>
-          <w:p>
-            <w:r>
-              <w:t>29580</w:t>
-            </w:r>
-          </w:p>
-        </w:tc>
-        <w:tc>
-          <w:tcPr>
-            <w:tcW w:type="dxa" w:w="1440"/>
-          </w:tcPr>
-          <w:p>
-            <w:r>
-              <w:t>33000</w:t>
-            </w:r>
-          </w:p>
-        </w:tc>
-        <w:tc>
-          <w:tcPr>
-            <w:tcW w:type="dxa" w:w="1440"/>
-          </w:tcPr>
-          <w:p>
-            <w:r>
-              <w:t>3420</w:t>
-            </w:r>
-          </w:p>
-        </w:tc>
-        <w:tc>
-          <w:tcPr>
-            <w:tcW w:type="dxa" w:w="1440"/>
-          </w:tcPr>
-          <w:p>
-            <w:r>
-              <w:t>13:13</w:t>
-            </w:r>
-          </w:p>
-        </w:tc>
-        <w:tc>
-          <w:tcPr>
-            <w:tcW w:type="dxa" w:w="1440"/>
-          </w:tcPr>
-          <w:p>
-            <w:r>
-              <w:t>14:10</w:t>
-            </w:r>
-          </w:p>
-        </w:tc>
-      </w:tr>
-      <w:tr>
-        <w:tc>
-          <w:tcPr>
-            <w:tcW w:type="dxa" w:w="1440"/>
-          </w:tcPr>
-          <w:p>
-            <w:r>
-              <w:t>Vis7</w:t>
+              <w:t>小臂重启加电保温</w:t>
             </w:r>
           </w:p>
         </w:tc>
@@ -834,7 +248,7 @@
           </w:tcPr>
           <w:p>
             <w:r>
-              <w:t>39060</w:t>
+              <w:t>35700</w:t>
             </w:r>
           </w:p>
         </w:tc>
@@ -844,7 +258,7 @@
           </w:tcPr>
           <w:p>
             <w:r>
-              <w:t>3510</w:t>
+              <w:t>150</w:t>
             </w:r>
           </w:p>
         </w:tc>
@@ -854,17 +268,7 @@
           </w:tcPr>
           <w:p>
             <w:r>
-              <w:t>14:52</w:t>
-            </w:r>
-          </w:p>
-        </w:tc>
-        <w:tc>
-          <w:tcPr>
-            <w:tcW w:type="dxa" w:w="1440"/>
-          </w:tcPr>
-          <w:p>
-            <w:r>
-              <w:t>15:51</w:t>
+              <w:t>Phase4前5.5h</w:t>
             </w:r>
           </w:p>
         </w:tc>
@@ -876,7 +280,7 @@
           </w:tcPr>
           <w:p>
             <w:r>
-              <w:t>Vis8</w:t>
+              <w:t>2</w:t>
             </w:r>
           </w:p>
         </w:tc>
@@ -886,7 +290,7 @@
           </w:tcPr>
           <w:p>
             <w:r>
-              <w:t>41610</w:t>
+              <w:t>平台状态设置(6项)</w:t>
             </w:r>
           </w:p>
         </w:tc>
@@ -896,7 +300,7 @@
           </w:tcPr>
           <w:p>
             <w:r>
-              <w:t>45090</w:t>
+              <w:t>35700</w:t>
             </w:r>
           </w:p>
         </w:tc>
@@ -906,7 +310,7 @@
           </w:tcPr>
           <w:p>
             <w:r>
-              <w:t>3480</w:t>
+              <w:t>39230</w:t>
             </w:r>
           </w:p>
         </w:tc>
@@ -916,7 +320,7 @@
           </w:tcPr>
           <w:p>
             <w:r>
-              <w:t>16:33</w:t>
+              <w:t>3530</w:t>
             </w:r>
           </w:p>
         </w:tc>
@@ -926,7 +330,7 @@
           </w:tcPr>
           <w:p>
             <w:r>
-              <w:t>17:31</w:t>
+              <w:t>Phase1后执行</w:t>
             </w:r>
           </w:p>
         </w:tc>
@@ -938,7 +342,7 @@
           </w:tcPr>
           <w:p>
             <w:r>
-              <w:t>Vis9</w:t>
+              <w:t>3</w:t>
             </w:r>
           </w:p>
         </w:tc>
@@ -948,59 +352,7 @@
           </w:tcPr>
           <w:p>
             <w:r>
-              <w:t>47640</w:t>
-            </w:r>
-          </w:p>
-        </w:tc>
-        <w:tc>
-          <w:tcPr>
-            <w:tcW w:type="dxa" w:w="1440"/>
-          </w:tcPr>
-          <w:p>
-            <w:r>
-              <w:t>51010</w:t>
-            </w:r>
-          </w:p>
-        </w:tc>
-        <w:tc>
-          <w:tcPr>
-            <w:tcW w:type="dxa" w:w="1440"/>
-          </w:tcPr>
-          <w:p>
-            <w:r>
-              <w:t>3370</w:t>
-            </w:r>
-          </w:p>
-        </w:tc>
-        <w:tc>
-          <w:tcPr>
-            <w:tcW w:type="dxa" w:w="1440"/>
-          </w:tcPr>
-          <w:p>
-            <w:r>
-              <w:t>18:14</w:t>
-            </w:r>
-          </w:p>
-        </w:tc>
-        <w:tc>
-          <w:tcPr>
-            <w:tcW w:type="dxa" w:w="1440"/>
-          </w:tcPr>
-          <w:p>
-            <w:r>
-              <w:t>19:10</w:t>
-            </w:r>
-          </w:p>
-        </w:tc>
-      </w:tr>
-      <w:tr>
-        <w:tc>
-          <w:tcPr>
-            <w:tcW w:type="dxa" w:w="1440"/>
-          </w:tcPr>
-          <w:p>
-            <w:r>
-              <w:t>Vis10</w:t>
+              <w:t>大臂运动至组合(5项)</w:t>
             </w:r>
           </w:p>
         </w:tc>
@@ -1020,7 +372,7 @@
           </w:tcPr>
           <w:p>
             <w:r>
-              <w:t>56850</w:t>
+              <w:t>55400</w:t>
             </w:r>
           </w:p>
         </w:tc>
@@ -1030,7 +382,7 @@
           </w:tcPr>
           <w:p>
             <w:r>
-              <w:t>3290</w:t>
+              <w:t>1840</w:t>
             </w:r>
           </w:p>
         </w:tc>
@@ -1040,17 +392,7 @@
           </w:tcPr>
           <w:p>
             <w:r>
-              <w:t>19:52</w:t>
-            </w:r>
-          </w:p>
-        </w:tc>
-        <w:tc>
-          <w:tcPr>
-            <w:tcW w:type="dxa" w:w="1440"/>
-          </w:tcPr>
-          <w:p>
-            <w:r>
-              <w:t>20:47</w:t>
+              <w:t>需通信</w:t>
             </w:r>
           </w:p>
         </w:tc>
@@ -1062,7 +404,151 @@
           </w:tcPr>
           <w:p>
             <w:r>
-              <w:t>Vis11</w:t>
+              <w:t>4</w:t>
+            </w:r>
+          </w:p>
+        </w:tc>
+        <w:tc>
+          <w:tcPr>
+            <w:tcW w:type="dxa" w:w="1440"/>
+          </w:tcPr>
+          <w:p>
+            <w:r>
+              <w:t>小臂运动至SWA(2项)</w:t>
+            </w:r>
+          </w:p>
+        </w:tc>
+        <w:tc>
+          <w:tcPr>
+            <w:tcW w:type="dxa" w:w="1440"/>
+          </w:tcPr>
+          <w:p>
+            <w:r>
+              <w:t>55400</w:t>
+            </w:r>
+          </w:p>
+        </w:tc>
+        <w:tc>
+          <w:tcPr>
+            <w:tcW w:type="dxa" w:w="1440"/>
+          </w:tcPr>
+          <w:p>
+            <w:r>
+              <w:t>56170</w:t>
+            </w:r>
+          </w:p>
+        </w:tc>
+        <w:tc>
+          <w:tcPr>
+            <w:tcW w:type="dxa" w:w="1440"/>
+          </w:tcPr>
+          <w:p>
+            <w:r>
+              <w:t>770</w:t>
+            </w:r>
+          </w:p>
+        </w:tc>
+        <w:tc>
+          <w:tcPr>
+            <w:tcW w:type="dxa" w:w="1440"/>
+          </w:tcPr>
+          <w:p>
+            <w:r>
+              <w:t>需通信+无遮挡</w:t>
+            </w:r>
+          </w:p>
+        </w:tc>
+      </w:tr>
+      <w:tr>
+        <w:tc>
+          <w:tcPr>
+            <w:tcW w:type="dxa" w:w="1440"/>
+          </w:tcPr>
+          <w:p>
+            <w:r>
+              <w:t>5</w:t>
+            </w:r>
+          </w:p>
+        </w:tc>
+        <w:tc>
+          <w:tcPr>
+            <w:tcW w:type="dxa" w:w="1440"/>
+          </w:tcPr>
+          <w:p>
+            <w:r>
+              <w:t>视觉捕获SWA(2项)</w:t>
+            </w:r>
+          </w:p>
+        </w:tc>
+        <w:tc>
+          <w:tcPr>
+            <w:tcW w:type="dxa" w:w="1440"/>
+          </w:tcPr>
+          <w:p>
+            <w:r>
+              <w:t>56170</w:t>
+            </w:r>
+          </w:p>
+        </w:tc>
+        <w:tc>
+          <w:tcPr>
+            <w:tcW w:type="dxa" w:w="1440"/>
+          </w:tcPr>
+          <w:p>
+            <w:r>
+              <w:t>56630</w:t>
+            </w:r>
+          </w:p>
+        </w:tc>
+        <w:tc>
+          <w:tcPr>
+            <w:tcW w:type="dxa" w:w="1440"/>
+          </w:tcPr>
+          <w:p>
+            <w:r>
+              <w:t>460</w:t>
+            </w:r>
+          </w:p>
+        </w:tc>
+        <w:tc>
+          <w:tcPr>
+            <w:tcW w:type="dxa" w:w="1440"/>
+          </w:tcPr>
+          <w:p>
+            <w:r>
+              <w:t>需通信+无遮挡</w:t>
+            </w:r>
+          </w:p>
+        </w:tc>
+      </w:tr>
+      <w:tr>
+        <w:tc>
+          <w:tcPr>
+            <w:tcW w:type="dxa" w:w="1440"/>
+          </w:tcPr>
+          <w:p>
+            <w:r>
+              <w:t>—</w:t>
+            </w:r>
+          </w:p>
+        </w:tc>
+        <w:tc>
+          <w:tcPr>
+            <w:tcW w:type="dxa" w:w="1440"/>
+          </w:tcPr>
+          <w:p>
+            <w:r>
+              <w:t>等待通信恢复</w:t>
+            </w:r>
+          </w:p>
+        </w:tc>
+        <w:tc>
+          <w:tcPr>
+            <w:tcW w:type="dxa" w:w="1440"/>
+          </w:tcPr>
+          <w:p>
+            <w:r>
+              <w:t>56630</w:t>
             </w:r>
           </w:p>
         </w:tc>
@@ -1082,7 +568,7 @@
           </w:tcPr>
           <w:p>
             <w:r>
-              <w:t>62870</w:t>
+              <w:t>2800</w:t>
             </w:r>
           </w:p>
         </w:tc>
@@ -1092,27 +578,7 @@
           </w:tcPr>
           <w:p>
             <w:r>
-              <w:t>3440</w:t>
-            </w:r>
-          </w:p>
-        </w:tc>
-        <w:tc>
-          <w:tcPr>
-            <w:tcW w:type="dxa" w:w="1440"/>
-          </w:tcPr>
-          <w:p>
-            <w:r>
-              <w:t>21:30</w:t>
-            </w:r>
-          </w:p>
-        </w:tc>
-        <w:tc>
-          <w:tcPr>
-            <w:tcW w:type="dxa" w:w="1440"/>
-          </w:tcPr>
-          <w:p>
-            <w:r>
-              <w:t>22:27</w:t>
+              <w:t>通信中断</w:t>
             </w:r>
           </w:p>
         </w:tc>
@@ -1124,7 +590,7 @@
           </w:tcPr>
           <w:p>
             <w:r>
-              <w:t>Vis12</w:t>
+              <w:t>6</w:t>
             </w:r>
           </w:p>
         </w:tc>
@@ -1134,7 +600,7 @@
           </w:tcPr>
           <w:p>
             <w:r>
-              <w:t>65360</w:t>
+              <w:t>小臂独立设置(6项)</w:t>
             </w:r>
           </w:p>
         </w:tc>
@@ -1144,7 +610,7 @@
           </w:tcPr>
           <w:p>
             <w:r>
-              <w:t>68830</w:t>
+              <w:t>59430</w:t>
             </w:r>
           </w:p>
         </w:tc>
@@ -1154,7 +620,7 @@
           </w:tcPr>
           <w:p>
             <w:r>
-              <w:t>3470</w:t>
+              <w:t>60990</w:t>
             </w:r>
           </w:p>
         </w:tc>
@@ -1164,7 +630,7 @@
           </w:tcPr>
           <w:p>
             <w:r>
-              <w:t>23:09</w:t>
+              <w:t>1560</w:t>
             </w:r>
           </w:p>
         </w:tc>
@@ -1174,131 +640,7 @@
           </w:tcPr>
           <w:p>
             <w:r>
-              <w:t>00:07</w:t>
-            </w:r>
-          </w:p>
-        </w:tc>
-      </w:tr>
-      <w:tr>
-        <w:tc>
-          <w:tcPr>
-            <w:tcW w:type="dxa" w:w="1440"/>
-          </w:tcPr>
-          <w:p>
-            <w:r>
-              <w:t>Vis13</w:t>
-            </w:r>
-          </w:p>
-        </w:tc>
-        <w:tc>
-          <w:tcPr>
-            <w:tcW w:type="dxa" w:w="1440"/>
-          </w:tcPr>
-          <w:p>
-            <w:r>
-              <w:t>71060</w:t>
-            </w:r>
-          </w:p>
-        </w:tc>
-        <w:tc>
-          <w:tcPr>
-            <w:tcW w:type="dxa" w:w="1440"/>
-          </w:tcPr>
-          <w:p>
-            <w:r>
-              <w:t>74570</w:t>
-            </w:r>
-          </w:p>
-        </w:tc>
-        <w:tc>
-          <w:tcPr>
-            <w:tcW w:type="dxa" w:w="1440"/>
-          </w:tcPr>
-          <w:p>
-            <w:r>
-              <w:t>3510</w:t>
-            </w:r>
-          </w:p>
-        </w:tc>
-        <w:tc>
-          <w:tcPr>
-            <w:tcW w:type="dxa" w:w="1440"/>
-          </w:tcPr>
-          <w:p>
-            <w:r>
-              <w:t>00:44</w:t>
-            </w:r>
-          </w:p>
-        </w:tc>
-        <w:tc>
-          <w:tcPr>
-            <w:tcW w:type="dxa" w:w="1440"/>
-          </w:tcPr>
-          <w:p>
-            <w:r>
-              <w:t>01:42</w:t>
-            </w:r>
-          </w:p>
-        </w:tc>
-      </w:tr>
-      <w:tr>
-        <w:tc>
-          <w:tcPr>
-            <w:tcW w:type="dxa" w:w="1440"/>
-          </w:tcPr>
-          <w:p>
-            <w:r>
-              <w:t>Vis14</w:t>
-            </w:r>
-          </w:p>
-        </w:tc>
-        <w:tc>
-          <w:tcPr>
-            <w:tcW w:type="dxa" w:w="1440"/>
-          </w:tcPr>
-          <w:p>
-            <w:r>
-              <w:t>76890</w:t>
-            </w:r>
-          </w:p>
-        </w:tc>
-        <w:tc>
-          <w:tcPr>
-            <w:tcW w:type="dxa" w:w="1440"/>
-          </w:tcPr>
-          <w:p>
-            <w:r>
-              <w:t>80370</w:t>
-            </w:r>
-          </w:p>
-        </w:tc>
-        <w:tc>
-          <w:tcPr>
-            <w:tcW w:type="dxa" w:w="1440"/>
-          </w:tcPr>
-          <w:p>
-            <w:r>
-              <w:t>3480</w:t>
-            </w:r>
-          </w:p>
-        </w:tc>
-        <w:tc>
-          <w:tcPr>
-            <w:tcW w:type="dxa" w:w="1440"/>
-          </w:tcPr>
-          <w:p>
-            <w:r>
-              <w:t>02:21</w:t>
-            </w:r>
-          </w:p>
-        </w:tc>
-        <w:tc>
-          <w:tcPr>
-            <w:tcW w:type="dxa" w:w="1440"/>
-          </w:tcPr>
-          <w:p>
-            <w:r>
-              <w:t>03:19</w:t>
+              <w:t>需通信</w:t>
             </w:r>
           </w:p>
         </w:tc>
@@ -1307,10 +649,219 @@
     <w:p/>
     <w:p>
       <w:pPr>
-        <w:pStyle w:val="Heading3"/>
+        <w:jc w:val="center"/>
       </w:pPr>
       <w:r>
-        <w:t>X.1.2 SWA遮挡区间</w:t>
+        <w:drawing>
+          <wp:inline xmlns:a="http://schemas.openxmlformats.org/drawingml/2006/main" xmlns:pic="http://schemas.openxmlformats.org/drawingml/2006/picture">
+            <wp:extent cx="5486400" cy="1541434"/>
+            <wp:docPr id="1" name="Picture 1"/>
+            <wp:cNvGraphicFramePr>
+              <a:graphicFrameLocks noChangeAspect="1"/>
+            </wp:cNvGraphicFramePr>
+            <a:graphic>
+              <a:graphicData uri="http://schemas.openxmlformats.org/drawingml/2006/picture">
+                <pic:pic>
+                  <pic:nvPicPr>
+                    <pic:cNvPr id="0" name="case1_comm_occ.png"/>
+                    <pic:cNvPicPr/>
+                  </pic:nvPicPr>
+                  <pic:blipFill>
+                    <a:blip r:embed="rId9"/>
+                    <a:stretch>
+                      <a:fillRect/>
+                    </a:stretch>
+                  </pic:blipFill>
+                  <pic:spPr>
+                    <a:xfrm>
+                      <a:off x="0" y="0"/>
+                      <a:ext cx="5486400" cy="1541434"/>
+                    </a:xfrm>
+                    <a:prstGeom prst="rect"/>
+                  </pic:spPr>
+                </pic:pic>
+              </a:graphicData>
+            </a:graphic>
+          </wp:inline>
+        </w:drawing>
+      </w:r>
+    </w:p>
+    <w:p>
+      <w:pPr>
+        <w:jc w:val="center"/>
+      </w:pPr>
+      <w:r>
+        <w:rPr>
+          <w:i/>
+        </w:rPr>
+        <w:t>图X-1 算例一（无遮挡冲突）通信窗口与SWA遮挡时间线</w:t>
+      </w:r>
+    </w:p>
+    <w:p/>
+    <w:p>
+      <w:pPr>
+        <w:jc w:val="center"/>
+      </w:pPr>
+      <w:r>
+        <w:drawing>
+          <wp:inline xmlns:a="http://schemas.openxmlformats.org/drawingml/2006/main" xmlns:pic="http://schemas.openxmlformats.org/drawingml/2006/picture">
+            <wp:extent cx="5486400" cy="1879967"/>
+            <wp:docPr id="2" name="Picture 2"/>
+            <wp:cNvGraphicFramePr>
+              <a:graphicFrameLocks noChangeAspect="1"/>
+            </wp:cNvGraphicFramePr>
+            <a:graphic>
+              <a:graphicData uri="http://schemas.openxmlformats.org/drawingml/2006/picture">
+                <pic:pic>
+                  <pic:nvPicPr>
+                    <pic:cNvPr id="0" name="case1_phase1.png"/>
+                    <pic:cNvPicPr/>
+                  </pic:nvPicPr>
+                  <pic:blipFill>
+                    <a:blip r:embed="rId10"/>
+                    <a:stretch>
+                      <a:fillRect/>
+                    </a:stretch>
+                  </pic:blipFill>
+                  <pic:spPr>
+                    <a:xfrm>
+                      <a:off x="0" y="0"/>
+                      <a:ext cx="5486400" cy="1879967"/>
+                    </a:xfrm>
+                    <a:prstGeom prst="rect"/>
+                  </pic:spPr>
+                </pic:pic>
+              </a:graphicData>
+            </a:graphic>
+          </wp:inline>
+        </w:drawing>
+      </w:r>
+    </w:p>
+    <w:p>
+      <w:pPr>
+        <w:jc w:val="center"/>
+      </w:pPr>
+      <w:r>
+        <w:rPr>
+          <w:i/>
+        </w:rPr>
+        <w:t>图X-2 算例一（无遮挡冲突）阶段一规划结果</w:t>
+      </w:r>
+    </w:p>
+    <w:p/>
+    <w:p>
+      <w:pPr>
+        <w:jc w:val="center"/>
+      </w:pPr>
+      <w:r>
+        <w:drawing>
+          <wp:inline xmlns:a="http://schemas.openxmlformats.org/drawingml/2006/main" xmlns:pic="http://schemas.openxmlformats.org/drawingml/2006/picture">
+            <wp:extent cx="5486400" cy="5222869"/>
+            <wp:docPr id="3" name="Picture 3"/>
+            <wp:cNvGraphicFramePr>
+              <a:graphicFrameLocks noChangeAspect="1"/>
+            </wp:cNvGraphicFramePr>
+            <a:graphic>
+              <a:graphicData uri="http://schemas.openxmlformats.org/drawingml/2006/picture">
+                <pic:pic>
+                  <pic:nvPicPr>
+                    <pic:cNvPr id="0" name="case1_phase2to6.png"/>
+                    <pic:cNvPicPr/>
+                  </pic:nvPicPr>
+                  <pic:blipFill>
+                    <a:blip r:embed="rId11"/>
+                    <a:stretch>
+                      <a:fillRect/>
+                    </a:stretch>
+                  </pic:blipFill>
+                  <pic:spPr>
+                    <a:xfrm>
+                      <a:off x="0" y="0"/>
+                      <a:ext cx="5486400" cy="5222869"/>
+                    </a:xfrm>
+                    <a:prstGeom prst="rect"/>
+                  </pic:spPr>
+                </pic:pic>
+              </a:graphicData>
+            </a:graphic>
+          </wp:inline>
+        </w:drawing>
+      </w:r>
+    </w:p>
+    <w:p>
+      <w:pPr>
+        <w:jc w:val="center"/>
+      </w:pPr>
+      <w:r>
+        <w:rPr>
+          <w:i/>
+        </w:rPr>
+        <w:t>图X-3 算例一（无遮挡冲突）阶段二至六规划结果（含局部放大）</w:t>
+      </w:r>
+    </w:p>
+    <w:p/>
+    <w:p>
+      <w:pPr>
+        <w:jc w:val="center"/>
+      </w:pPr>
+      <w:r>
+        <w:drawing>
+          <wp:inline xmlns:a="http://schemas.openxmlformats.org/drawingml/2006/main" xmlns:pic="http://schemas.openxmlformats.org/drawingml/2006/picture">
+            <wp:extent cx="5486400" cy="2420020"/>
+            <wp:docPr id="4" name="Picture 4"/>
+            <wp:cNvGraphicFramePr>
+              <a:graphicFrameLocks noChangeAspect="1"/>
+            </wp:cNvGraphicFramePr>
+            <a:graphic>
+              <a:graphicData uri="http://schemas.openxmlformats.org/drawingml/2006/picture">
+                <pic:pic>
+                  <pic:nvPicPr>
+                    <pic:cNvPr id="0" name="case1_overall.png"/>
+                    <pic:cNvPicPr/>
+                  </pic:nvPicPr>
+                  <pic:blipFill>
+                    <a:blip r:embed="rId12"/>
+                    <a:stretch>
+                      <a:fillRect/>
+                    </a:stretch>
+                  </pic:blipFill>
+                  <pic:spPr>
+                    <a:xfrm>
+                      <a:off x="0" y="0"/>
+                      <a:ext cx="5486400" cy="2420020"/>
+                    </a:xfrm>
+                    <a:prstGeom prst="rect"/>
+                  </pic:spPr>
+                </pic:pic>
+              </a:graphicData>
+            </a:graphic>
+          </wp:inline>
+        </w:drawing>
+      </w:r>
+    </w:p>
+    <w:p>
+      <w:pPr>
+        <w:jc w:val="center"/>
+      </w:pPr>
+      <w:r>
+        <w:rPr>
+          <w:i/>
+        </w:rPr>
+        <w:t>图X-4 算例一（无遮挡冲突）全任务规划总图</w:t>
+      </w:r>
+    </w:p>
+    <w:p/>
+    <w:p>
+      <w:pPr>
+        <w:pStyle w:val="Heading2"/>
+      </w:pPr>
+      <w:r>
+        <w:t>X.3 算例二（遮挡冲突）</w:t>
+      </w:r>
+    </w:p>
+    <w:p>
+      <w:r>
+        <w:t>Phase3在Vis11内执行。遮挡事件[61750,62180]阻断Phase4，规划器将Phase4推迟至Vis12，等待4090s（68min）。</w:t>
       </w:r>
     </w:p>
     <w:p>
@@ -1321,7 +872,7 @@
         <w:rPr>
           <w:b/>
         </w:rPr>
-        <w:t>表X-3 TLE实算SWA遮挡区间</w:t>
+        <w:t>表X-4 算例二（遮挡冲突）任务规划结果</w:t>
       </w:r>
     </w:p>
     <w:tbl>
@@ -1349,7 +900,7 @@
               <w:rPr>
                 <w:b/>
               </w:rPr>
-              <w:t>起始(s)</w:t>
+              <w:t>阶段</w:t>
             </w:r>
           </w:p>
         </w:tc>
@@ -1363,7 +914,35 @@
               <w:rPr>
                 <w:b/>
               </w:rPr>
-              <w:t>结束(s)</w:t>
+              <w:t>任务名称</w:t>
+            </w:r>
+          </w:p>
+        </w:tc>
+        <w:tc>
+          <w:tcPr>
+            <w:tcW w:type="dxa" w:w="1440"/>
+            <w:shd w:val="clear" w:color="auto" w:fill="D9E2F3"/>
+          </w:tcPr>
+          <w:p>
+            <w:r>
+              <w:rPr>
+                <w:b/>
+              </w:rPr>
+              <w:t>开始时间(s)</w:t>
+            </w:r>
+          </w:p>
+        </w:tc>
+        <w:tc>
+          <w:tcPr>
+            <w:tcW w:type="dxa" w:w="1440"/>
+            <w:shd w:val="clear" w:color="auto" w:fill="D9E2F3"/>
+          </w:tcPr>
+          <w:p>
+            <w:r>
+              <w:rPr>
+                <w:b/>
+              </w:rPr>
+              <w:t>结束时间(s)</w:t>
             </w:r>
           </w:p>
         </w:tc>
@@ -1391,35 +970,7 @@
               <w:rPr>
                 <w:b/>
               </w:rPr>
-              <w:t>起始(BJT)</w:t>
-            </w:r>
-          </w:p>
-        </w:tc>
-        <w:tc>
-          <w:tcPr>
-            <w:tcW w:type="dxa" w:w="1440"/>
-            <w:shd w:val="clear" w:color="auto" w:fill="D9E2F3"/>
-          </w:tcPr>
-          <w:p>
-            <w:r>
-              <w:rPr>
-                <w:b/>
-              </w:rPr>
-              <w:t>结束(BJT)</w:t>
-            </w:r>
-          </w:p>
-        </w:tc>
-        <w:tc>
-          <w:tcPr>
-            <w:tcW w:type="dxa" w:w="1440"/>
-            <w:shd w:val="clear" w:color="auto" w:fill="D9E2F3"/>
-          </w:tcPr>
-          <w:p>
-            <w:r>
-              <w:rPr>
-                <w:b/>
-              </w:rPr>
-              <w:t>状态</w:t>
+              <w:t>约束说明</w:t>
             </w:r>
           </w:p>
         </w:tc>
@@ -1431,7 +982,7 @@
           </w:tcPr>
           <w:p>
             <w:r>
-              <w:t>0</w:t>
+              <w:t>1a</w:t>
             </w:r>
           </w:p>
         </w:tc>
@@ -1441,7 +992,7 @@
           </w:tcPr>
           <w:p>
             <w:r>
-              <w:t>61750</w:t>
+              <w:t>大臂重启加电保温</w:t>
             </w:r>
           </w:p>
         </w:tc>
@@ -1451,7 +1002,7 @@
           </w:tcPr>
           <w:p>
             <w:r>
-              <w:t>61750</w:t>
+              <w:t>15250</w:t>
             </w:r>
           </w:p>
         </w:tc>
@@ -1461,7 +1012,7 @@
           </w:tcPr>
           <w:p>
             <w:r>
-              <w:t>05:00</w:t>
+              <w:t>16230</w:t>
             </w:r>
           </w:p>
         </w:tc>
@@ -1471,7 +1022,7 @@
           </w:tcPr>
           <w:p>
             <w:r>
-              <w:t>22:09</w:t>
+              <w:t>980</w:t>
             </w:r>
           </w:p>
         </w:tc>
@@ -1481,7 +1032,7 @@
           </w:tcPr>
           <w:p>
             <w:r>
-              <w:t>不活跃</w:t>
+              <w:t>Phase3前12.0h</w:t>
             </w:r>
           </w:p>
         </w:tc>
@@ -1493,7 +1044,7 @@
           </w:tcPr>
           <w:p>
             <w:r>
-              <w:t>61750</w:t>
+              <w:t>1b</w:t>
             </w:r>
           </w:p>
         </w:tc>
@@ -1503,7 +1054,7 @@
           </w:tcPr>
           <w:p>
             <w:r>
-              <w:t>62180</w:t>
+              <w:t>小臂重启加电保温</w:t>
             </w:r>
           </w:p>
         </w:tc>
@@ -1513,7 +1064,7 @@
           </w:tcPr>
           <w:p>
             <w:r>
-              <w:t>430</w:t>
+              <w:t>47640</w:t>
             </w:r>
           </w:p>
         </w:tc>
@@ -1523,7 +1074,7 @@
           </w:tcPr>
           <w:p>
             <w:r>
-              <w:t>22:09</w:t>
+              <w:t>47790</w:t>
             </w:r>
           </w:p>
         </w:tc>
@@ -1533,7 +1084,7 @@
           </w:tcPr>
           <w:p>
             <w:r>
-              <w:t>22:16</w:t>
+              <w:t>150</w:t>
             </w:r>
           </w:p>
         </w:tc>
@@ -1543,7 +1094,7 @@
           </w:tcPr>
           <w:p>
             <w:r>
-              <w:t>活跃</w:t>
+              <w:t>Phase4前4.9h</w:t>
             </w:r>
           </w:p>
         </w:tc>
@@ -1555,7 +1106,7 @@
           </w:tcPr>
           <w:p>
             <w:r>
-              <w:t>62180</w:t>
+              <w:t>2</w:t>
             </w:r>
           </w:p>
         </w:tc>
@@ -1565,7 +1116,7 @@
           </w:tcPr>
           <w:p>
             <w:r>
-              <w:t>75450</w:t>
+              <w:t>平台状态设置(6项)</w:t>
             </w:r>
           </w:p>
         </w:tc>
@@ -1575,7 +1126,7 @@
           </w:tcPr>
           <w:p>
             <w:r>
-              <w:t>13270</w:t>
+              <w:t>47790</w:t>
             </w:r>
           </w:p>
         </w:tc>
@@ -1585,7 +1136,7 @@
           </w:tcPr>
           <w:p>
             <w:r>
-              <w:t>22:16</w:t>
+              <w:t>51320</w:t>
             </w:r>
           </w:p>
         </w:tc>
@@ -1595,7 +1146,7 @@
           </w:tcPr>
           <w:p>
             <w:r>
-              <w:t>01:57</w:t>
+              <w:t>3530</w:t>
             </w:r>
           </w:p>
         </w:tc>
@@ -1605,7 +1156,7 @@
           </w:tcPr>
           <w:p>
             <w:r>
-              <w:t>不活跃</w:t>
+              <w:t>Phase1后执行</w:t>
             </w:r>
           </w:p>
         </w:tc>
@@ -1617,7 +1168,7 @@
           </w:tcPr>
           <w:p>
             <w:r>
-              <w:t>75450</w:t>
+              <w:t>3</w:t>
             </w:r>
           </w:p>
         </w:tc>
@@ -1627,7 +1178,7 @@
           </w:tcPr>
           <w:p>
             <w:r>
-              <w:t>76110</w:t>
+              <w:t>大臂运动至组合(5项)</w:t>
             </w:r>
           </w:p>
         </w:tc>
@@ -1637,7 +1188,7 @@
           </w:tcPr>
           <w:p>
             <w:r>
-              <w:t>660</w:t>
+              <w:t>59430</w:t>
             </w:r>
           </w:p>
         </w:tc>
@@ -1647,7 +1198,7 @@
           </w:tcPr>
           <w:p>
             <w:r>
-              <w:t>01:57</w:t>
+              <w:t>61270</w:t>
             </w:r>
           </w:p>
         </w:tc>
@@ -1657,7 +1208,7 @@
           </w:tcPr>
           <w:p>
             <w:r>
-              <w:t>02:08</w:t>
+              <w:t>1840</w:t>
             </w:r>
           </w:p>
         </w:tc>
@@ -1667,148 +1218,7 @@
           </w:tcPr>
           <w:p>
             <w:r>
-              <w:t>活跃</w:t>
-            </w:r>
-          </w:p>
-        </w:tc>
-      </w:tr>
-    </w:tbl>
-    <w:p/>
-    <w:p>
-      <w:pPr>
-        <w:pStyle w:val="Heading2"/>
-      </w:pPr>
-      <w:r>
-        <w:t>X.2 算例一：无遮挡冲突场景</w:t>
-      </w:r>
-    </w:p>
-    <w:p>
-      <w:r>
-        <w:t>算例一选择Phase3（大臂运动）在通信窗口Vis10 [53560, 56850]内执行，Phase4紧随Phase3在同一窗口内完成。该时段无SWA遮挡事件影响，Phase3至Phase5连续执行。Phase6因通信中断（Vis10结束后的间隙）推迟至Vis11执行。</w:t>
-      </w:r>
-    </w:p>
-    <w:p>
-      <w:pPr>
-        <w:jc w:val="center"/>
-      </w:pPr>
-      <w:r>
-        <w:rPr>
-          <w:b/>
-        </w:rPr>
-        <w:t>表X-4 算例一任务规划结果</w:t>
-      </w:r>
-    </w:p>
-    <w:tbl>
-      <w:tblPr>
-        <w:tblStyle w:val="TableGrid"/>
-        <w:tblW w:type="auto" w:w="0"/>
-        <w:tblLook w:firstColumn="1" w:firstRow="1" w:lastColumn="0" w:lastRow="0" w:noHBand="0" w:noVBand="1" w:val="04A0"/>
-      </w:tblPr>
-      <w:tblGrid>
-        <w:gridCol w:w="1234"/>
-        <w:gridCol w:w="1234"/>
-        <w:gridCol w:w="1234"/>
-        <w:gridCol w:w="1234"/>
-        <w:gridCol w:w="1234"/>
-        <w:gridCol w:w="1234"/>
-        <w:gridCol w:w="1234"/>
-      </w:tblGrid>
-      <w:tr>
-        <w:tc>
-          <w:tcPr>
-            <w:tcW w:type="dxa" w:w="1234"/>
-            <w:shd w:val="clear" w:color="auto" w:fill="D9E2F3"/>
-          </w:tcPr>
-          <w:p>
-            <w:r>
-              <w:rPr>
-                <w:b/>
-              </w:rPr>
-              <w:t>阶段</w:t>
-            </w:r>
-          </w:p>
-        </w:tc>
-        <w:tc>
-          <w:tcPr>
-            <w:tcW w:type="dxa" w:w="1234"/>
-            <w:shd w:val="clear" w:color="auto" w:fill="D9E2F3"/>
-          </w:tcPr>
-          <w:p>
-            <w:r>
-              <w:rPr>
-                <w:b/>
-              </w:rPr>
-              <w:t>任务名称</w:t>
-            </w:r>
-          </w:p>
-        </w:tc>
-        <w:tc>
-          <w:tcPr>
-            <w:tcW w:type="dxa" w:w="1234"/>
-            <w:shd w:val="clear" w:color="auto" w:fill="D9E2F3"/>
-          </w:tcPr>
-          <w:p>
-            <w:r>
-              <w:rPr>
-                <w:b/>
-              </w:rPr>
-              <w:t>开始时间(s)</w:t>
-            </w:r>
-          </w:p>
-        </w:tc>
-        <w:tc>
-          <w:tcPr>
-            <w:tcW w:type="dxa" w:w="1234"/>
-            <w:shd w:val="clear" w:color="auto" w:fill="D9E2F3"/>
-          </w:tcPr>
-          <w:p>
-            <w:r>
-              <w:rPr>
-                <w:b/>
-              </w:rPr>
-              <w:t>结束时间(s)</w:t>
-            </w:r>
-          </w:p>
-        </w:tc>
-        <w:tc>
-          <w:tcPr>
-            <w:tcW w:type="dxa" w:w="1234"/>
-            <w:shd w:val="clear" w:color="auto" w:fill="D9E2F3"/>
-          </w:tcPr>
-          <w:p>
-            <w:r>
-              <w:rPr>
-                <w:b/>
-              </w:rPr>
-              <w:t>时长(s)</w:t>
-            </w:r>
-          </w:p>
-        </w:tc>
-        <w:tc>
-          <w:tcPr>
-            <w:tcW w:type="dxa" w:w="1234"/>
-            <w:shd w:val="clear" w:color="auto" w:fill="D9E2F3"/>
-          </w:tcPr>
-          <w:p>
-            <w:r>
-              <w:rPr>
-                <w:b/>
-              </w:rPr>
-              <w:t>通信窗口</w:t>
-            </w:r>
-          </w:p>
-        </w:tc>
-        <w:tc>
-          <w:tcPr>
-            <w:tcW w:type="dxa" w:w="1234"/>
-            <w:shd w:val="clear" w:color="auto" w:fill="D9E2F3"/>
-          </w:tcPr>
-          <w:p>
-            <w:r>
-              <w:rPr>
-                <w:b/>
-              </w:rPr>
-              <w:t>约束说明</w:t>
+              <w:t>需通信</w:t>
             </w:r>
           </w:p>
         </w:tc>
@@ -1816,223 +1226,7 @@
       <w:tr>
         <w:tc>
           <w:tcPr>
-            <w:tcW w:type="dxa" w:w="1234"/>
-          </w:tcPr>
-          <w:p>
-            <w:r>
-              <w:t>1a</w:t>
-            </w:r>
-          </w:p>
-        </w:tc>
-        <w:tc>
-          <w:tcPr>
-            <w:tcW w:type="dxa" w:w="1234"/>
-          </w:tcPr>
-          <w:p>
-            <w:r>
-              <w:t>大臂重启加电保温</w:t>
-            </w:r>
-          </w:p>
-        </w:tc>
-        <w:tc>
-          <w:tcPr>
-            <w:tcW w:type="dxa" w:w="1234"/>
-          </w:tcPr>
-          <w:p>
-            <w:r>
-              <w:t>9380</w:t>
-            </w:r>
-          </w:p>
-        </w:tc>
-        <w:tc>
-          <w:tcPr>
-            <w:tcW w:type="dxa" w:w="1234"/>
-          </w:tcPr>
-          <w:p>
-            <w:r>
-              <w:t>10360</w:t>
-            </w:r>
-          </w:p>
-        </w:tc>
-        <w:tc>
-          <w:tcPr>
-            <w:tcW w:type="dxa" w:w="1234"/>
-          </w:tcPr>
-          <w:p>
-            <w:r>
-              <w:t>980</w:t>
-            </w:r>
-          </w:p>
-        </w:tc>
-        <w:tc>
-          <w:tcPr>
-            <w:tcW w:type="dxa" w:w="1234"/>
-          </w:tcPr>
-          <w:p>
-            <w:r>
-              <w:t>Vis2</w:t>
-            </w:r>
-          </w:p>
-        </w:tc>
-        <w:tc>
-          <w:tcPr>
-            <w:tcW w:type="dxa" w:w="1234"/>
-          </w:tcPr>
-          <w:p>
-            <w:r>
-              <w:t>Phase3前12.0h (10360→53560)</w:t>
-            </w:r>
-          </w:p>
-        </w:tc>
-      </w:tr>
-      <w:tr>
-        <w:tc>
-          <w:tcPr>
-            <w:tcW w:type="dxa" w:w="1234"/>
-          </w:tcPr>
-          <w:p>
-            <w:r>
-              <w:t>1b</w:t>
-            </w:r>
-          </w:p>
-        </w:tc>
-        <w:tc>
-          <w:tcPr>
-            <w:tcW w:type="dxa" w:w="1234"/>
-          </w:tcPr>
-          <w:p>
-            <w:r>
-              <w:t>小臂重启加电保温</w:t>
-            </w:r>
-          </w:p>
-        </w:tc>
-        <w:tc>
-          <w:tcPr>
-            <w:tcW w:type="dxa" w:w="1234"/>
-          </w:tcPr>
-          <w:p>
-            <w:r>
-              <w:t>37250</w:t>
-            </w:r>
-          </w:p>
-        </w:tc>
-        <w:tc>
-          <w:tcPr>
-            <w:tcW w:type="dxa" w:w="1234"/>
-          </w:tcPr>
-          <w:p>
-            <w:r>
-              <w:t>37400</w:t>
-            </w:r>
-          </w:p>
-        </w:tc>
-        <w:tc>
-          <w:tcPr>
-            <w:tcW w:type="dxa" w:w="1234"/>
-          </w:tcPr>
-          <w:p>
-            <w:r>
-              <w:t>150</w:t>
-            </w:r>
-          </w:p>
-        </w:tc>
-        <w:tc>
-          <w:tcPr>
-            <w:tcW w:type="dxa" w:w="1234"/>
-          </w:tcPr>
-          <w:p>
-            <w:r>
-              <w:t>Vis7</w:t>
-            </w:r>
-          </w:p>
-        </w:tc>
-        <w:tc>
-          <w:tcPr>
-            <w:tcW w:type="dxa" w:w="1234"/>
-          </w:tcPr>
-          <w:p>
-            <w:r>
-              <w:t>Phase4前5.0h (37400→55400)</w:t>
-            </w:r>
-          </w:p>
-        </w:tc>
-      </w:tr>
-      <w:tr>
-        <w:tc>
-          <w:tcPr>
-            <w:tcW w:type="dxa" w:w="1234"/>
-          </w:tcPr>
-          <w:p>
-            <w:r>
-              <w:t>2</w:t>
-            </w:r>
-          </w:p>
-        </w:tc>
-        <w:tc>
-          <w:tcPr>
-            <w:tcW w:type="dxa" w:w="1234"/>
-          </w:tcPr>
-          <w:p>
-            <w:r>
-              <w:t>平台状态设置(6项)</w:t>
-            </w:r>
-          </w:p>
-        </w:tc>
-        <w:tc>
-          <w:tcPr>
-            <w:tcW w:type="dxa" w:w="1234"/>
-          </w:tcPr>
-          <w:p>
-            <w:r>
-              <w:t>6130</w:t>
-            </w:r>
-          </w:p>
-        </w:tc>
-        <w:tc>
-          <w:tcPr>
-            <w:tcW w:type="dxa" w:w="1234"/>
-          </w:tcPr>
-          <w:p>
-            <w:r>
-              <w:t>9660</w:t>
-            </w:r>
-          </w:p>
-        </w:tc>
-        <w:tc>
-          <w:tcPr>
-            <w:tcW w:type="dxa" w:w="1234"/>
-          </w:tcPr>
-          <w:p>
-            <w:r>
-              <w:t>3530</w:t>
-            </w:r>
-          </w:p>
-        </w:tc>
-        <w:tc>
-          <w:tcPr>
-            <w:tcW w:type="dxa" w:w="1234"/>
-          </w:tcPr>
-          <w:p>
-            <w:r>
-              <w:t>Vis2</w:t>
-            </w:r>
-          </w:p>
-        </w:tc>
-        <w:tc>
-          <w:tcPr>
-            <w:tcW w:type="dxa" w:w="1234"/>
-          </w:tcPr>
-          <w:p>
-            <w:r>
-              <w:t>—</w:t>
-            </w:r>
-          </w:p>
-        </w:tc>
-      </w:tr>
-      <w:tr>
-        <w:tc>
-          <w:tcPr>
-            <w:tcW w:type="dxa" w:w="1234"/>
+            <w:tcW w:type="dxa" w:w="1440"/>
           </w:tcPr>
           <w:p>
             <w:r>
@@ -2042,61 +1236,51 @@
         </w:tc>
         <w:tc>
           <w:tcPr>
-            <w:tcW w:type="dxa" w:w="1234"/>
+            <w:tcW w:type="dxa" w:w="1440"/>
           </w:tcPr>
           <w:p>
             <w:r>
-              <w:t>等待运动窗口</w:t>
+              <w:t>等待(遮挡+通信)</w:t>
             </w:r>
           </w:p>
         </w:tc>
         <w:tc>
           <w:tcPr>
-            <w:tcW w:type="dxa" w:w="1234"/>
+            <w:tcW w:type="dxa" w:w="1440"/>
           </w:tcPr>
           <w:p>
             <w:r>
-              <w:t>9660</w:t>
+              <w:t>61270</w:t>
             </w:r>
           </w:p>
         </w:tc>
         <w:tc>
           <w:tcPr>
-            <w:tcW w:type="dxa" w:w="1234"/>
+            <w:tcW w:type="dxa" w:w="1440"/>
           </w:tcPr>
           <w:p>
             <w:r>
-              <w:t>53560</w:t>
+              <w:t>65360</w:t>
             </w:r>
           </w:p>
         </w:tc>
         <w:tc>
           <w:tcPr>
-            <w:tcW w:type="dxa" w:w="1234"/>
+            <w:tcW w:type="dxa" w:w="1440"/>
           </w:tcPr>
           <w:p>
             <w:r>
-              <w:t>43900</w:t>
+              <w:t>4090</w:t>
             </w:r>
           </w:p>
         </w:tc>
         <w:tc>
           <w:tcPr>
-            <w:tcW w:type="dxa" w:w="1234"/>
+            <w:tcW w:type="dxa" w:w="1440"/>
           </w:tcPr>
           <w:p>
             <w:r>
-              <w:t>—</w:t>
-            </w:r>
-          </w:p>
-        </w:tc>
-        <w:tc>
-          <w:tcPr>
-            <w:tcW w:type="dxa" w:w="1234"/>
-          </w:tcPr>
-          <w:p>
-            <w:r>
-              <w:t>—</w:t>
+              <w:t>遮挡阻断</w:t>
             </w:r>
           </w:p>
         </w:tc>
@@ -2104,79 +1288,7 @@
       <w:tr>
         <w:tc>
           <w:tcPr>
-            <w:tcW w:type="dxa" w:w="1234"/>
-          </w:tcPr>
-          <w:p>
-            <w:r>
-              <w:t>3</w:t>
-            </w:r>
-          </w:p>
-        </w:tc>
-        <w:tc>
-          <w:tcPr>
-            <w:tcW w:type="dxa" w:w="1234"/>
-          </w:tcPr>
-          <w:p>
-            <w:r>
-              <w:t>大臂运动至组合构型(5项)</w:t>
-            </w:r>
-          </w:p>
-        </w:tc>
-        <w:tc>
-          <w:tcPr>
-            <w:tcW w:type="dxa" w:w="1234"/>
-          </w:tcPr>
-          <w:p>
-            <w:r>
-              <w:t>53560</w:t>
-            </w:r>
-          </w:p>
-        </w:tc>
-        <w:tc>
-          <w:tcPr>
-            <w:tcW w:type="dxa" w:w="1234"/>
-          </w:tcPr>
-          <w:p>
-            <w:r>
-              <w:t>55400</w:t>
-            </w:r>
-          </w:p>
-        </w:tc>
-        <w:tc>
-          <w:tcPr>
-            <w:tcW w:type="dxa" w:w="1234"/>
-          </w:tcPr>
-          <w:p>
-            <w:r>
-              <w:t>1840</w:t>
-            </w:r>
-          </w:p>
-        </w:tc>
-        <w:tc>
-          <w:tcPr>
-            <w:tcW w:type="dxa" w:w="1234"/>
-          </w:tcPr>
-          <w:p>
-            <w:r>
-              <w:t>Vis10</w:t>
-            </w:r>
-          </w:p>
-        </w:tc>
-        <w:tc>
-          <w:tcPr>
-            <w:tcW w:type="dxa" w:w="1234"/>
-          </w:tcPr>
-          <w:p>
-            <w:r>
-              <w:t>—</w:t>
-            </w:r>
-          </w:p>
-        </w:tc>
-      </w:tr>
-      <w:tr>
-        <w:tc>
-          <w:tcPr>
-            <w:tcW w:type="dxa" w:w="1234"/>
+            <w:tcW w:type="dxa" w:w="1440"/>
           </w:tcPr>
           <w:p>
             <w:r>
@@ -2186,7 +1298,7 @@
         </w:tc>
         <w:tc>
           <w:tcPr>
-            <w:tcW w:type="dxa" w:w="1234"/>
+            <w:tcW w:type="dxa" w:w="1440"/>
           </w:tcPr>
           <w:p>
             <w:r>
@@ -2196,27 +1308,27 @@
         </w:tc>
         <w:tc>
           <w:tcPr>
-            <w:tcW w:type="dxa" w:w="1234"/>
+            <w:tcW w:type="dxa" w:w="1440"/>
           </w:tcPr>
           <w:p>
             <w:r>
-              <w:t>55400</w:t>
+              <w:t>65360</w:t>
             </w:r>
           </w:p>
         </w:tc>
         <w:tc>
           <w:tcPr>
-            <w:tcW w:type="dxa" w:w="1234"/>
+            <w:tcW w:type="dxa" w:w="1440"/>
           </w:tcPr>
           <w:p>
             <w:r>
-              <w:t>56170</w:t>
+              <w:t>66130</w:t>
             </w:r>
           </w:p>
         </w:tc>
         <w:tc>
           <w:tcPr>
-            <w:tcW w:type="dxa" w:w="1234"/>
+            <w:tcW w:type="dxa" w:w="1440"/>
           </w:tcPr>
           <w:p>
             <w:r>
@@ -2226,21 +1338,11 @@
         </w:tc>
         <w:tc>
           <w:tcPr>
-            <w:tcW w:type="dxa" w:w="1234"/>
+            <w:tcW w:type="dxa" w:w="1440"/>
           </w:tcPr>
           <w:p>
             <w:r>
-              <w:t>Vis10</w:t>
-            </w:r>
-          </w:p>
-        </w:tc>
-        <w:tc>
-          <w:tcPr>
-            <w:tcW w:type="dxa" w:w="1234"/>
-          </w:tcPr>
-          <w:p>
-            <w:r>
-              <w:t>无遮挡影响</w:t>
+              <w:t>需通信+无遮挡</w:t>
             </w:r>
           </w:p>
         </w:tc>
@@ -2248,7 +1350,7 @@
       <w:tr>
         <w:tc>
           <w:tcPr>
-            <w:tcW w:type="dxa" w:w="1234"/>
+            <w:tcW w:type="dxa" w:w="1440"/>
           </w:tcPr>
           <w:p>
             <w:r>
@@ -2258,7 +1360,7 @@
         </w:tc>
         <w:tc>
           <w:tcPr>
-            <w:tcW w:type="dxa" w:w="1234"/>
+            <w:tcW w:type="dxa" w:w="1440"/>
           </w:tcPr>
           <w:p>
             <w:r>
@@ -2268,27 +1370,27 @@
         </w:tc>
         <w:tc>
           <w:tcPr>
-            <w:tcW w:type="dxa" w:w="1234"/>
+            <w:tcW w:type="dxa" w:w="1440"/>
           </w:tcPr>
           <w:p>
             <w:r>
-              <w:t>56170</w:t>
+              <w:t>66130</w:t>
             </w:r>
           </w:p>
         </w:tc>
         <w:tc>
           <w:tcPr>
-            <w:tcW w:type="dxa" w:w="1234"/>
+            <w:tcW w:type="dxa" w:w="1440"/>
           </w:tcPr>
           <w:p>
             <w:r>
-              <w:t>56630</w:t>
+              <w:t>66590</w:t>
             </w:r>
           </w:p>
         </w:tc>
         <w:tc>
           <w:tcPr>
-            <w:tcW w:type="dxa" w:w="1234"/>
+            <w:tcW w:type="dxa" w:w="1440"/>
           </w:tcPr>
           <w:p>
             <w:r>
@@ -2298,21 +1400,11 @@
         </w:tc>
         <w:tc>
           <w:tcPr>
-            <w:tcW w:type="dxa" w:w="1234"/>
+            <w:tcW w:type="dxa" w:w="1440"/>
           </w:tcPr>
           <w:p>
             <w:r>
-              <w:t>Vis10</w:t>
-            </w:r>
-          </w:p>
-        </w:tc>
-        <w:tc>
-          <w:tcPr>
-            <w:tcW w:type="dxa" w:w="1234"/>
-          </w:tcPr>
-          <w:p>
-            <w:r>
-              <w:t>无遮挡影响</w:t>
+              <w:t>需通信+无遮挡</w:t>
             </w:r>
           </w:p>
         </w:tc>
@@ -2320,79 +1412,7 @@
       <w:tr>
         <w:tc>
           <w:tcPr>
-            <w:tcW w:type="dxa" w:w="1234"/>
-          </w:tcPr>
-          <w:p>
-            <w:r>
-              <w:t>—</w:t>
-            </w:r>
-          </w:p>
-        </w:tc>
-        <w:tc>
-          <w:tcPr>
-            <w:tcW w:type="dxa" w:w="1234"/>
-          </w:tcPr>
-          <w:p>
-            <w:r>
-              <w:t>等待通信恢复</w:t>
-            </w:r>
-          </w:p>
-        </w:tc>
-        <w:tc>
-          <w:tcPr>
-            <w:tcW w:type="dxa" w:w="1234"/>
-          </w:tcPr>
-          <w:p>
-            <w:r>
-              <w:t>56630</w:t>
-            </w:r>
-          </w:p>
-        </w:tc>
-        <w:tc>
-          <w:tcPr>
-            <w:tcW w:type="dxa" w:w="1234"/>
-          </w:tcPr>
-          <w:p>
-            <w:r>
-              <w:t>59430</w:t>
-            </w:r>
-          </w:p>
-        </w:tc>
-        <w:tc>
-          <w:tcPr>
-            <w:tcW w:type="dxa" w:w="1234"/>
-          </w:tcPr>
-          <w:p>
-            <w:r>
-              <w:t>2800</w:t>
-            </w:r>
-          </w:p>
-        </w:tc>
-        <w:tc>
-          <w:tcPr>
-            <w:tcW w:type="dxa" w:w="1234"/>
-          </w:tcPr>
-          <w:p>
-            <w:r>
-              <w:t>—</w:t>
-            </w:r>
-          </w:p>
-        </w:tc>
-        <w:tc>
-          <w:tcPr>
-            <w:tcW w:type="dxa" w:w="1234"/>
-          </w:tcPr>
-          <w:p>
-            <w:r>
-              <w:t>通信中断期</w:t>
-            </w:r>
-          </w:p>
-        </w:tc>
-      </w:tr>
-      <w:tr>
-        <w:tc>
-          <w:tcPr>
-            <w:tcW w:type="dxa" w:w="1234"/>
+            <w:tcW w:type="dxa" w:w="1440"/>
           </w:tcPr>
           <w:p>
             <w:r>
@@ -2402,37 +1422,37 @@
         </w:tc>
         <w:tc>
           <w:tcPr>
-            <w:tcW w:type="dxa" w:w="1234"/>
+            <w:tcW w:type="dxa" w:w="1440"/>
           </w:tcPr>
           <w:p>
             <w:r>
-              <w:t>小臂独立工作设置(6项)</w:t>
+              <w:t>小臂独立设置(6项)</w:t>
             </w:r>
           </w:p>
         </w:tc>
         <w:tc>
           <w:tcPr>
-            <w:tcW w:type="dxa" w:w="1234"/>
+            <w:tcW w:type="dxa" w:w="1440"/>
           </w:tcPr>
           <w:p>
             <w:r>
-              <w:t>59430</w:t>
+              <w:t>66590</w:t>
             </w:r>
           </w:p>
         </w:tc>
         <w:tc>
           <w:tcPr>
-            <w:tcW w:type="dxa" w:w="1234"/>
+            <w:tcW w:type="dxa" w:w="1440"/>
           </w:tcPr>
           <w:p>
             <w:r>
-              <w:t>60990</w:t>
+              <w:t>68150</w:t>
             </w:r>
           </w:p>
         </w:tc>
         <w:tc>
           <w:tcPr>
-            <w:tcW w:type="dxa" w:w="1234"/>
+            <w:tcW w:type="dxa" w:w="1440"/>
           </w:tcPr>
           <w:p>
             <w:r>
@@ -2442,21 +1462,11 @@
         </w:tc>
         <w:tc>
           <w:tcPr>
-            <w:tcW w:type="dxa" w:w="1234"/>
+            <w:tcW w:type="dxa" w:w="1440"/>
           </w:tcPr>
           <w:p>
             <w:r>
-              <w:t>Vis11</w:t>
-            </w:r>
-          </w:p>
-        </w:tc>
-        <w:tc>
-          <w:tcPr>
-            <w:tcW w:type="dxa" w:w="1234"/>
-          </w:tcPr>
-          <w:p>
-            <w:r>
-              <w:t>—</w:t>
+              <w:t>需通信</w:t>
             </w:r>
           </w:p>
         </w:tc>
@@ -2464,21 +1474,42 @@
     </w:tbl>
     <w:p/>
     <w:p>
-      <w:r>
-        <w:t>算例一中，Phase3至Phase5总操作时长3070s，小于Vis10窗口容量3290s，在单一通信窗口内连续完成。Phase6因Vis10与Vis11之间的通信中断（56630~59430s，时长2800s）推迟至Vis11执行。任务于T=60990s完成。</w:t>
-      </w:r>
-    </w:p>
-    <w:p>
       <w:pPr>
-        <w:pStyle w:val="Heading2"/>
+        <w:jc w:val="center"/>
       </w:pPr>
       <w:r>
-        <w:t>X.3 算例二：遮挡冲突场景</w:t>
-      </w:r>
-    </w:p>
-    <w:p>
-      <w:r>
-        <w:t>算例二选择Phase3在通信窗口Vis11 [59430, 62870]内执行。Phase3于T=61270s结束后，SWA遮挡事件[61750, 62180]覆盖了Phase4的预期执行时段[61270, 62040]。遮挡于T=62180s结束后，Vis11仅剩690s，不足以容纳Phase4（770s）。规划器自动将Phase4推迟至下一通信窗口Vis12 [65360, 68830]，产生4090s（约68分钟）的等待延迟。</w:t>
+        <w:drawing>
+          <wp:inline xmlns:a="http://schemas.openxmlformats.org/drawingml/2006/main" xmlns:pic="http://schemas.openxmlformats.org/drawingml/2006/picture">
+            <wp:extent cx="5486400" cy="1541434"/>
+            <wp:docPr id="5" name="Picture 5"/>
+            <wp:cNvGraphicFramePr>
+              <a:graphicFrameLocks noChangeAspect="1"/>
+            </wp:cNvGraphicFramePr>
+            <a:graphic>
+              <a:graphicData uri="http://schemas.openxmlformats.org/drawingml/2006/picture">
+                <pic:pic>
+                  <pic:nvPicPr>
+                    <pic:cNvPr id="0" name="case2_comm_occ.png"/>
+                    <pic:cNvPicPr/>
+                  </pic:nvPicPr>
+                  <pic:blipFill>
+                    <a:blip r:embed="rId13"/>
+                    <a:stretch>
+                      <a:fillRect/>
+                    </a:stretch>
+                  </pic:blipFill>
+                  <pic:spPr>
+                    <a:xfrm>
+                      <a:off x="0" y="0"/>
+                      <a:ext cx="5486400" cy="1541434"/>
+                    </a:xfrm>
+                    <a:prstGeom prst="rect"/>
+                  </pic:spPr>
+                </pic:pic>
+              </a:graphicData>
+            </a:graphic>
+          </wp:inline>
+        </w:drawing>
       </w:r>
     </w:p>
     <w:p>
@@ -2487,775 +1518,164 @@
       </w:pPr>
       <w:r>
         <w:rPr>
-          <w:b/>
+          <w:i/>
         </w:rPr>
-        <w:t>表X-5 算例二任务规划结果</w:t>
+        <w:t>图X-5 算例二（遮挡冲突）通信窗口与SWA遮挡时间线</w:t>
       </w:r>
     </w:p>
-    <w:tbl>
-      <w:tblPr>
-        <w:tblStyle w:val="TableGrid"/>
-        <w:tblW w:type="auto" w:w="0"/>
-        <w:tblLook w:firstColumn="1" w:firstRow="1" w:lastColumn="0" w:lastRow="0" w:noHBand="0" w:noVBand="1" w:val="04A0"/>
-      </w:tblPr>
-      <w:tblGrid>
-        <w:gridCol w:w="1234"/>
-        <w:gridCol w:w="1234"/>
-        <w:gridCol w:w="1234"/>
-        <w:gridCol w:w="1234"/>
-        <w:gridCol w:w="1234"/>
-        <w:gridCol w:w="1234"/>
-        <w:gridCol w:w="1234"/>
-      </w:tblGrid>
-      <w:tr>
-        <w:tc>
-          <w:tcPr>
-            <w:tcW w:type="dxa" w:w="1234"/>
-            <w:shd w:val="clear" w:color="auto" w:fill="D9E2F3"/>
-          </w:tcPr>
-          <w:p>
-            <w:r>
-              <w:rPr>
-                <w:b/>
-              </w:rPr>
-              <w:t>阶段</w:t>
-            </w:r>
-          </w:p>
-        </w:tc>
-        <w:tc>
-          <w:tcPr>
-            <w:tcW w:type="dxa" w:w="1234"/>
-            <w:shd w:val="clear" w:color="auto" w:fill="D9E2F3"/>
-          </w:tcPr>
-          <w:p>
-            <w:r>
-              <w:rPr>
-                <w:b/>
-              </w:rPr>
-              <w:t>任务名称</w:t>
-            </w:r>
-          </w:p>
-        </w:tc>
-        <w:tc>
-          <w:tcPr>
-            <w:tcW w:type="dxa" w:w="1234"/>
-            <w:shd w:val="clear" w:color="auto" w:fill="D9E2F3"/>
-          </w:tcPr>
-          <w:p>
-            <w:r>
-              <w:rPr>
-                <w:b/>
-              </w:rPr>
-              <w:t>开始时间(s)</w:t>
-            </w:r>
-          </w:p>
-        </w:tc>
-        <w:tc>
-          <w:tcPr>
-            <w:tcW w:type="dxa" w:w="1234"/>
-            <w:shd w:val="clear" w:color="auto" w:fill="D9E2F3"/>
-          </w:tcPr>
-          <w:p>
-            <w:r>
-              <w:rPr>
-                <w:b/>
-              </w:rPr>
-              <w:t>结束时间(s)</w:t>
-            </w:r>
-          </w:p>
-        </w:tc>
-        <w:tc>
-          <w:tcPr>
-            <w:tcW w:type="dxa" w:w="1234"/>
-            <w:shd w:val="clear" w:color="auto" w:fill="D9E2F3"/>
-          </w:tcPr>
-          <w:p>
-            <w:r>
-              <w:rPr>
-                <w:b/>
-              </w:rPr>
-              <w:t>时长(s)</w:t>
-            </w:r>
-          </w:p>
-        </w:tc>
-        <w:tc>
-          <w:tcPr>
-            <w:tcW w:type="dxa" w:w="1234"/>
-            <w:shd w:val="clear" w:color="auto" w:fill="D9E2F3"/>
-          </w:tcPr>
-          <w:p>
-            <w:r>
-              <w:rPr>
-                <w:b/>
-              </w:rPr>
-              <w:t>通信窗口</w:t>
-            </w:r>
-          </w:p>
-        </w:tc>
-        <w:tc>
-          <w:tcPr>
-            <w:tcW w:type="dxa" w:w="1234"/>
-            <w:shd w:val="clear" w:color="auto" w:fill="D9E2F3"/>
-          </w:tcPr>
-          <w:p>
-            <w:r>
-              <w:rPr>
-                <w:b/>
-              </w:rPr>
-              <w:t>约束说明</w:t>
-            </w:r>
-          </w:p>
-        </w:tc>
-      </w:tr>
-      <w:tr>
-        <w:tc>
-          <w:tcPr>
-            <w:tcW w:type="dxa" w:w="1234"/>
-          </w:tcPr>
-          <w:p>
-            <w:r>
-              <w:t>1a</w:t>
-            </w:r>
-          </w:p>
-        </w:tc>
-        <w:tc>
-          <w:tcPr>
-            <w:tcW w:type="dxa" w:w="1234"/>
-          </w:tcPr>
-          <w:p>
-            <w:r>
-              <w:t>大臂重启加电保温</w:t>
-            </w:r>
-          </w:p>
-        </w:tc>
-        <w:tc>
-          <w:tcPr>
-            <w:tcW w:type="dxa" w:w="1234"/>
-          </w:tcPr>
-          <w:p>
-            <w:r>
-              <w:t>15250</w:t>
-            </w:r>
-          </w:p>
-        </w:tc>
-        <w:tc>
-          <w:tcPr>
-            <w:tcW w:type="dxa" w:w="1234"/>
-          </w:tcPr>
-          <w:p>
-            <w:r>
-              <w:t>16230</w:t>
-            </w:r>
-          </w:p>
-        </w:tc>
-        <w:tc>
-          <w:tcPr>
-            <w:tcW w:type="dxa" w:w="1234"/>
-          </w:tcPr>
-          <w:p>
-            <w:r>
-              <w:t>980</w:t>
-            </w:r>
-          </w:p>
-        </w:tc>
-        <w:tc>
-          <w:tcPr>
-            <w:tcW w:type="dxa" w:w="1234"/>
-          </w:tcPr>
-          <w:p>
-            <w:r>
-              <w:t>Vis3</w:t>
-            </w:r>
-          </w:p>
-        </w:tc>
-        <w:tc>
-          <w:tcPr>
-            <w:tcW w:type="dxa" w:w="1234"/>
-          </w:tcPr>
-          <w:p>
-            <w:r>
-              <w:t>Phase3前12.0h (16230→59430)</w:t>
-            </w:r>
-          </w:p>
-        </w:tc>
-      </w:tr>
-      <w:tr>
-        <w:tc>
-          <w:tcPr>
-            <w:tcW w:type="dxa" w:w="1234"/>
-          </w:tcPr>
-          <w:p>
-            <w:r>
-              <w:t>1b</w:t>
-            </w:r>
-          </w:p>
-        </w:tc>
-        <w:tc>
-          <w:tcPr>
-            <w:tcW w:type="dxa" w:w="1234"/>
-          </w:tcPr>
-          <w:p>
-            <w:r>
-              <w:t>小臂重启加电保温</w:t>
-            </w:r>
-          </w:p>
-        </w:tc>
-        <w:tc>
-          <w:tcPr>
-            <w:tcW w:type="dxa" w:w="1234"/>
-          </w:tcPr>
-          <w:p>
-            <w:r>
-              <w:t>47640</w:t>
-            </w:r>
-          </w:p>
-        </w:tc>
-        <w:tc>
-          <w:tcPr>
-            <w:tcW w:type="dxa" w:w="1234"/>
-          </w:tcPr>
-          <w:p>
-            <w:r>
-              <w:t>47790</w:t>
-            </w:r>
-          </w:p>
-        </w:tc>
-        <w:tc>
-          <w:tcPr>
-            <w:tcW w:type="dxa" w:w="1234"/>
-          </w:tcPr>
-          <w:p>
-            <w:r>
-              <w:t>150</w:t>
-            </w:r>
-          </w:p>
-        </w:tc>
-        <w:tc>
-          <w:tcPr>
-            <w:tcW w:type="dxa" w:w="1234"/>
-          </w:tcPr>
-          <w:p>
-            <w:r>
-              <w:t>Vis9</w:t>
-            </w:r>
-          </w:p>
-        </w:tc>
-        <w:tc>
-          <w:tcPr>
-            <w:tcW w:type="dxa" w:w="1234"/>
-          </w:tcPr>
-          <w:p>
-            <w:r>
-              <w:t>Phase4前4.9h (47790→65360)</w:t>
-            </w:r>
-          </w:p>
-        </w:tc>
-      </w:tr>
-      <w:tr>
-        <w:tc>
-          <w:tcPr>
-            <w:tcW w:type="dxa" w:w="1234"/>
-          </w:tcPr>
-          <w:p>
-            <w:r>
-              <w:t>2</w:t>
-            </w:r>
-          </w:p>
-        </w:tc>
-        <w:tc>
-          <w:tcPr>
-            <w:tcW w:type="dxa" w:w="1234"/>
-          </w:tcPr>
-          <w:p>
-            <w:r>
-              <w:t>平台状态设置(6项)</w:t>
-            </w:r>
-          </w:p>
-        </w:tc>
-        <w:tc>
-          <w:tcPr>
-            <w:tcW w:type="dxa" w:w="1234"/>
-          </w:tcPr>
-          <w:p>
-            <w:r>
-              <w:t>6130</w:t>
-            </w:r>
-          </w:p>
-        </w:tc>
-        <w:tc>
-          <w:tcPr>
-            <w:tcW w:type="dxa" w:w="1234"/>
-          </w:tcPr>
-          <w:p>
-            <w:r>
-              <w:t>9660</w:t>
-            </w:r>
-          </w:p>
-        </w:tc>
-        <w:tc>
-          <w:tcPr>
-            <w:tcW w:type="dxa" w:w="1234"/>
-          </w:tcPr>
-          <w:p>
-            <w:r>
-              <w:t>3530</w:t>
-            </w:r>
-          </w:p>
-        </w:tc>
-        <w:tc>
-          <w:tcPr>
-            <w:tcW w:type="dxa" w:w="1234"/>
-          </w:tcPr>
-          <w:p>
-            <w:r>
-              <w:t>Vis2</w:t>
-            </w:r>
-          </w:p>
-        </w:tc>
-        <w:tc>
-          <w:tcPr>
-            <w:tcW w:type="dxa" w:w="1234"/>
-          </w:tcPr>
-          <w:p>
-            <w:r>
-              <w:t>—</w:t>
-            </w:r>
-          </w:p>
-        </w:tc>
-      </w:tr>
-      <w:tr>
-        <w:tc>
-          <w:tcPr>
-            <w:tcW w:type="dxa" w:w="1234"/>
-          </w:tcPr>
-          <w:p>
-            <w:r>
-              <w:t>—</w:t>
-            </w:r>
-          </w:p>
-        </w:tc>
-        <w:tc>
-          <w:tcPr>
-            <w:tcW w:type="dxa" w:w="1234"/>
-          </w:tcPr>
-          <w:p>
-            <w:r>
-              <w:t>等待运动窗口</w:t>
-            </w:r>
-          </w:p>
-        </w:tc>
-        <w:tc>
-          <w:tcPr>
-            <w:tcW w:type="dxa" w:w="1234"/>
-          </w:tcPr>
-          <w:p>
-            <w:r>
-              <w:t>9660</w:t>
-            </w:r>
-          </w:p>
-        </w:tc>
-        <w:tc>
-          <w:tcPr>
-            <w:tcW w:type="dxa" w:w="1234"/>
-          </w:tcPr>
-          <w:p>
-            <w:r>
-              <w:t>59430</w:t>
-            </w:r>
-          </w:p>
-        </w:tc>
-        <w:tc>
-          <w:tcPr>
-            <w:tcW w:type="dxa" w:w="1234"/>
-          </w:tcPr>
-          <w:p>
-            <w:r>
-              <w:t>49770</w:t>
-            </w:r>
-          </w:p>
-        </w:tc>
-        <w:tc>
-          <w:tcPr>
-            <w:tcW w:type="dxa" w:w="1234"/>
-          </w:tcPr>
-          <w:p>
-            <w:r>
-              <w:t>—</w:t>
-            </w:r>
-          </w:p>
-        </w:tc>
-        <w:tc>
-          <w:tcPr>
-            <w:tcW w:type="dxa" w:w="1234"/>
-          </w:tcPr>
-          <w:p>
-            <w:r>
-              <w:t>—</w:t>
-            </w:r>
-          </w:p>
-        </w:tc>
-      </w:tr>
-      <w:tr>
-        <w:tc>
-          <w:tcPr>
-            <w:tcW w:type="dxa" w:w="1234"/>
-          </w:tcPr>
-          <w:p>
-            <w:r>
-              <w:t>3</w:t>
-            </w:r>
-          </w:p>
-        </w:tc>
-        <w:tc>
-          <w:tcPr>
-            <w:tcW w:type="dxa" w:w="1234"/>
-          </w:tcPr>
-          <w:p>
-            <w:r>
-              <w:t>大臂运动至组合构型(5项)</w:t>
-            </w:r>
-          </w:p>
-        </w:tc>
-        <w:tc>
-          <w:tcPr>
-            <w:tcW w:type="dxa" w:w="1234"/>
-          </w:tcPr>
-          <w:p>
-            <w:r>
-              <w:t>59430</w:t>
-            </w:r>
-          </w:p>
-        </w:tc>
-        <w:tc>
-          <w:tcPr>
-            <w:tcW w:type="dxa" w:w="1234"/>
-          </w:tcPr>
-          <w:p>
-            <w:r>
-              <w:t>61270</w:t>
-            </w:r>
-          </w:p>
-        </w:tc>
-        <w:tc>
-          <w:tcPr>
-            <w:tcW w:type="dxa" w:w="1234"/>
-          </w:tcPr>
-          <w:p>
-            <w:r>
-              <w:t>1840</w:t>
-            </w:r>
-          </w:p>
-        </w:tc>
-        <w:tc>
-          <w:tcPr>
-            <w:tcW w:type="dxa" w:w="1234"/>
-          </w:tcPr>
-          <w:p>
-            <w:r>
-              <w:t>Vis11</w:t>
-            </w:r>
-          </w:p>
-        </w:tc>
-        <w:tc>
-          <w:tcPr>
-            <w:tcW w:type="dxa" w:w="1234"/>
-          </w:tcPr>
-          <w:p>
-            <w:r>
-              <w:t>—</w:t>
-            </w:r>
-          </w:p>
-        </w:tc>
-      </w:tr>
-      <w:tr>
-        <w:tc>
-          <w:tcPr>
-            <w:tcW w:type="dxa" w:w="1234"/>
-          </w:tcPr>
-          <w:p>
-            <w:r>
-              <w:t>—</w:t>
-            </w:r>
-          </w:p>
-        </w:tc>
-        <w:tc>
-          <w:tcPr>
-            <w:tcW w:type="dxa" w:w="1234"/>
-          </w:tcPr>
-          <w:p>
-            <w:r>
-              <w:t>等待(遮挡+通信中断)</w:t>
-            </w:r>
-          </w:p>
-        </w:tc>
-        <w:tc>
-          <w:tcPr>
-            <w:tcW w:type="dxa" w:w="1234"/>
-          </w:tcPr>
-          <w:p>
-            <w:r>
-              <w:t>61270</w:t>
-            </w:r>
-          </w:p>
-        </w:tc>
-        <w:tc>
-          <w:tcPr>
-            <w:tcW w:type="dxa" w:w="1234"/>
-          </w:tcPr>
-          <w:p>
-            <w:r>
-              <w:t>65360</w:t>
-            </w:r>
-          </w:p>
-        </w:tc>
-        <w:tc>
-          <w:tcPr>
-            <w:tcW w:type="dxa" w:w="1234"/>
-          </w:tcPr>
-          <w:p>
-            <w:r>
-              <w:t>4090</w:t>
-            </w:r>
-          </w:p>
-        </w:tc>
-        <w:tc>
-          <w:tcPr>
-            <w:tcW w:type="dxa" w:w="1234"/>
-          </w:tcPr>
-          <w:p>
-            <w:r>
-              <w:t>—</w:t>
-            </w:r>
-          </w:p>
-        </w:tc>
-        <w:tc>
-          <w:tcPr>
-            <w:tcW w:type="dxa" w:w="1234"/>
-          </w:tcPr>
-          <w:p>
-            <w:r>
-              <w:t>遮挡[61750,62180]+通信间隙</w:t>
-            </w:r>
-          </w:p>
-        </w:tc>
-      </w:tr>
-      <w:tr>
-        <w:tc>
-          <w:tcPr>
-            <w:tcW w:type="dxa" w:w="1234"/>
-          </w:tcPr>
-          <w:p>
-            <w:r>
-              <w:t>4</w:t>
-            </w:r>
-          </w:p>
-        </w:tc>
-        <w:tc>
-          <w:tcPr>
-            <w:tcW w:type="dxa" w:w="1234"/>
-          </w:tcPr>
-          <w:p>
-            <w:r>
-              <w:t>小臂运动至SWA(2项)</w:t>
-            </w:r>
-          </w:p>
-        </w:tc>
-        <w:tc>
-          <w:tcPr>
-            <w:tcW w:type="dxa" w:w="1234"/>
-          </w:tcPr>
-          <w:p>
-            <w:r>
-              <w:t>65360</w:t>
-            </w:r>
-          </w:p>
-        </w:tc>
-        <w:tc>
-          <w:tcPr>
-            <w:tcW w:type="dxa" w:w="1234"/>
-          </w:tcPr>
-          <w:p>
-            <w:r>
-              <w:t>66130</w:t>
-            </w:r>
-          </w:p>
-        </w:tc>
-        <w:tc>
-          <w:tcPr>
-            <w:tcW w:type="dxa" w:w="1234"/>
-          </w:tcPr>
-          <w:p>
-            <w:r>
-              <w:t>770</w:t>
-            </w:r>
-          </w:p>
-        </w:tc>
-        <w:tc>
-          <w:tcPr>
-            <w:tcW w:type="dxa" w:w="1234"/>
-          </w:tcPr>
-          <w:p>
-            <w:r>
-              <w:t>Vis12</w:t>
-            </w:r>
-          </w:p>
-        </w:tc>
-        <w:tc>
-          <w:tcPr>
-            <w:tcW w:type="dxa" w:w="1234"/>
-          </w:tcPr>
-          <w:p>
-            <w:r>
-              <w:t>需无遮挡</w:t>
-            </w:r>
-          </w:p>
-        </w:tc>
-      </w:tr>
-      <w:tr>
-        <w:tc>
-          <w:tcPr>
-            <w:tcW w:type="dxa" w:w="1234"/>
-          </w:tcPr>
-          <w:p>
-            <w:r>
-              <w:t>5</w:t>
-            </w:r>
-          </w:p>
-        </w:tc>
-        <w:tc>
-          <w:tcPr>
-            <w:tcW w:type="dxa" w:w="1234"/>
-          </w:tcPr>
-          <w:p>
-            <w:r>
-              <w:t>视觉捕获SWA(2项)</w:t>
-            </w:r>
-          </w:p>
-        </w:tc>
-        <w:tc>
-          <w:tcPr>
-            <w:tcW w:type="dxa" w:w="1234"/>
-          </w:tcPr>
-          <w:p>
-            <w:r>
-              <w:t>66130</w:t>
-            </w:r>
-          </w:p>
-        </w:tc>
-        <w:tc>
-          <w:tcPr>
-            <w:tcW w:type="dxa" w:w="1234"/>
-          </w:tcPr>
-          <w:p>
-            <w:r>
-              <w:t>66590</w:t>
-            </w:r>
-          </w:p>
-        </w:tc>
-        <w:tc>
-          <w:tcPr>
-            <w:tcW w:type="dxa" w:w="1234"/>
-          </w:tcPr>
-          <w:p>
-            <w:r>
-              <w:t>460</w:t>
-            </w:r>
-          </w:p>
-        </w:tc>
-        <w:tc>
-          <w:tcPr>
-            <w:tcW w:type="dxa" w:w="1234"/>
-          </w:tcPr>
-          <w:p>
-            <w:r>
-              <w:t>Vis12</w:t>
-            </w:r>
-          </w:p>
-        </w:tc>
-        <w:tc>
-          <w:tcPr>
-            <w:tcW w:type="dxa" w:w="1234"/>
-          </w:tcPr>
-          <w:p>
-            <w:r>
-              <w:t>需无遮挡</w:t>
-            </w:r>
-          </w:p>
-        </w:tc>
-      </w:tr>
-      <w:tr>
-        <w:tc>
-          <w:tcPr>
-            <w:tcW w:type="dxa" w:w="1234"/>
-          </w:tcPr>
-          <w:p>
-            <w:r>
-              <w:t>6</w:t>
-            </w:r>
-          </w:p>
-        </w:tc>
-        <w:tc>
-          <w:tcPr>
-            <w:tcW w:type="dxa" w:w="1234"/>
-          </w:tcPr>
-          <w:p>
-            <w:r>
-              <w:t>小臂独立工作设置(6项)</w:t>
-            </w:r>
-          </w:p>
-        </w:tc>
-        <w:tc>
-          <w:tcPr>
-            <w:tcW w:type="dxa" w:w="1234"/>
-          </w:tcPr>
-          <w:p>
-            <w:r>
-              <w:t>66590</w:t>
-            </w:r>
-          </w:p>
-        </w:tc>
-        <w:tc>
-          <w:tcPr>
-            <w:tcW w:type="dxa" w:w="1234"/>
-          </w:tcPr>
-          <w:p>
-            <w:r>
-              <w:t>68150</w:t>
-            </w:r>
-          </w:p>
-        </w:tc>
-        <w:tc>
-          <w:tcPr>
-            <w:tcW w:type="dxa" w:w="1234"/>
-          </w:tcPr>
-          <w:p>
-            <w:r>
-              <w:t>1560</w:t>
-            </w:r>
-          </w:p>
-        </w:tc>
-        <w:tc>
-          <w:tcPr>
-            <w:tcW w:type="dxa" w:w="1234"/>
-          </w:tcPr>
-          <w:p>
-            <w:r>
-              <w:t>Vis12</w:t>
-            </w:r>
-          </w:p>
-        </w:tc>
-        <w:tc>
-          <w:tcPr>
-            <w:tcW w:type="dxa" w:w="1234"/>
-          </w:tcPr>
-          <w:p>
-            <w:r>
-              <w:t>—</w:t>
-            </w:r>
-          </w:p>
-        </w:tc>
-      </w:tr>
-    </w:tbl>
+    <w:p/>
+    <w:p>
+      <w:pPr>
+        <w:jc w:val="center"/>
+      </w:pPr>
+      <w:r>
+        <w:drawing>
+          <wp:inline xmlns:a="http://schemas.openxmlformats.org/drawingml/2006/main" xmlns:pic="http://schemas.openxmlformats.org/drawingml/2006/picture">
+            <wp:extent cx="5486400" cy="1879967"/>
+            <wp:docPr id="6" name="Picture 6"/>
+            <wp:cNvGraphicFramePr>
+              <a:graphicFrameLocks noChangeAspect="1"/>
+            </wp:cNvGraphicFramePr>
+            <a:graphic>
+              <a:graphicData uri="http://schemas.openxmlformats.org/drawingml/2006/picture">
+                <pic:pic>
+                  <pic:nvPicPr>
+                    <pic:cNvPr id="0" name="case2_phase1.png"/>
+                    <pic:cNvPicPr/>
+                  </pic:nvPicPr>
+                  <pic:blipFill>
+                    <a:blip r:embed="rId14"/>
+                    <a:stretch>
+                      <a:fillRect/>
+                    </a:stretch>
+                  </pic:blipFill>
+                  <pic:spPr>
+                    <a:xfrm>
+                      <a:off x="0" y="0"/>
+                      <a:ext cx="5486400" cy="1879967"/>
+                    </a:xfrm>
+                    <a:prstGeom prst="rect"/>
+                  </pic:spPr>
+                </pic:pic>
+              </a:graphicData>
+            </a:graphic>
+          </wp:inline>
+        </w:drawing>
+      </w:r>
+    </w:p>
+    <w:p>
+      <w:pPr>
+        <w:jc w:val="center"/>
+      </w:pPr>
+      <w:r>
+        <w:rPr>
+          <w:i/>
+        </w:rPr>
+        <w:t>图X-6 算例二（遮挡冲突）阶段一规划结果</w:t>
+      </w:r>
+    </w:p>
+    <w:p/>
+    <w:p>
+      <w:pPr>
+        <w:jc w:val="center"/>
+      </w:pPr>
+      <w:r>
+        <w:drawing>
+          <wp:inline xmlns:a="http://schemas.openxmlformats.org/drawingml/2006/main" xmlns:pic="http://schemas.openxmlformats.org/drawingml/2006/picture">
+            <wp:extent cx="5486400" cy="5253353"/>
+            <wp:docPr id="7" name="Picture 7"/>
+            <wp:cNvGraphicFramePr>
+              <a:graphicFrameLocks noChangeAspect="1"/>
+            </wp:cNvGraphicFramePr>
+            <a:graphic>
+              <a:graphicData uri="http://schemas.openxmlformats.org/drawingml/2006/picture">
+                <pic:pic>
+                  <pic:nvPicPr>
+                    <pic:cNvPr id="0" name="case2_phase2to6.png"/>
+                    <pic:cNvPicPr/>
+                  </pic:nvPicPr>
+                  <pic:blipFill>
+                    <a:blip r:embed="rId15"/>
+                    <a:stretch>
+                      <a:fillRect/>
+                    </a:stretch>
+                  </pic:blipFill>
+                  <pic:spPr>
+                    <a:xfrm>
+                      <a:off x="0" y="0"/>
+                      <a:ext cx="5486400" cy="5253353"/>
+                    </a:xfrm>
+                    <a:prstGeom prst="rect"/>
+                  </pic:spPr>
+                </pic:pic>
+              </a:graphicData>
+            </a:graphic>
+          </wp:inline>
+        </w:drawing>
+      </w:r>
+    </w:p>
+    <w:p>
+      <w:pPr>
+        <w:jc w:val="center"/>
+      </w:pPr>
+      <w:r>
+        <w:rPr>
+          <w:i/>
+        </w:rPr>
+        <w:t>图X-7 算例二（遮挡冲突）阶段二至六规划结果（含局部放大）</w:t>
+      </w:r>
+    </w:p>
+    <w:p/>
+    <w:p>
+      <w:pPr>
+        <w:jc w:val="center"/>
+      </w:pPr>
+      <w:r>
+        <w:drawing>
+          <wp:inline xmlns:a="http://schemas.openxmlformats.org/drawingml/2006/main" xmlns:pic="http://schemas.openxmlformats.org/drawingml/2006/picture">
+            <wp:extent cx="5486400" cy="2420020"/>
+            <wp:docPr id="8" name="Picture 8"/>
+            <wp:cNvGraphicFramePr>
+              <a:graphicFrameLocks noChangeAspect="1"/>
+            </wp:cNvGraphicFramePr>
+            <a:graphic>
+              <a:graphicData uri="http://schemas.openxmlformats.org/drawingml/2006/picture">
+                <pic:pic>
+                  <pic:nvPicPr>
+                    <pic:cNvPr id="0" name="case2_overall.png"/>
+                    <pic:cNvPicPr/>
+                  </pic:nvPicPr>
+                  <pic:blipFill>
+                    <a:blip r:embed="rId16"/>
+                    <a:stretch>
+                      <a:fillRect/>
+                    </a:stretch>
+                  </pic:blipFill>
+                  <pic:spPr>
+                    <a:xfrm>
+                      <a:off x="0" y="0"/>
+                      <a:ext cx="5486400" cy="2420020"/>
+                    </a:xfrm>
+                    <a:prstGeom prst="rect"/>
+                  </pic:spPr>
+                </pic:pic>
+              </a:graphicData>
+            </a:graphic>
+          </wp:inline>
+        </w:drawing>
+      </w:r>
+    </w:p>
+    <w:p>
+      <w:pPr>
+        <w:jc w:val="center"/>
+      </w:pPr>
+      <w:r>
+        <w:rPr>
+          <w:i/>
+        </w:rPr>
+        <w:t>图X-8 算例二（遮挡冲突）全任务规划总图</w:t>
+      </w:r>
+    </w:p>
     <w:p/>
     <w:p>
       <w:pPr>
@@ -3273,7 +1693,7 @@
         <w:rPr>
           <w:b/>
         </w:rPr>
-        <w:t>表X-6 两算例对比分析</w:t>
+        <w:t>表X-5 两算例对比</w:t>
       </w:r>
     </w:p>
     <w:tbl>
@@ -3312,7 +1732,7 @@
               <w:rPr>
                 <w:b/>
               </w:rPr>
-              <w:t>算例一（无遮挡冲突）</w:t>
+              <w:t>算例一</w:t>
             </w:r>
           </w:p>
         </w:tc>
@@ -3326,7 +1746,7 @@
               <w:rPr>
                 <w:b/>
               </w:rPr>
-              <w:t>算例二（遮挡冲突）</w:t>
+              <w:t>算例二</w:t>
             </w:r>
           </w:p>
         </w:tc>
@@ -3338,7 +1758,7 @@
           </w:tcPr>
           <w:p>
             <w:r>
-              <w:t>Phase3所在窗口</w:t>
+              <w:t>Phase3窗口</w:t>
             </w:r>
           </w:p>
         </w:tc>
@@ -3348,7 +1768,7 @@
           </w:tcPr>
           <w:p>
             <w:r>
-              <w:t>Vis10 [53560, 56850]</w:t>
+              <w:t>Vis10[53560,56850]</w:t>
             </w:r>
           </w:p>
         </w:tc>
@@ -3358,7 +1778,7 @@
           </w:tcPr>
           <w:p>
             <w:r>
-              <w:t>Vis11 [59430, 62870]</w:t>
+              <w:t>Vis11[59430,62870]</w:t>
             </w:r>
           </w:p>
         </w:tc>
@@ -3370,7 +1790,7 @@
           </w:tcPr>
           <w:p>
             <w:r>
-              <w:t>SWA遮挡影响</w:t>
+              <w:t>遮挡影响</w:t>
             </w:r>
           </w:p>
         </w:tc>
@@ -3380,7 +1800,7 @@
           </w:tcPr>
           <w:p>
             <w:r>
-              <w:t>无遮挡事件</w:t>
+              <w:t>无</w:t>
             </w:r>
           </w:p>
         </w:tc>
@@ -3390,7 +1810,7 @@
           </w:tcPr>
           <w:p>
             <w:r>
-              <w:t>遮挡[61750,62180]阻断Phase4</w:t>
+              <w:t>[61750,62180]阻断Phase4</w:t>
             </w:r>
           </w:p>
         </w:tc>
@@ -3402,7 +1822,7 @@
           </w:tcPr>
           <w:p>
             <w:r>
-              <w:t>Phase4起始时间</w:t>
+              <w:t>Phase4起始</w:t>
             </w:r>
           </w:p>
         </w:tc>
@@ -3412,7 +1832,7 @@
           </w:tcPr>
           <w:p>
             <w:r>
-              <w:t>55400s (紧随Phase3)</w:t>
+              <w:t>55400s(紧随Phase3)</w:t>
             </w:r>
           </w:p>
         </w:tc>
@@ -3422,7 +1842,7 @@
           </w:tcPr>
           <w:p>
             <w:r>
-              <w:t>65360s (推迟至Vis12)</w:t>
+              <w:t>65360s(推迟至Vis12)</w:t>
             </w:r>
           </w:p>
         </w:tc>
@@ -3434,7 +1854,7 @@
           </w:tcPr>
           <w:p>
             <w:r>
-              <w:t>遮挡导致等待</w:t>
+              <w:t>遮挡等待</w:t>
             </w:r>
           </w:p>
         </w:tc>
@@ -3454,7 +1874,7 @@
           </w:tcPr>
           <w:p>
             <w:r>
-              <w:t>4090s (68min)</w:t>
+              <w:t>4090s(68min)</w:t>
             </w:r>
           </w:p>
         </w:tc>
@@ -3476,7 +1896,7 @@
           </w:tcPr>
           <w:p>
             <w:r>
-              <w:t>12.0h (43200s) ✓</w:t>
+              <w:t>12.0h ✓</w:t>
             </w:r>
           </w:p>
         </w:tc>
@@ -3486,7 +1906,7 @@
           </w:tcPr>
           <w:p>
             <w:r>
-              <w:t>12.0h (43200s) ✓</w:t>
+              <w:t>12.0h ✓</w:t>
             </w:r>
           </w:p>
         </w:tc>
@@ -3508,7 +1928,7 @@
           </w:tcPr>
           <w:p>
             <w:r>
-              <w:t>5.0h (18000s) ✓</w:t>
+              <w:t>5.5h ✓</w:t>
             </w:r>
           </w:p>
         </w:tc>
@@ -3518,7 +1938,7 @@
           </w:tcPr>
           <w:p>
             <w:r>
-              <w:t>4.9h (17570s) ✓</w:t>
+              <w:t>4.9h ✓</w:t>
             </w:r>
           </w:p>
         </w:tc>
@@ -3530,7 +1950,7 @@
           </w:tcPr>
           <w:p>
             <w:r>
-              <w:t>任务完成时间</w:t>
+              <w:t>任务完成</w:t>
             </w:r>
           </w:p>
         </w:tc>
@@ -3540,7 +1960,7 @@
           </w:tcPr>
           <w:p>
             <w:r>
-              <w:t>60990s (07-26 21:56 BJT)</w:t>
+              <w:t>60990s</w:t>
             </w:r>
           </w:p>
         </w:tc>
@@ -3550,39 +1970,7 @@
           </w:tcPr>
           <w:p>
             <w:r>
-              <w:t>68150s (07-26 23:55 BJT)</w:t>
-            </w:r>
-          </w:p>
-        </w:tc>
-      </w:tr>
-      <w:tr>
-        <w:tc>
-          <w:tcPr>
-            <w:tcW w:type="dxa" w:w="2880"/>
-          </w:tcPr>
-          <w:p>
-            <w:r>
-              <w:t>总历时</w:t>
-            </w:r>
-          </w:p>
-        </w:tc>
-        <w:tc>
-          <w:tcPr>
-            <w:tcW w:type="dxa" w:w="2880"/>
-          </w:tcPr>
-          <w:p>
-            <w:r>
-              <w:t>60990s (16.9h)</w:t>
-            </w:r>
-          </w:p>
-        </w:tc>
-        <w:tc>
-          <w:tcPr>
-            <w:tcW w:type="dxa" w:w="2880"/>
-          </w:tcPr>
-          <w:p>
-            <w:r>
-              <w:t>68150s (18.9h)</w:t>
+              <w:t>68150s</w:t>
             </w:r>
           </w:p>
         </w:tc>
@@ -3591,7 +1979,7 @@
     <w:p/>
     <w:p>
       <w:r>
-        <w:t>对比分析表明：（1）算例一中Phase3至Phase5总操作时长3070s小于Vis10窗口容量3290s，在单一通信窗口内连续完成，验证了基本调度能力；（2）算例二中SWA遮挡事件[61750,62180]导致Phase4推迟4090s（约68分钟）至下一通信窗口Vis12，任务总历时从60990s增加至68150s，验证了约束回避能力；（3）两算例的大臂提前量均满足≥43200s（12h，相对Phase3），小臂提前量均满足≥18000s（5h，相对Phase4）。</w:t>
+        <w:t>两算例均满足提前量约束，验证了算法的基本调度能力（算例一）和约束回避能力（算例二）。</w:t>
       </w:r>
     </w:p>
     <w:p>
@@ -3604,7 +1992,7 @@
     </w:p>
     <w:p>
       <w:r>
-        <w:t>本章基于统一的TLE轨道根数和规划起始时刻（T0 = 2025-07-26 05:00 BJT），通过SGP4传播模型和DH运动学联合计算确定通信窗口和遮挡区间，设计了两组仿真算例。提前量约束遵循操作规程：大臂重启加电在大臂运动（Phase3）前≥12小时完成，小臂重启加电在小臂运动至SWA（Phase4）前≥5小时完成。算例一验证了无遮挡冲突场景下的基本调度能力，算例二验证了SWA遮挡约束冲突下的自动回避能力，证明了基于EUROPA框架的规划算法在空间站机械臂任务规划中的有效性。</w:t>
+        <w:t>本章基于统一TLE轨道根数设计两组仿真算例，任务执行顺序为Phase1(重启加电)→Phase2(平台设置)→Phase3-6(运动操作)。算例一验证无遮挡场景下的调度能力，算例二验证遮挡冲突下的自动回避能力，证明了EUROPA框架在空间站机械臂任务规划中的有效性。</w:t>
       </w:r>
     </w:p>
     <w:sectPr>

</xml_diff>